<commit_message>
Make saves race-safe and correct the documentation
- table.php: every save runs in one transaction and locks the family and the shelter
  (or relief item) first, so two people cannot both pass the capacity / stock check;
  the audit entry is written in the same transaction
- tests/concurrency.php: two processes fill the last places of a shelter at once;
  a control without the lock shows the race, with the lock exactly one wins
- README, PLAN, TASKS and the Word guide: known limits added; the guide no longer
  claims every page was checked in a browser

Co-Authored-By: Claude Sonnet 5.5 <noreply@anthropic.com>
</commit_message>
<xml_diff>
--- a/DRMS_Project_Overview_and_User_Guide.docx
+++ b/DRMS_Project_Overview_and_User_Guide.docx
@@ -125,7 +125,7 @@
     <w:sdt>
       <w:sdtPr>
         <w:alias w:val="Contents"/>
-        <w:id w:val="347449878"/>
+        <w:id w:val="249779388"/>
       </w:sdtPr>
       <w:sdtEndPr/>
       <w:sdtContent>
@@ -150,7 +150,7 @@
           <w:r>
             <w:fldChar w:fldCharType="separate"/>
           </w:r>
-          <w:hyperlink w:anchor="_Toc243793727" w:history="1">
+          <w:hyperlink w:anchor="_Toc243797236" w:history="1">
             <w:r>
               <w:rPr>
                 <w:rStyle w:val="Hyperlink"/>
@@ -174,7 +174,7 @@
               <w:rPr>
                 <w:noProof/>
               </w:rPr>
-              <w:instrText xml:space="preserve"> PAGEREF _Toc243793727 \h </w:instrText>
+              <w:instrText xml:space="preserve"> PAGEREF _Toc243797236 \h </w:instrText>
             </w:r>
             <w:r>
               <w:rPr>
@@ -213,7 +213,7 @@
               <w:color w:val="auto"/>
             </w:rPr>
           </w:pPr>
-          <w:hyperlink w:anchor="_Toc243793728" w:history="1">
+          <w:hyperlink w:anchor="_Toc243797237" w:history="1">
             <w:r>
               <w:rPr>
                 <w:rStyle w:val="Hyperlink"/>
@@ -237,7 +237,7 @@
               <w:rPr>
                 <w:noProof/>
               </w:rPr>
-              <w:instrText xml:space="preserve"> PAGEREF _Toc243793728 \h </w:instrText>
+              <w:instrText xml:space="preserve"> PAGEREF _Toc243797237 \h </w:instrText>
             </w:r>
             <w:r>
               <w:rPr>
@@ -276,7 +276,7 @@
               <w:color w:val="auto"/>
             </w:rPr>
           </w:pPr>
-          <w:hyperlink w:anchor="_Toc243793729" w:history="1">
+          <w:hyperlink w:anchor="_Toc243797238" w:history="1">
             <w:r>
               <w:rPr>
                 <w:rStyle w:val="Hyperlink"/>
@@ -300,7 +300,7 @@
               <w:rPr>
                 <w:noProof/>
               </w:rPr>
-              <w:instrText xml:space="preserve"> PAGEREF _Toc243793729 \h </w:instrText>
+              <w:instrText xml:space="preserve"> PAGEREF _Toc243797238 \h </w:instrText>
             </w:r>
             <w:r>
               <w:rPr>
@@ -339,7 +339,7 @@
               <w:color w:val="auto"/>
             </w:rPr>
           </w:pPr>
-          <w:hyperlink w:anchor="_Toc243793730" w:history="1">
+          <w:hyperlink w:anchor="_Toc243797239" w:history="1">
             <w:r>
               <w:rPr>
                 <w:rStyle w:val="Hyperlink"/>
@@ -363,7 +363,7 @@
               <w:rPr>
                 <w:noProof/>
               </w:rPr>
-              <w:instrText xml:space="preserve"> PAGEREF _Toc243793730 \h </w:instrText>
+              <w:instrText xml:space="preserve"> PAGEREF _Toc243797239 \h </w:instrText>
             </w:r>
             <w:r>
               <w:rPr>
@@ -402,7 +402,7 @@
               <w:color w:val="auto"/>
             </w:rPr>
           </w:pPr>
-          <w:hyperlink w:anchor="_Toc243793731" w:history="1">
+          <w:hyperlink w:anchor="_Toc243797240" w:history="1">
             <w:r>
               <w:rPr>
                 <w:rStyle w:val="Hyperlink"/>
@@ -426,7 +426,7 @@
               <w:rPr>
                 <w:noProof/>
               </w:rPr>
-              <w:instrText xml:space="preserve"> PAGEREF _Toc243793731 \h </w:instrText>
+              <w:instrText xml:space="preserve"> PAGEREF _Toc243797240 \h </w:instrText>
             </w:r>
             <w:r>
               <w:rPr>
@@ -465,7 +465,7 @@
               <w:color w:val="auto"/>
             </w:rPr>
           </w:pPr>
-          <w:hyperlink w:anchor="_Toc243793732" w:history="1">
+          <w:hyperlink w:anchor="_Toc243797241" w:history="1">
             <w:r>
               <w:rPr>
                 <w:rStyle w:val="Hyperlink"/>
@@ -489,7 +489,7 @@
               <w:rPr>
                 <w:noProof/>
               </w:rPr>
-              <w:instrText xml:space="preserve"> PAGEREF _Toc243793732 \h </w:instrText>
+              <w:instrText xml:space="preserve"> PAGEREF _Toc243797241 \h </w:instrText>
             </w:r>
             <w:r>
               <w:rPr>
@@ -528,7 +528,7 @@
               <w:color w:val="auto"/>
             </w:rPr>
           </w:pPr>
-          <w:hyperlink w:anchor="_Toc243793733" w:history="1">
+          <w:hyperlink w:anchor="_Toc243797242" w:history="1">
             <w:r>
               <w:rPr>
                 <w:rStyle w:val="Hyperlink"/>
@@ -552,7 +552,7 @@
               <w:rPr>
                 <w:noProof/>
               </w:rPr>
-              <w:instrText xml:space="preserve"> PAGEREF _Toc243793733 \h </w:instrText>
+              <w:instrText xml:space="preserve"> PAGEREF _Toc243797242 \h </w:instrText>
             </w:r>
             <w:r>
               <w:rPr>
@@ -591,7 +591,7 @@
               <w:color w:val="auto"/>
             </w:rPr>
           </w:pPr>
-          <w:hyperlink w:anchor="_Toc243793734" w:history="1">
+          <w:hyperlink w:anchor="_Toc243797243" w:history="1">
             <w:r>
               <w:rPr>
                 <w:rStyle w:val="Hyperlink"/>
@@ -615,7 +615,7 @@
               <w:rPr>
                 <w:noProof/>
               </w:rPr>
-              <w:instrText xml:space="preserve"> PAGEREF _Toc243793734 \h </w:instrText>
+              <w:instrText xml:space="preserve"> PAGEREF _Toc243797243 \h </w:instrText>
             </w:r>
             <w:r>
               <w:rPr>
@@ -654,7 +654,7 @@
               <w:color w:val="auto"/>
             </w:rPr>
           </w:pPr>
-          <w:hyperlink w:anchor="_Toc243793735" w:history="1">
+          <w:hyperlink w:anchor="_Toc243797244" w:history="1">
             <w:r>
               <w:rPr>
                 <w:rStyle w:val="Hyperlink"/>
@@ -678,7 +678,7 @@
               <w:rPr>
                 <w:noProof/>
               </w:rPr>
-              <w:instrText xml:space="preserve"> PAGEREF _Toc243793735 \h </w:instrText>
+              <w:instrText xml:space="preserve"> PAGEREF _Toc243797244 \h </w:instrText>
             </w:r>
             <w:r>
               <w:rPr>
@@ -717,7 +717,7 @@
               <w:color w:val="auto"/>
             </w:rPr>
           </w:pPr>
-          <w:hyperlink w:anchor="_Toc243793736" w:history="1">
+          <w:hyperlink w:anchor="_Toc243797245" w:history="1">
             <w:r>
               <w:rPr>
                 <w:rStyle w:val="Hyperlink"/>
@@ -741,7 +741,7 @@
               <w:rPr>
                 <w:noProof/>
               </w:rPr>
-              <w:instrText xml:space="preserve"> PAGEREF _Toc243793736 \h </w:instrText>
+              <w:instrText xml:space="preserve"> PAGEREF _Toc243797245 \h </w:instrText>
             </w:r>
             <w:r>
               <w:rPr>
@@ -780,7 +780,7 @@
               <w:color w:val="auto"/>
             </w:rPr>
           </w:pPr>
-          <w:hyperlink w:anchor="_Toc243793737" w:history="1">
+          <w:hyperlink w:anchor="_Toc243797246" w:history="1">
             <w:r>
               <w:rPr>
                 <w:rStyle w:val="Hyperlink"/>
@@ -804,7 +804,7 @@
               <w:rPr>
                 <w:noProof/>
               </w:rPr>
-              <w:instrText xml:space="preserve"> PAGEREF _Toc243793737 \h </w:instrText>
+              <w:instrText xml:space="preserve"> PAGEREF _Toc243797246 \h </w:instrText>
             </w:r>
             <w:r>
               <w:rPr>
@@ -843,7 +843,7 @@
               <w:color w:val="auto"/>
             </w:rPr>
           </w:pPr>
-          <w:hyperlink w:anchor="_Toc243793738" w:history="1">
+          <w:hyperlink w:anchor="_Toc243797247" w:history="1">
             <w:r>
               <w:rPr>
                 <w:rStyle w:val="Hyperlink"/>
@@ -867,7 +867,7 @@
               <w:rPr>
                 <w:noProof/>
               </w:rPr>
-              <w:instrText xml:space="preserve"> PAGEREF _Toc243793738 \h </w:instrText>
+              <w:instrText xml:space="preserve"> PAGEREF _Toc243797247 \h </w:instrText>
             </w:r>
             <w:r>
               <w:rPr>
@@ -906,7 +906,7 @@
               <w:color w:val="auto"/>
             </w:rPr>
           </w:pPr>
-          <w:hyperlink w:anchor="_Toc243793739" w:history="1">
+          <w:hyperlink w:anchor="_Toc243797248" w:history="1">
             <w:r>
               <w:rPr>
                 <w:rStyle w:val="Hyperlink"/>
@@ -930,7 +930,7 @@
               <w:rPr>
                 <w:noProof/>
               </w:rPr>
-              <w:instrText xml:space="preserve"> PAGEREF _Toc243793739 \h </w:instrText>
+              <w:instrText xml:space="preserve"> PAGEREF _Toc243797248 \h </w:instrText>
             </w:r>
             <w:r>
               <w:rPr>
@@ -969,7 +969,7 @@
               <w:color w:val="auto"/>
             </w:rPr>
           </w:pPr>
-          <w:hyperlink w:anchor="_Toc243793740" w:history="1">
+          <w:hyperlink w:anchor="_Toc243797249" w:history="1">
             <w:r>
               <w:rPr>
                 <w:rStyle w:val="Hyperlink"/>
@@ -993,7 +993,7 @@
               <w:rPr>
                 <w:noProof/>
               </w:rPr>
-              <w:instrText xml:space="preserve"> PAGEREF _Toc243793740 \h </w:instrText>
+              <w:instrText xml:space="preserve"> PAGEREF _Toc243797249 \h </w:instrText>
             </w:r>
             <w:r>
               <w:rPr>
@@ -1032,7 +1032,7 @@
               <w:color w:val="auto"/>
             </w:rPr>
           </w:pPr>
-          <w:hyperlink w:anchor="_Toc243793741" w:history="1">
+          <w:hyperlink w:anchor="_Toc243797250" w:history="1">
             <w:r>
               <w:rPr>
                 <w:rStyle w:val="Hyperlink"/>
@@ -1056,7 +1056,7 @@
               <w:rPr>
                 <w:noProof/>
               </w:rPr>
-              <w:instrText xml:space="preserve"> PAGEREF _Toc243793741 \h </w:instrText>
+              <w:instrText xml:space="preserve"> PAGEREF _Toc243797250 \h </w:instrText>
             </w:r>
             <w:r>
               <w:rPr>
@@ -1095,7 +1095,7 @@
               <w:color w:val="auto"/>
             </w:rPr>
           </w:pPr>
-          <w:hyperlink w:anchor="_Toc243793742" w:history="1">
+          <w:hyperlink w:anchor="_Toc243797251" w:history="1">
             <w:r>
               <w:rPr>
                 <w:rStyle w:val="Hyperlink"/>
@@ -1119,7 +1119,7 @@
               <w:rPr>
                 <w:noProof/>
               </w:rPr>
-              <w:instrText xml:space="preserve"> PAGEREF _Toc243793742 \h </w:instrText>
+              <w:instrText xml:space="preserve"> PAGEREF _Toc243797251 \h </w:instrText>
             </w:r>
             <w:r>
               <w:rPr>
@@ -1158,7 +1158,7 @@
               <w:color w:val="auto"/>
             </w:rPr>
           </w:pPr>
-          <w:hyperlink w:anchor="_Toc243793743" w:history="1">
+          <w:hyperlink w:anchor="_Toc243797252" w:history="1">
             <w:r>
               <w:rPr>
                 <w:rStyle w:val="Hyperlink"/>
@@ -1182,7 +1182,7 @@
               <w:rPr>
                 <w:noProof/>
               </w:rPr>
-              <w:instrText xml:space="preserve"> PAGEREF _Toc243793743 \h </w:instrText>
+              <w:instrText xml:space="preserve"> PAGEREF _Toc243797252 \h </w:instrText>
             </w:r>
             <w:r>
               <w:rPr>
@@ -1221,7 +1221,7 @@
               <w:color w:val="auto"/>
             </w:rPr>
           </w:pPr>
-          <w:hyperlink w:anchor="_Toc243793744" w:history="1">
+          <w:hyperlink w:anchor="_Toc243797253" w:history="1">
             <w:r>
               <w:rPr>
                 <w:rStyle w:val="Hyperlink"/>
@@ -1245,7 +1245,7 @@
               <w:rPr>
                 <w:noProof/>
               </w:rPr>
-              <w:instrText xml:space="preserve"> PAGEREF _Toc243793744 \h </w:instrText>
+              <w:instrText xml:space="preserve"> PAGEREF _Toc243797253 \h </w:instrText>
             </w:r>
             <w:r>
               <w:rPr>
@@ -1284,7 +1284,7 @@
               <w:color w:val="auto"/>
             </w:rPr>
           </w:pPr>
-          <w:hyperlink w:anchor="_Toc243793745" w:history="1">
+          <w:hyperlink w:anchor="_Toc243797254" w:history="1">
             <w:r>
               <w:rPr>
                 <w:rStyle w:val="Hyperlink"/>
@@ -1308,7 +1308,7 @@
               <w:rPr>
                 <w:noProof/>
               </w:rPr>
-              <w:instrText xml:space="preserve"> PAGEREF _Toc243793745 \h </w:instrText>
+              <w:instrText xml:space="preserve"> PAGEREF _Toc243797254 \h </w:instrText>
             </w:r>
             <w:r>
               <w:rPr>
@@ -1347,7 +1347,7 @@
               <w:color w:val="auto"/>
             </w:rPr>
           </w:pPr>
-          <w:hyperlink w:anchor="_Toc243793746" w:history="1">
+          <w:hyperlink w:anchor="_Toc243797255" w:history="1">
             <w:r>
               <w:rPr>
                 <w:rStyle w:val="Hyperlink"/>
@@ -1371,7 +1371,7 @@
               <w:rPr>
                 <w:noProof/>
               </w:rPr>
-              <w:instrText xml:space="preserve"> PAGEREF _Toc243793746 \h </w:instrText>
+              <w:instrText xml:space="preserve"> PAGEREF _Toc243797255 \h </w:instrText>
             </w:r>
             <w:r>
               <w:rPr>
@@ -1410,7 +1410,7 @@
               <w:color w:val="auto"/>
             </w:rPr>
           </w:pPr>
-          <w:hyperlink w:anchor="_Toc243793747" w:history="1">
+          <w:hyperlink w:anchor="_Toc243797256" w:history="1">
             <w:r>
               <w:rPr>
                 <w:rStyle w:val="Hyperlink"/>
@@ -1434,7 +1434,7 @@
               <w:rPr>
                 <w:noProof/>
               </w:rPr>
-              <w:instrText xml:space="preserve"> PAGEREF _Toc243793747 \h </w:instrText>
+              <w:instrText xml:space="preserve"> PAGEREF _Toc243797256 \h </w:instrText>
             </w:r>
             <w:r>
               <w:rPr>
@@ -1473,7 +1473,7 @@
               <w:color w:val="auto"/>
             </w:rPr>
           </w:pPr>
-          <w:hyperlink w:anchor="_Toc243793748" w:history="1">
+          <w:hyperlink w:anchor="_Toc243797257" w:history="1">
             <w:r>
               <w:rPr>
                 <w:rStyle w:val="Hyperlink"/>
@@ -1497,7 +1497,7 @@
               <w:rPr>
                 <w:noProof/>
               </w:rPr>
-              <w:instrText xml:space="preserve"> PAGEREF _Toc243793748 \h </w:instrText>
+              <w:instrText xml:space="preserve"> PAGEREF _Toc243797257 \h </w:instrText>
             </w:r>
             <w:r>
               <w:rPr>
@@ -1536,7 +1536,7 @@
               <w:color w:val="auto"/>
             </w:rPr>
           </w:pPr>
-          <w:hyperlink w:anchor="_Toc243793749" w:history="1">
+          <w:hyperlink w:anchor="_Toc243797258" w:history="1">
             <w:r>
               <w:rPr>
                 <w:rStyle w:val="Hyperlink"/>
@@ -1560,7 +1560,7 @@
               <w:rPr>
                 <w:noProof/>
               </w:rPr>
-              <w:instrText xml:space="preserve"> PAGEREF _Toc243793749 \h </w:instrText>
+              <w:instrText xml:space="preserve"> PAGEREF _Toc243797258 \h </w:instrText>
             </w:r>
             <w:r>
               <w:rPr>
@@ -1599,7 +1599,7 @@
               <w:color w:val="auto"/>
             </w:rPr>
           </w:pPr>
-          <w:hyperlink w:anchor="_Toc243793750" w:history="1">
+          <w:hyperlink w:anchor="_Toc243797259" w:history="1">
             <w:r>
               <w:rPr>
                 <w:rStyle w:val="Hyperlink"/>
@@ -1623,7 +1623,7 @@
               <w:rPr>
                 <w:noProof/>
               </w:rPr>
-              <w:instrText xml:space="preserve"> PAGEREF _Toc243793750 \h </w:instrText>
+              <w:instrText xml:space="preserve"> PAGEREF _Toc243797259 \h </w:instrText>
             </w:r>
             <w:r>
               <w:rPr>
@@ -1662,7 +1662,7 @@
               <w:color w:val="auto"/>
             </w:rPr>
           </w:pPr>
-          <w:hyperlink w:anchor="_Toc243793751" w:history="1">
+          <w:hyperlink w:anchor="_Toc243797260" w:history="1">
             <w:r>
               <w:rPr>
                 <w:rStyle w:val="Hyperlink"/>
@@ -1686,7 +1686,7 @@
               <w:rPr>
                 <w:noProof/>
               </w:rPr>
-              <w:instrText xml:space="preserve"> PAGEREF _Toc243793751 \h </w:instrText>
+              <w:instrText xml:space="preserve"> PAGEREF _Toc243797260 \h </w:instrText>
             </w:r>
             <w:r>
               <w:rPr>
@@ -1725,7 +1725,7 @@
               <w:color w:val="auto"/>
             </w:rPr>
           </w:pPr>
-          <w:hyperlink w:anchor="_Toc243793752" w:history="1">
+          <w:hyperlink w:anchor="_Toc243797261" w:history="1">
             <w:r>
               <w:rPr>
                 <w:rStyle w:val="Hyperlink"/>
@@ -1749,7 +1749,7 @@
               <w:rPr>
                 <w:noProof/>
               </w:rPr>
-              <w:instrText xml:space="preserve"> PAGEREF _Toc243793752 \h </w:instrText>
+              <w:instrText xml:space="preserve"> PAGEREF _Toc243797261 \h </w:instrText>
             </w:r>
             <w:r>
               <w:rPr>
@@ -1788,7 +1788,7 @@
               <w:color w:val="auto"/>
             </w:rPr>
           </w:pPr>
-          <w:hyperlink w:anchor="_Toc243793753" w:history="1">
+          <w:hyperlink w:anchor="_Toc243797262" w:history="1">
             <w:r>
               <w:rPr>
                 <w:rStyle w:val="Hyperlink"/>
@@ -1812,7 +1812,7 @@
               <w:rPr>
                 <w:noProof/>
               </w:rPr>
-              <w:instrText xml:space="preserve"> PAGEREF _Toc243793753 \h </w:instrText>
+              <w:instrText xml:space="preserve"> PAGEREF _Toc243797262 \h </w:instrText>
             </w:r>
             <w:r>
               <w:rPr>
@@ -1851,7 +1851,7 @@
               <w:color w:val="auto"/>
             </w:rPr>
           </w:pPr>
-          <w:hyperlink w:anchor="_Toc243793754" w:history="1">
+          <w:hyperlink w:anchor="_Toc243797263" w:history="1">
             <w:r>
               <w:rPr>
                 <w:rStyle w:val="Hyperlink"/>
@@ -1875,7 +1875,7 @@
               <w:rPr>
                 <w:noProof/>
               </w:rPr>
-              <w:instrText xml:space="preserve"> PAGEREF _Toc243793754 \h </w:instrText>
+              <w:instrText xml:space="preserve"> PAGEREF _Toc243797263 \h </w:instrText>
             </w:r>
             <w:r>
               <w:rPr>
@@ -1914,7 +1914,7 @@
               <w:color w:val="auto"/>
             </w:rPr>
           </w:pPr>
-          <w:hyperlink w:anchor="_Toc243793755" w:history="1">
+          <w:hyperlink w:anchor="_Toc243797264" w:history="1">
             <w:r>
               <w:rPr>
                 <w:rStyle w:val="Hyperlink"/>
@@ -1938,7 +1938,7 @@
               <w:rPr>
                 <w:noProof/>
               </w:rPr>
-              <w:instrText xml:space="preserve"> PAGEREF _Toc243793755 \h </w:instrText>
+              <w:instrText xml:space="preserve"> PAGEREF _Toc243797264 \h </w:instrText>
             </w:r>
             <w:r>
               <w:rPr>
@@ -1977,7 +1977,7 @@
               <w:color w:val="auto"/>
             </w:rPr>
           </w:pPr>
-          <w:hyperlink w:anchor="_Toc243793756" w:history="1">
+          <w:hyperlink w:anchor="_Toc243797265" w:history="1">
             <w:r>
               <w:rPr>
                 <w:rStyle w:val="Hyperlink"/>
@@ -2001,7 +2001,7 @@
               <w:rPr>
                 <w:noProof/>
               </w:rPr>
-              <w:instrText xml:space="preserve"> PAGEREF _Toc243793756 \h </w:instrText>
+              <w:instrText xml:space="preserve"> PAGEREF _Toc243797265 \h </w:instrText>
             </w:r>
             <w:r>
               <w:rPr>
@@ -2040,7 +2040,7 @@
               <w:color w:val="auto"/>
             </w:rPr>
           </w:pPr>
-          <w:hyperlink w:anchor="_Toc243793757" w:history="1">
+          <w:hyperlink w:anchor="_Toc243797266" w:history="1">
             <w:r>
               <w:rPr>
                 <w:rStyle w:val="Hyperlink"/>
@@ -2064,7 +2064,7 @@
               <w:rPr>
                 <w:noProof/>
               </w:rPr>
-              <w:instrText xml:space="preserve"> PAGEREF _Toc243793757 \h </w:instrText>
+              <w:instrText xml:space="preserve"> PAGEREF _Toc243797266 \h </w:instrText>
             </w:r>
             <w:r>
               <w:rPr>
@@ -2103,7 +2103,7 @@
               <w:color w:val="auto"/>
             </w:rPr>
           </w:pPr>
-          <w:hyperlink w:anchor="_Toc243793758" w:history="1">
+          <w:hyperlink w:anchor="_Toc243797267" w:history="1">
             <w:r>
               <w:rPr>
                 <w:rStyle w:val="Hyperlink"/>
@@ -2127,7 +2127,7 @@
               <w:rPr>
                 <w:noProof/>
               </w:rPr>
-              <w:instrText xml:space="preserve"> PAGEREF _Toc243793758 \h </w:instrText>
+              <w:instrText xml:space="preserve"> PAGEREF _Toc243797267 \h </w:instrText>
             </w:r>
             <w:r>
               <w:rPr>
@@ -2166,7 +2166,7 @@
               <w:color w:val="auto"/>
             </w:rPr>
           </w:pPr>
-          <w:hyperlink w:anchor="_Toc243793759" w:history="1">
+          <w:hyperlink w:anchor="_Toc243797268" w:history="1">
             <w:r>
               <w:rPr>
                 <w:rStyle w:val="Hyperlink"/>
@@ -2190,7 +2190,7 @@
               <w:rPr>
                 <w:noProof/>
               </w:rPr>
-              <w:instrText xml:space="preserve"> PAGEREF _Toc243793759 \h </w:instrText>
+              <w:instrText xml:space="preserve"> PAGEREF _Toc243797268 \h </w:instrText>
             </w:r>
             <w:r>
               <w:rPr>
@@ -2229,7 +2229,7 @@
               <w:color w:val="auto"/>
             </w:rPr>
           </w:pPr>
-          <w:hyperlink w:anchor="_Toc243793760" w:history="1">
+          <w:hyperlink w:anchor="_Toc243797269" w:history="1">
             <w:r>
               <w:rPr>
                 <w:rStyle w:val="Hyperlink"/>
@@ -2253,7 +2253,7 @@
               <w:rPr>
                 <w:noProof/>
               </w:rPr>
-              <w:instrText xml:space="preserve"> PAGEREF _Toc243793760 \h </w:instrText>
+              <w:instrText xml:space="preserve"> PAGEREF _Toc243797269 \h </w:instrText>
             </w:r>
             <w:r>
               <w:rPr>
@@ -2292,7 +2292,7 @@
               <w:color w:val="auto"/>
             </w:rPr>
           </w:pPr>
-          <w:hyperlink w:anchor="_Toc243793761" w:history="1">
+          <w:hyperlink w:anchor="_Toc243797270" w:history="1">
             <w:r>
               <w:rPr>
                 <w:rStyle w:val="Hyperlink"/>
@@ -2316,7 +2316,7 @@
               <w:rPr>
                 <w:noProof/>
               </w:rPr>
-              <w:instrText xml:space="preserve"> PAGEREF _Toc243793761 \h </w:instrText>
+              <w:instrText xml:space="preserve"> PAGEREF _Toc243797270 \h </w:instrText>
             </w:r>
             <w:r>
               <w:rPr>
@@ -2355,7 +2355,7 @@
               <w:color w:val="auto"/>
             </w:rPr>
           </w:pPr>
-          <w:hyperlink w:anchor="_Toc243793762" w:history="1">
+          <w:hyperlink w:anchor="_Toc243797271" w:history="1">
             <w:r>
               <w:rPr>
                 <w:rStyle w:val="Hyperlink"/>
@@ -2379,7 +2379,7 @@
               <w:rPr>
                 <w:noProof/>
               </w:rPr>
-              <w:instrText xml:space="preserve"> PAGEREF _Toc243793762 \h </w:instrText>
+              <w:instrText xml:space="preserve"> PAGEREF _Toc243797271 \h </w:instrText>
             </w:r>
             <w:r>
               <w:rPr>
@@ -2418,7 +2418,7 @@
               <w:color w:val="auto"/>
             </w:rPr>
           </w:pPr>
-          <w:hyperlink w:anchor="_Toc243793763" w:history="1">
+          <w:hyperlink w:anchor="_Toc243797272" w:history="1">
             <w:r>
               <w:rPr>
                 <w:rStyle w:val="Hyperlink"/>
@@ -2442,7 +2442,7 @@
               <w:rPr>
                 <w:noProof/>
               </w:rPr>
-              <w:instrText xml:space="preserve"> PAGEREF _Toc243793763 \h </w:instrText>
+              <w:instrText xml:space="preserve"> PAGEREF _Toc243797272 \h </w:instrText>
             </w:r>
             <w:r>
               <w:rPr>
@@ -2481,7 +2481,7 @@
               <w:color w:val="auto"/>
             </w:rPr>
           </w:pPr>
-          <w:hyperlink w:anchor="_Toc243793764" w:history="1">
+          <w:hyperlink w:anchor="_Toc243797273" w:history="1">
             <w:r>
               <w:rPr>
                 <w:rStyle w:val="Hyperlink"/>
@@ -2505,7 +2505,7 @@
               <w:rPr>
                 <w:noProof/>
               </w:rPr>
-              <w:instrText xml:space="preserve"> PAGEREF _Toc243793764 \h </w:instrText>
+              <w:instrText xml:space="preserve"> PAGEREF _Toc243797273 \h </w:instrText>
             </w:r>
             <w:r>
               <w:rPr>
@@ -2544,7 +2544,7 @@
               <w:color w:val="auto"/>
             </w:rPr>
           </w:pPr>
-          <w:hyperlink w:anchor="_Toc243793765" w:history="1">
+          <w:hyperlink w:anchor="_Toc243797274" w:history="1">
             <w:r>
               <w:rPr>
                 <w:rStyle w:val="Hyperlink"/>
@@ -2568,7 +2568,7 @@
               <w:rPr>
                 <w:noProof/>
               </w:rPr>
-              <w:instrText xml:space="preserve"> PAGEREF _Toc243793765 \h </w:instrText>
+              <w:instrText xml:space="preserve"> PAGEREF _Toc243797274 \h </w:instrText>
             </w:r>
             <w:r>
               <w:rPr>
@@ -2607,7 +2607,7 @@
               <w:color w:val="auto"/>
             </w:rPr>
           </w:pPr>
-          <w:hyperlink w:anchor="_Toc243793766" w:history="1">
+          <w:hyperlink w:anchor="_Toc243797275" w:history="1">
             <w:r>
               <w:rPr>
                 <w:rStyle w:val="Hyperlink"/>
@@ -2631,7 +2631,7 @@
               <w:rPr>
                 <w:noProof/>
               </w:rPr>
-              <w:instrText xml:space="preserve"> PAGEREF _Toc243793766 \h </w:instrText>
+              <w:instrText xml:space="preserve"> PAGEREF _Toc243797275 \h </w:instrText>
             </w:r>
             <w:r>
               <w:rPr>
@@ -2670,7 +2670,7 @@
               <w:color w:val="auto"/>
             </w:rPr>
           </w:pPr>
-          <w:hyperlink w:anchor="_Toc243793767" w:history="1">
+          <w:hyperlink w:anchor="_Toc243797276" w:history="1">
             <w:r>
               <w:rPr>
                 <w:rStyle w:val="Hyperlink"/>
@@ -2694,7 +2694,7 @@
               <w:rPr>
                 <w:noProof/>
               </w:rPr>
-              <w:instrText xml:space="preserve"> PAGEREF _Toc243793767 \h </w:instrText>
+              <w:instrText xml:space="preserve"> PAGEREF _Toc243797276 \h </w:instrText>
             </w:r>
             <w:r>
               <w:rPr>
@@ -2733,7 +2733,7 @@
               <w:color w:val="auto"/>
             </w:rPr>
           </w:pPr>
-          <w:hyperlink w:anchor="_Toc243793768" w:history="1">
+          <w:hyperlink w:anchor="_Toc243797277" w:history="1">
             <w:r>
               <w:rPr>
                 <w:rStyle w:val="Hyperlink"/>
@@ -2757,7 +2757,7 @@
               <w:rPr>
                 <w:noProof/>
               </w:rPr>
-              <w:instrText xml:space="preserve"> PAGEREF _Toc243793768 \h </w:instrText>
+              <w:instrText xml:space="preserve"> PAGEREF _Toc243797277 \h </w:instrText>
             </w:r>
             <w:r>
               <w:rPr>
@@ -2796,7 +2796,7 @@
               <w:color w:val="auto"/>
             </w:rPr>
           </w:pPr>
-          <w:hyperlink w:anchor="_Toc243793769" w:history="1">
+          <w:hyperlink w:anchor="_Toc243797278" w:history="1">
             <w:r>
               <w:rPr>
                 <w:rStyle w:val="Hyperlink"/>
@@ -2820,7 +2820,7 @@
               <w:rPr>
                 <w:noProof/>
               </w:rPr>
-              <w:instrText xml:space="preserve"> PAGEREF _Toc243793769 \h </w:instrText>
+              <w:instrText xml:space="preserve"> PAGEREF _Toc243797278 \h </w:instrText>
             </w:r>
             <w:r>
               <w:rPr>
@@ -2859,7 +2859,7 @@
               <w:color w:val="auto"/>
             </w:rPr>
           </w:pPr>
-          <w:hyperlink w:anchor="_Toc243793770" w:history="1">
+          <w:hyperlink w:anchor="_Toc243797279" w:history="1">
             <w:r>
               <w:rPr>
                 <w:rStyle w:val="Hyperlink"/>
@@ -2883,7 +2883,70 @@
               <w:rPr>
                 <w:noProof/>
               </w:rPr>
-              <w:instrText xml:space="preserve"> PAGEREF _Toc243793770 \h </w:instrText>
+              <w:instrText xml:space="preserve"> PAGEREF _Toc243797279 \h </w:instrText>
+            </w:r>
+            <w:r>
+              <w:rPr>
+                <w:noProof/>
+              </w:rPr>
+            </w:r>
+            <w:r>
+              <w:rPr>
+                <w:noProof/>
+              </w:rPr>
+              <w:fldChar w:fldCharType="separate"/>
+            </w:r>
+            <w:r>
+              <w:rPr>
+                <w:noProof/>
+              </w:rPr>
+              <w:t>43</w:t>
+            </w:r>
+            <w:r>
+              <w:rPr>
+                <w:noProof/>
+              </w:rPr>
+              <w:fldChar w:fldCharType="end"/>
+            </w:r>
+          </w:hyperlink>
+        </w:p>
+        <w:p>
+          <w:pPr>
+            <w:pStyle w:val="TOC2"/>
+            <w:tabs>
+              <w:tab w:val="right" w:leader="dot" w:pos="9896"/>
+            </w:tabs>
+            <w:rPr>
+              <w:rFonts w:asciiTheme="minorHAnsi" w:eastAsiaTheme="minorEastAsia" w:hAnsiTheme="minorHAnsi" w:cstheme="minorBidi"/>
+              <w:noProof/>
+              <w:color w:val="auto"/>
+            </w:rPr>
+          </w:pPr>
+          <w:hyperlink w:anchor="_Toc243797280" w:history="1">
+            <w:r>
+              <w:rPr>
+                <w:rStyle w:val="Hyperlink"/>
+                <w:noProof/>
+              </w:rPr>
+              <w:t>16.1 Limits you should know</w:t>
+            </w:r>
+            <w:r>
+              <w:rPr>
+                <w:noProof/>
+              </w:rPr>
+              <w:tab/>
+            </w:r>
+            <w:r>
+              <w:rPr>
+                <w:noProof/>
+              </w:rPr>
+              <w:fldChar w:fldCharType="begin"/>
+            </w:r>
+            <w:r>
+              <w:rPr>
+                <w:noProof/>
+              </w:rPr>
+              <w:instrText xml:space="preserve"> PAGEREF _Toc243797280 \h </w:instrText>
             </w:r>
             <w:r>
               <w:rPr>
@@ -2922,7 +2985,7 @@
               <w:color w:val="auto"/>
             </w:rPr>
           </w:pPr>
-          <w:hyperlink w:anchor="_Toc243793771" w:history="1">
+          <w:hyperlink w:anchor="_Toc243797281" w:history="1">
             <w:r>
               <w:rPr>
                 <w:rStyle w:val="Hyperlink"/>
@@ -2946,7 +3009,7 @@
               <w:rPr>
                 <w:noProof/>
               </w:rPr>
-              <w:instrText xml:space="preserve"> PAGEREF _Toc243793771 \h </w:instrText>
+              <w:instrText xml:space="preserve"> PAGEREF _Toc243797281 \h </w:instrText>
             </w:r>
             <w:r>
               <w:rPr>
@@ -2985,7 +3048,7 @@
               <w:color w:val="auto"/>
             </w:rPr>
           </w:pPr>
-          <w:hyperlink w:anchor="_Toc243793772" w:history="1">
+          <w:hyperlink w:anchor="_Toc243797282" w:history="1">
             <w:r>
               <w:rPr>
                 <w:rStyle w:val="Hyperlink"/>
@@ -3009,7 +3072,7 @@
               <w:rPr>
                 <w:noProof/>
               </w:rPr>
-              <w:instrText xml:space="preserve"> PAGEREF _Toc243793772 \h </w:instrText>
+              <w:instrText xml:space="preserve"> PAGEREF _Toc243797282 \h </w:instrText>
             </w:r>
             <w:r>
               <w:rPr>
@@ -3048,7 +3111,7 @@
               <w:color w:val="auto"/>
             </w:rPr>
           </w:pPr>
-          <w:hyperlink w:anchor="_Toc243793773" w:history="1">
+          <w:hyperlink w:anchor="_Toc243797283" w:history="1">
             <w:r>
               <w:rPr>
                 <w:rStyle w:val="Hyperlink"/>
@@ -3072,7 +3135,7 @@
               <w:rPr>
                 <w:noProof/>
               </w:rPr>
-              <w:instrText xml:space="preserve"> PAGEREF _Toc243793773 \h </w:instrText>
+              <w:instrText xml:space="preserve"> PAGEREF _Toc243797283 \h </w:instrText>
             </w:r>
             <w:r>
               <w:rPr>
@@ -3111,7 +3174,7 @@
               <w:color w:val="auto"/>
             </w:rPr>
           </w:pPr>
-          <w:hyperlink w:anchor="_Toc243793774" w:history="1">
+          <w:hyperlink w:anchor="_Toc243797284" w:history="1">
             <w:r>
               <w:rPr>
                 <w:rStyle w:val="Hyperlink"/>
@@ -3135,7 +3198,7 @@
               <w:rPr>
                 <w:noProof/>
               </w:rPr>
-              <w:instrText xml:space="preserve"> PAGEREF _Toc243793774 \h </w:instrText>
+              <w:instrText xml:space="preserve"> PAGEREF _Toc243797284 \h </w:instrText>
             </w:r>
             <w:r>
               <w:rPr>
@@ -3174,7 +3237,7 @@
               <w:color w:val="auto"/>
             </w:rPr>
           </w:pPr>
-          <w:hyperlink w:anchor="_Toc243793775" w:history="1">
+          <w:hyperlink w:anchor="_Toc243797285" w:history="1">
             <w:r>
               <w:rPr>
                 <w:rStyle w:val="Hyperlink"/>
@@ -3198,7 +3261,7 @@
               <w:rPr>
                 <w:noProof/>
               </w:rPr>
-              <w:instrText xml:space="preserve"> PAGEREF _Toc243793775 \h </w:instrText>
+              <w:instrText xml:space="preserve"> PAGEREF _Toc243797285 \h </w:instrText>
             </w:r>
             <w:r>
               <w:rPr>
@@ -3237,7 +3300,7 @@
               <w:color w:val="auto"/>
             </w:rPr>
           </w:pPr>
-          <w:hyperlink w:anchor="_Toc243793776" w:history="1">
+          <w:hyperlink w:anchor="_Toc243797286" w:history="1">
             <w:r>
               <w:rPr>
                 <w:rStyle w:val="Hyperlink"/>
@@ -3261,7 +3324,7 @@
               <w:rPr>
                 <w:noProof/>
               </w:rPr>
-              <w:instrText xml:space="preserve"> PAGEREF _Toc243793776 \h </w:instrText>
+              <w:instrText xml:space="preserve"> PAGEREF _Toc243797286 \h </w:instrText>
             </w:r>
             <w:r>
               <w:rPr>
@@ -3300,7 +3363,7 @@
               <w:color w:val="auto"/>
             </w:rPr>
           </w:pPr>
-          <w:hyperlink w:anchor="_Toc243793777" w:history="1">
+          <w:hyperlink w:anchor="_Toc243797287" w:history="1">
             <w:r>
               <w:rPr>
                 <w:rStyle w:val="Hyperlink"/>
@@ -3324,7 +3387,7 @@
               <w:rPr>
                 <w:noProof/>
               </w:rPr>
-              <w:instrText xml:space="preserve"> PAGEREF _Toc243793777 \h </w:instrText>
+              <w:instrText xml:space="preserve"> PAGEREF _Toc243797287 \h </w:instrText>
             </w:r>
             <w:r>
               <w:rPr>
@@ -3363,7 +3426,7 @@
         <w:pStyle w:val="Heading1"/>
         <w:pageBreakBefore/>
       </w:pPr>
-      <w:bookmarkStart w:id="1" w:name="_Toc243793727"/>
+      <w:bookmarkStart w:id="1" w:name="_Toc243797236"/>
       <w:r>
         <w:lastRenderedPageBreak/>
         <w:t>1. Project overview</w:t>
@@ -3374,7 +3437,7 @@
       <w:pPr>
         <w:pStyle w:val="Heading2"/>
       </w:pPr>
-      <w:bookmarkStart w:id="2" w:name="_Toc243793728"/>
+      <w:bookmarkStart w:id="2" w:name="_Toc243797237"/>
       <w:r>
         <w:t>1.1 What the system does</w:t>
       </w:r>
@@ -3385,10 +3448,13 @@
         <w:spacing w:after="120" w:line="276" w:lineRule="auto"/>
       </w:pPr>
       <w:r>
-        <w:t>The Disaster Mapping &amp; Relief Management System is a web application that helps an emergency control room record disasters, keep track of affected families, shelter them, hand out relief, and see the whole</w:t>
-      </w:r>
-      <w:r>
-        <w:t xml:space="preserve"> situation on one screen. It was built for the Khulna - Satkhira - Bagerhat coastal region of Bangladesh. Security and testing are described in section 16.</w:t>
+        <w:t>The Disaster Mapping &amp;</w:t>
+      </w:r>
+      <w:r>
+        <w:t xml:space="preserve"> Relief Management System is a web application that helps an emergency control room record disasters, keep track of affected families, shelter them, hand out relief, and see the whole situation on one screen. It was built for the Khulna - Satkhira - Bagerh</w:t>
+      </w:r>
+      <w:r>
+        <w:t>at coastal region of Bangladesh. Security and testing are described in section 16.</w:t>
       </w:r>
     </w:p>
     <w:p>
@@ -3408,10 +3474,7 @@
         <w:t>Records</w:t>
       </w:r>
       <w:r>
-        <w:t xml:space="preserve"> disasters, the areas they hit, early warnings (with a warning signal number), damage, affect</w:t>
-      </w:r>
-      <w:r>
-        <w:t>ed families, shelters, rescue organisations and relief stock.</w:t>
+        <w:t xml:space="preserve"> disasters, the areas they hit, early warnings (with a warning signal number), damage, affected families, shelters, rescue organisations and relief stock.</w:t>
       </w:r>
     </w:p>
     <w:p>
@@ -3431,7 +3494,10 @@
         <w:t>Tracks</w:t>
       </w:r>
       <w:r>
-        <w:t xml:space="preserve"> who is staying in which shelter, how many places are left, and which families have received relief.</w:t>
+        <w:t xml:space="preserve"> who </w:t>
+      </w:r>
+      <w:r>
+        <w:t>is staying in which shelter, how many places are left, and which families have received relief.</w:t>
       </w:r>
     </w:p>
     <w:p>
@@ -3471,17 +3537,17 @@
         <w:t>Protects</w:t>
       </w:r>
       <w:r>
-        <w:t xml:space="preserve"> the data with roles, an audit log, database rules (foreign keys, CHECK constraints, triggers) and a Data H</w:t>
-      </w:r>
-      <w:r>
-        <w:t>ealth report.</w:t>
+        <w:t xml:space="preserve"> the d</w:t>
+      </w:r>
+      <w:r>
+        <w:t>ata with roles, an audit log, database rules (foreign keys, CHECK constraints, triggers) and a Data Health report.</w:t>
       </w:r>
     </w:p>
     <w:p>
       <w:pPr>
         <w:pStyle w:val="Heading2"/>
       </w:pPr>
-      <w:bookmarkStart w:id="3" w:name="_Toc243793729"/>
+      <w:bookmarkStart w:id="3" w:name="_Toc243797238"/>
       <w:r>
         <w:t>1.2 Technology</w:t>
       </w:r>
@@ -3633,7 +3699,14 @@
                 <w:sz w:val="19"/>
                 <w:szCs w:val="19"/>
               </w:rPr>
-              <w:t>PHP 8.1+ (tested on 8.2) running under WampServer (Apache), or PHP's built-in server with start_server.bat</w:t>
+              <w:t>PHP 8.1+ (tested on 8.2) running under WampServer (Apache), or PHP'</w:t>
+            </w:r>
+            <w:r>
+              <w:rPr>
+                <w:sz w:val="19"/>
+                <w:szCs w:val="19"/>
+              </w:rPr>
+              <w:t>s built-in server with start_server.bat</w:t>
             </w:r>
           </w:p>
         </w:tc>
@@ -3776,7 +3849,7 @@
       <w:pPr>
         <w:pStyle w:val="Heading2"/>
       </w:pPr>
-      <w:bookmarkStart w:id="4" w:name="_Toc243793730"/>
+      <w:bookmarkStart w:id="4" w:name="_Toc243797239"/>
       <w:r>
         <w:t>1.3 The four live-tracking features</w:t>
       </w:r>
@@ -3787,10 +3860,10 @@
         <w:spacing w:after="120" w:line="276" w:lineRule="auto"/>
       </w:pPr>
       <w:r>
-        <w:t>The newest part of the system adds four features to the Live Report, above the original report, which is unchanged. The Dashboard shows a short "Live status" summary of them. Each feature follows an exact rule, listed here and explained step by step in sec</w:t>
-      </w:r>
-      <w:r>
-        <w:t>tion 6.</w:t>
+        <w:t>The newest part of the system adds four features to the Live Report, above the original report, which is unchanged. The Dashboard shows a short "Live status"</w:t>
+      </w:r>
+      <w:r>
+        <w:t xml:space="preserve"> summary of them. Each feature follows an exact rule, listed here and explained step by step in section 6.</w:t>
       </w:r>
     </w:p>
     <w:tbl>
@@ -3997,7 +4070,14 @@
                 <w:sz w:val="19"/>
                 <w:szCs w:val="19"/>
               </w:rPr>
-              <w:t>Signal 8, 9, 10 = red "Severe Danger"</w:t>
+              <w:t>Signal 8, 9, 10 = red "Severe Danger</w:t>
+            </w:r>
+            <w:r>
+              <w:rPr>
+                <w:sz w:val="19"/>
+                <w:szCs w:val="19"/>
+              </w:rPr>
+              <w:t>"</w:t>
             </w:r>
           </w:p>
         </w:tc>
@@ -4355,7 +4435,7 @@
         <w:pStyle w:val="Heading1"/>
         <w:pageBreakBefore/>
       </w:pPr>
-      <w:bookmarkStart w:id="5" w:name="_Toc243793731"/>
+      <w:bookmarkStart w:id="5" w:name="_Toc243797240"/>
       <w:r>
         <w:lastRenderedPageBreak/>
         <w:t>2. Installation and first start</w:t>
@@ -4446,7 +4526,10 @@
         <w:t>config.php</w:t>
       </w:r>
       <w:r>
-        <w:t>. WampServer's default MySQL user is root with an empty password, so normally nothing needs to change. Keep the database name as it is.</w:t>
+        <w:t>. WampServer'</w:t>
+      </w:r>
+      <w:r>
+        <w:t>s default MySQL user is root with an empty password, so normally nothing needs to change. Keep the database name as it is.</w:t>
       </w:r>
     </w:p>
     <w:p>
@@ -4482,7 +4565,10 @@
         <w:spacing w:after="70" w:line="270" w:lineRule="auto"/>
       </w:pPr>
       <w:r>
-        <w:t>On the very first visit the system creates the database, the 22 tables, the 8 triggers and the sample data (a few seconds). No phpMyAdmin import is needed.</w:t>
+        <w:t>On the very first visit the system creates the database, the 2</w:t>
+      </w:r>
+      <w:r>
+        <w:t>2 tables, the 8 triggers and the sample data (a few seconds). No phpMyAdmin import is needed.</w:t>
       </w:r>
     </w:p>
     <w:p>
@@ -4505,10 +4591,10 @@
         <w:t>First run</w:t>
       </w:r>
       <w:r>
-        <w:t xml:space="preserve"> screen appears. Type a user name (3-50 letters, digits, dot, dash or</w:t>
-      </w:r>
-      <w:r>
-        <w:t xml:space="preserve"> underscore) and a password of at least 8 characters, repeat the password and click </w:t>
+        <w:t xml:space="preserve"> screen appears. Type a user name (3-50 letters, digits, dot, dash or underscore) and a password of at least 8 characters, repeat the password and cl</w:t>
+      </w:r>
+      <w:r>
+        <w:t xml:space="preserve">ick </w:t>
       </w:r>
       <w:r>
         <w:rPr>
@@ -4672,14 +4758,14 @@
                 <w:sz w:val="20"/>
                 <w:szCs w:val="20"/>
               </w:rPr>
-              <w:t>. It starts WampServer's My</w:t>
+              <w:t xml:space="preserve">. It starts WampServer's MySQL and PHP's built-in server and opens http://127.0.0.1:8099/ . Edit the three </w:t>
             </w:r>
             <w:r>
               <w:rPr>
                 <w:sz w:val="20"/>
                 <w:szCs w:val="20"/>
               </w:rPr>
-              <w:t>SQL and PHP's built-in server and opens http://127.0.0.1:8099/ . Edit the three paths at the top of the file if your WampServer versions differ.</w:t>
+              <w:t>paths at the top of the file if your WampServer versions differ.</w:t>
             </w:r>
           </w:p>
         </w:tc>
@@ -4765,7 +4851,7 @@
         <w:pStyle w:val="Heading1"/>
         <w:pageBreakBefore/>
       </w:pPr>
-      <w:bookmarkStart w:id="6" w:name="_Toc243793732"/>
+      <w:bookmarkStart w:id="6" w:name="_Toc243797241"/>
       <w:r>
         <w:lastRenderedPageBreak/>
         <w:t>3. Signing in, roles and passwords</w:t>
@@ -4776,7 +4862,7 @@
       <w:pPr>
         <w:pStyle w:val="Heading2"/>
       </w:pPr>
-      <w:bookmarkStart w:id="7" w:name="_Toc243793733"/>
+      <w:bookmarkStart w:id="7" w:name="_Toc243797242"/>
       <w:r>
         <w:t>3.1 Sign in</w:t>
       </w:r>
@@ -4932,10 +5018,10 @@
         <w:spacing w:after="120" w:line="276" w:lineRule="auto"/>
       </w:pPr>
       <w:r>
-        <w:t>A wrong user name or password shows a red message and nothing</w:t>
-      </w:r>
-      <w:r>
-        <w:t xml:space="preserve"> else. After </w:t>
+        <w:t>A wrong user n</w:t>
+      </w:r>
+      <w:r>
+        <w:t xml:space="preserve">ame or password shows a red message and nothing else. After </w:t>
       </w:r>
       <w:r>
         <w:rPr>
@@ -4945,7 +5031,10 @@
         <w:t>5 wrong passwords</w:t>
       </w:r>
       <w:r>
-        <w:t xml:space="preserve"> the account is locked for 5 minutes ("Too many wrong passwords"); when the lock ends you get a fresh set of attempts. A session also ends by itself after 4 hours without any click.</w:t>
+        <w:t xml:space="preserve"> the account is locked for 5 minutes ("Too many wrong passwords"); when the lock ends you get a fresh set of attempts. A session also ends by itself after 4 hours without any clic</w:t>
+      </w:r>
+      <w:r>
+        <w:t>k.</w:t>
       </w:r>
     </w:p>
     <w:p>
@@ -5029,7 +5118,7 @@
       <w:pPr>
         <w:pStyle w:val="Heading2"/>
       </w:pPr>
-      <w:bookmarkStart w:id="8" w:name="_Toc243793734"/>
+      <w:bookmarkStart w:id="8" w:name="_Toc243797243"/>
       <w:r>
         <w:t>3.2 The three roles</w:t>
       </w:r>
@@ -5446,7 +5535,7 @@
       <w:pPr>
         <w:pStyle w:val="Heading2"/>
       </w:pPr>
-      <w:bookmarkStart w:id="9" w:name="_Toc243793735"/>
+      <w:bookmarkStart w:id="9" w:name="_Toc243797244"/>
       <w:r>
         <w:t>3.3 Sign out and change your password</w:t>
       </w:r>
@@ -5523,7 +5612,7 @@
         <w:pStyle w:val="Heading1"/>
         <w:pageBreakBefore/>
       </w:pPr>
-      <w:bookmarkStart w:id="10" w:name="_Toc243793736"/>
+      <w:bookmarkStart w:id="10" w:name="_Toc243797245"/>
       <w:r>
         <w:lastRenderedPageBreak/>
         <w:t>4. Finding your way around</w:t>
@@ -5603,17 +5692,7 @@
           <w:sz w:val="18"/>
           <w:szCs w:val="18"/>
         </w:rPr>
-        <w:t>The main screen: menu on the left, titl</w:t>
-      </w:r>
-      <w:r>
-        <w:rPr>
-          <w:i/>
-          <w:iCs/>
-          <w:color w:val="5B6B77"/>
-          <w:sz w:val="18"/>
-          <w:szCs w:val="18"/>
-        </w:rPr>
-        <w:t>e and search at the top, content in the middle.</w:t>
+        <w:t>The main screen: menu on the left, title and search at the top, content in the middle.</w:t>
       </w:r>
     </w:p>
     <w:tbl>
@@ -5965,7 +6044,7 @@
         <w:pStyle w:val="Heading1"/>
         <w:pageBreakBefore/>
       </w:pPr>
-      <w:bookmarkStart w:id="11" w:name="_Toc243793737"/>
+      <w:bookmarkStart w:id="11" w:name="_Toc243797246"/>
       <w:r>
         <w:lastRenderedPageBreak/>
         <w:t>5. Dashboard</w:t>
@@ -6046,10 +6125,10 @@
         <w:t>Live status</w:t>
       </w:r>
       <w:r>
-        <w:t xml:space="preserve"> cards: warning signals of the active disasters, shelters with no space, relief shortages and data health. Click "open the Live Report"</w:t>
-      </w:r>
-      <w:r>
-        <w:t xml:space="preserve"> for the details.</w:t>
+        <w:t xml:space="preserve"> cards: warning signals of the active disasters, shelters with no space, relief shortages and data health. Click "open the Live Report" for the </w:t>
+      </w:r>
+      <w:r>
+        <w:t>details.</w:t>
       </w:r>
     </w:p>
     <w:p>
@@ -6072,10 +6151,10 @@
         <w:t>Needs attention</w:t>
       </w:r>
       <w:r>
-        <w:t>. Red lines are urgent (a shelter 90% or more full), yellow lines are warnings (low relief stock, a high-risk area without a shelter, a disaster without a warning) and blue lines are notes (families staying more than 3</w:t>
-      </w:r>
-      <w:r>
-        <w:t>0 days). Click a line to open the related table.</w:t>
+        <w:t xml:space="preserve">. Red lines are urgent (a shelter 90% or more full), yellow lines are warnings (low relief stock, a high-risk area without a shelter, a disaster without a warning) and blue lines are notes (families staying more than 30 days). </w:t>
+      </w:r>
+      <w:r>
+        <w:t>Click a line to open the related table.</w:t>
       </w:r>
     </w:p>
     <w:p>
@@ -6184,17 +6263,7 @@
           <w:sz w:val="18"/>
           <w:szCs w:val="18"/>
         </w:rPr>
-        <w:t>Figure 5</w:t>
-      </w:r>
-      <w:r>
-        <w:rPr>
-          <w:b/>
-          <w:bCs/>
-          <w:color w:val="5B6B77"/>
-          <w:sz w:val="18"/>
-          <w:szCs w:val="18"/>
-        </w:rPr>
-        <w:t xml:space="preserve">. </w:t>
+        <w:t xml:space="preserve">Figure 5. </w:t>
       </w:r>
       <w:r>
         <w:rPr>
@@ -6204,7 +6273,17 @@
           <w:sz w:val="18"/>
           <w:szCs w:val="18"/>
         </w:rPr>
-        <w:t>Dashboard: number cards, Live status and the Needs attention list.</w:t>
+        <w:t>Dashboa</w:t>
+      </w:r>
+      <w:r>
+        <w:rPr>
+          <w:i/>
+          <w:iCs/>
+          <w:color w:val="5B6B77"/>
+          <w:sz w:val="18"/>
+          <w:szCs w:val="18"/>
+        </w:rPr>
+        <w:t>rd: number cards, Live status and the Needs attention list.</w:t>
       </w:r>
     </w:p>
     <w:p>
@@ -6343,14 +6422,14 @@
                 <w:sz w:val="20"/>
                 <w:szCs w:val="20"/>
               </w:rPr>
-              <w:t>"Affected families" counts families (one record per family). The number of people in thos</w:t>
+              <w:t>"Affected families" counts families (one record per family). The number of people in those familie</w:t>
             </w:r>
             <w:r>
               <w:rPr>
                 <w:sz w:val="20"/>
                 <w:szCs w:val="20"/>
               </w:rPr>
-              <w:t>e families is shown on the Live Report as "People in those families". "Relief units left" adds the remaining stock of every relief item, whatever its unit.</w:t>
+              <w:t>s is shown on the Live Report as "People in those families". "Relief units left" adds the remaining stock of every relief item, whatever its unit.</w:t>
             </w:r>
           </w:p>
         </w:tc>
@@ -6366,7 +6445,7 @@
         <w:pStyle w:val="Heading1"/>
         <w:pageBreakBefore/>
       </w:pPr>
-      <w:bookmarkStart w:id="12" w:name="_Toc243793738"/>
+      <w:bookmarkStart w:id="12" w:name="_Toc243797247"/>
       <w:r>
         <w:lastRenderedPageBreak/>
         <w:t>6. Live Report</w:t>
@@ -6484,7 +6563,7 @@
       <w:pPr>
         <w:pStyle w:val="Heading2"/>
       </w:pPr>
-      <w:bookmarkStart w:id="13" w:name="_Toc243793739"/>
+      <w:bookmarkStart w:id="13" w:name="_Toc243797248"/>
       <w:r>
         <w:t>6.1 Warning signal indicator</w:t>
       </w:r>
@@ -6642,7 +6721,7 @@
                 <w:sz w:val="19"/>
                 <w:szCs w:val="19"/>
               </w:rPr>
-              <w:t>Meaning</w:t>
+              <w:t>Typical meaning (descriptive wording)</w:t>
             </w:r>
           </w:p>
         </w:tc>
@@ -7296,7 +7375,7 @@
       <w:pPr>
         <w:pStyle w:val="Heading2"/>
       </w:pPr>
-      <w:bookmarkStart w:id="14" w:name="_Toc243793740"/>
+      <w:bookmarkStart w:id="14" w:name="_Toc243797249"/>
       <w:r>
         <w:t>6.2 Live disaster path</w:t>
       </w:r>
@@ -8132,7 +8211,7 @@
       <w:pPr>
         <w:pStyle w:val="Heading2"/>
       </w:pPr>
-      <w:bookmarkStart w:id="15" w:name="_Toc243793741"/>
+      <w:bookmarkStart w:id="15" w:name="_Toc243797250"/>
       <w:r>
         <w:t>6.3 Real-time shelter capacity</w:t>
       </w:r>
@@ -8467,10 +8546,7 @@
         <w:t>Nearest to</w:t>
       </w:r>
       <w:r>
-        <w:t>. Every card t</w:t>
-      </w:r>
-      <w:r>
-        <w:t>hen shows its distance ("13.5 km away") and the closest shelters come first (shelters with space always before full ones).</w:t>
+        <w:t>. Every card then shows its distance ("13.5 km away") and the closest shelters come first (shelters with space always before full ones).</w:t>
       </w:r>
     </w:p>
     <w:p>
@@ -8559,7 +8635,17 @@
           <w:sz w:val="18"/>
           <w:szCs w:val="18"/>
         </w:rPr>
-        <w:t xml:space="preserve">Figure 11. </w:t>
+        <w:t>Figure</w:t>
+      </w:r>
+      <w:r>
+        <w:rPr>
+          <w:b/>
+          <w:bCs/>
+          <w:color w:val="5B6B77"/>
+          <w:sz w:val="18"/>
+          <w:szCs w:val="18"/>
+        </w:rPr>
+        <w:t xml:space="preserve"> 11. </w:t>
       </w:r>
       <w:r>
         <w:rPr>
@@ -8729,7 +8815,7 @@
       <w:pPr>
         <w:pStyle w:val="Heading2"/>
       </w:pPr>
-      <w:bookmarkStart w:id="16" w:name="_Toc243793742"/>
+      <w:bookmarkStart w:id="16" w:name="_Toc243797251"/>
       <w:r>
         <w:t>6.4 Relief distribution tracker</w:t>
       </w:r>
@@ -9243,7 +9329,17 @@
           <w:sz w:val="18"/>
           <w:szCs w:val="18"/>
         </w:rPr>
-        <w:t>Relief distribution: red cards show received and not received; green cards show the received count.</w:t>
+        <w:t xml:space="preserve">Relief distribution: red cards show received and not received; </w:t>
+      </w:r>
+      <w:r>
+        <w:rPr>
+          <w:i/>
+          <w:iCs/>
+          <w:color w:val="5B6B77"/>
+          <w:sz w:val="18"/>
+          <w:szCs w:val="18"/>
+        </w:rPr>
+        <w:t>green cards show the received count.</w:t>
       </w:r>
     </w:p>
     <w:p>
@@ -9327,7 +9423,7 @@
       <w:pPr>
         <w:pStyle w:val="Heading2"/>
       </w:pPr>
-      <w:bookmarkStart w:id="17" w:name="_Toc243793743"/>
+      <w:bookmarkStart w:id="17" w:name="_Toc243797252"/>
       <w:r>
         <w:t>6.5 What changes the Live Report</w:t>
       </w:r>
@@ -9338,10 +9434,7 @@
         <w:spacing w:after="120" w:line="276" w:lineRule="auto"/>
       </w:pPr>
       <w:r>
-        <w:t>Nothing has to be configured. Change the data in the table pages and the Live Report fo</w:t>
-      </w:r>
-      <w:r>
-        <w:t>llows within 5 seconds.</w:t>
+        <w:t>Nothing has to be configured. Change the data in the table pages and the Live Report follows within 5 seconds.</w:t>
       </w:r>
     </w:p>
     <w:tbl>
@@ -9571,14 +9664,7 @@
                 <w:sz w:val="19"/>
                 <w:szCs w:val="19"/>
               </w:rPr>
-              <w:t>Disaster &gt;</w:t>
-            </w:r>
-            <w:r>
-              <w:rPr>
-                <w:sz w:val="19"/>
-                <w:szCs w:val="19"/>
-              </w:rPr>
-              <w:t xml:space="preserve"> Edit: set </w:t>
+              <w:t xml:space="preserve">Disaster &gt; Edit: set </w:t>
             </w:r>
             <w:r>
               <w:rPr>
@@ -9594,7 +9680,14 @@
                 <w:sz w:val="19"/>
                 <w:szCs w:val="19"/>
               </w:rPr>
-              <w:t xml:space="preserve"> to Ended. It leaves the signals, path and relief panels</w:t>
+              <w:t xml:space="preserve"> to Ended. It leaves the signals, path</w:t>
+            </w:r>
+            <w:r>
+              <w:rPr>
+                <w:sz w:val="19"/>
+                <w:szCs w:val="19"/>
+              </w:rPr>
+              <w:t xml:space="preserve"> and relief panels</w:t>
             </w:r>
           </w:p>
         </w:tc>
@@ -9722,7 +9815,14 @@
                 <w:sz w:val="19"/>
                 <w:szCs w:val="19"/>
               </w:rPr>
-              <w:t>Shelter Assignment &gt; + Add record. Leave Check Out empty while they stay; fill it in when they leave</w:t>
+              <w:t>Shelter Assignment &gt;</w:t>
+            </w:r>
+            <w:r>
+              <w:rPr>
+                <w:sz w:val="19"/>
+                <w:szCs w:val="19"/>
+              </w:rPr>
+              <w:t xml:space="preserve"> + Add record. Leave Check Out empty while they stay; fill it in when they leave</w:t>
             </w:r>
           </w:p>
         </w:tc>
@@ -9850,7 +9950,14 @@
                 <w:sz w:val="19"/>
                 <w:szCs w:val="19"/>
               </w:rPr>
-              <w:t xml:space="preserve">Disaster Area &gt; Edit the row of that disaster and area: </w:t>
+              <w:t>Disaster Area &gt;</w:t>
+            </w:r>
+            <w:r>
+              <w:rPr>
+                <w:sz w:val="19"/>
+                <w:szCs w:val="19"/>
+              </w:rPr>
+              <w:t xml:space="preserve"> Edit the row of that disaster and area: </w:t>
             </w:r>
             <w:r>
               <w:rPr>
@@ -9874,7 +9981,7 @@
       <w:pPr>
         <w:pStyle w:val="Heading2"/>
       </w:pPr>
-      <w:bookmarkStart w:id="18" w:name="_Toc243793744"/>
+      <w:bookmarkStart w:id="18" w:name="_Toc243797253"/>
       <w:r>
         <w:lastRenderedPageBreak/>
         <w:t>6.6 The original Live Report</w:t>
@@ -9980,7 +10087,7 @@
         <w:pStyle w:val="Heading1"/>
         <w:pageBreakBefore/>
       </w:pPr>
-      <w:bookmarkStart w:id="19" w:name="_Toc243793745"/>
+      <w:bookmarkStart w:id="19" w:name="_Toc243797254"/>
       <w:r>
         <w:lastRenderedPageBreak/>
         <w:t>7. Data Health</w:t>
@@ -10028,10 +10135,7 @@
         <w:spacing w:after="70" w:line="270" w:lineRule="auto"/>
       </w:pPr>
       <w:r>
-        <w:t>The banner tells you if all chec</w:t>
-      </w:r>
-      <w:r>
-        <w:t xml:space="preserve">ks passed. Every row is one check with a green </w:t>
+        <w:t xml:space="preserve">The banner tells you if all checks passed. Every row is one check with a green </w:t>
       </w:r>
       <w:r>
         <w:rPr>
@@ -10071,7 +10175,10 @@
         <w:t>Missing</w:t>
       </w:r>
       <w:r>
-        <w:t xml:space="preserve"> (orange) means information the live pages need is absent, for example an active disaster without a signal. </w:t>
+        <w:t xml:space="preserve"> (orange) means i</w:t>
+      </w:r>
+      <w:r>
+        <w:t xml:space="preserve">nformation the live pages need is absent, for example an active disaster without a signal. </w:t>
       </w:r>
       <w:r>
         <w:rPr>
@@ -10104,10 +10211,10 @@
         <w:t>Open ...</w:t>
       </w:r>
       <w:r>
-        <w:t xml:space="preserve"> to go to the </w:t>
-      </w:r>
-      <w:r>
-        <w:t>table, correct the records and reload the page.</w:t>
+        <w:t xml:space="preserve"> to go to the table, correct th</w:t>
+      </w:r>
+      <w:r>
+        <w:t>e records and reload the page.</w:t>
       </w:r>
     </w:p>
     <w:p>
@@ -10322,21 +10429,21 @@
                 <w:sz w:val="20"/>
                 <w:szCs w:val="20"/>
               </w:rPr>
-              <w:t>The 17 checks cover: stays and distributions at shelters that are not</w:t>
+              <w:t>The 17 checks cover: stays and distributions at shelters that are not part of the disa</w:t>
             </w:r>
             <w:r>
               <w:rPr>
                 <w:sz w:val="20"/>
                 <w:szCs w:val="20"/>
               </w:rPr>
-              <w:t xml:space="preserve"> part of the disaster, people in two shelters, shelters over capacity, relief given beyond the stock, recipients of the wrong disaster, damage in unaffected areas, active disasters without signal or area, families without a home area, missing coordinates, </w:t>
+              <w:t xml:space="preserve">ster, people in two shelters, shelters over capacity, relief given beyond the stock, recipients of the wrong disaster, damage in unaffected areas, active disasters without signal or area, families without a home area, missing coordinates, paths without an </w:t>
             </w:r>
             <w:r>
               <w:rPr>
                 <w:sz w:val="20"/>
                 <w:szCs w:val="20"/>
               </w:rPr>
-              <w:t>paths without an observed point, and three notes.</w:t>
+              <w:t>observed point, and three notes.</w:t>
             </w:r>
           </w:p>
         </w:tc>
@@ -10352,7 +10459,7 @@
         <w:pStyle w:val="Heading1"/>
         <w:pageBreakBefore/>
       </w:pPr>
-      <w:bookmarkStart w:id="20" w:name="_Toc243793746"/>
+      <w:bookmarkStart w:id="20" w:name="_Toc243797255"/>
       <w:r>
         <w:lastRenderedPageBreak/>
         <w:t>8. Disaster Report</w:t>
@@ -10443,10 +10550,10 @@
         <w:spacing w:after="70" w:line="270" w:lineRule="auto"/>
       </w:pPr>
       <w:r>
-        <w:t>Read the header: type, date, status (Active or Ended), the latest warning signal and the su</w:t>
-      </w:r>
-      <w:r>
-        <w:t>mmary cards (areas hit, families, people affected, people still in shelters, estimated loss, relief units given).</w:t>
+        <w:t xml:space="preserve">Read the header: type, date, status (Active or Ended), the latest warning signal and the summary </w:t>
+      </w:r>
+      <w:r>
+        <w:t>cards (areas hit, families, people affected, people still in shelters, estimated loss, relief units given).</w:t>
       </w:r>
     </w:p>
     <w:p>
@@ -10516,14 +10623,14 @@
           <w:b/>
           <w:bCs/>
         </w:rPr>
-        <w:t>Shelt</w:t>
+        <w:t>Shelters us</w:t>
       </w:r>
       <w:r>
         <w:rPr>
           <w:b/>
           <w:bCs/>
         </w:rPr>
-        <w:t>ers used</w:t>
+        <w:t>ed</w:t>
       </w:r>
       <w:r>
         <w:t xml:space="preserve">, </w:t>
@@ -10732,17 +10839,7 @@
           <w:sz w:val="18"/>
           <w:szCs w:val="18"/>
         </w:rPr>
-        <w:t>Disaster path poin</w:t>
-      </w:r>
-      <w:r>
-        <w:rPr>
-          <w:i/>
-          <w:iCs/>
-          <w:color w:val="5B6B77"/>
-          <w:sz w:val="18"/>
-          <w:szCs w:val="18"/>
-        </w:rPr>
-        <w:t>ts, relief coverage by home area and damage.</w:t>
+        <w:t>Disaster path points, relief coverage by home area and damage.</w:t>
       </w:r>
     </w:p>
     <w:p>
@@ -10827,7 +10924,7 @@
         <w:pStyle w:val="Heading1"/>
         <w:pageBreakBefore/>
       </w:pPr>
-      <w:bookmarkStart w:id="21" w:name="_Toc243793747"/>
+      <w:bookmarkStart w:id="21" w:name="_Toc243797256"/>
       <w:r>
         <w:lastRenderedPageBreak/>
         <w:t>9. Map</w:t>
@@ -10885,7 +10982,10 @@
         <w:t>red = Very High risk, orange = High, yellow = Medium, green = Low</w:t>
       </w:r>
       <w:r>
-        <w:t>. Shelter dots are green below 70% full, orange below 90% and red at 90% or more.</w:t>
+        <w:t xml:space="preserve">. Shelter dots are green below </w:t>
+      </w:r>
+      <w:r>
+        <w:t>70% full, orange below 90% and red at 90% or more.</w:t>
       </w:r>
     </w:p>
     <w:p>
@@ -10898,10 +10998,7 @@
         <w:spacing w:after="70" w:line="270" w:lineRule="auto"/>
       </w:pPr>
       <w:r>
-        <w:t>Click a circle or a dot for a pop-up with details (location, risk, number of d</w:t>
-      </w:r>
-      <w:r>
-        <w:t>isasters, estimated loss, people staying).</w:t>
+        <w:t>Click a circle or a dot for a pop-up with details (location, risk, number of disasters, estimated loss, people staying).</w:t>
       </w:r>
     </w:p>
     <w:p>
@@ -10914,7 +11011,10 @@
         <w:spacing w:after="70" w:line="270" w:lineRule="auto"/>
       </w:pPr>
       <w:r>
-        <w:t>The tables under the map list the coordinates of every area and the occupancy of every shelter. Coordinates are edited in the Area and Shelter tables.</w:t>
+        <w:t>The tables under the map list the coordinates of every area and the occupancy of eve</w:t>
+      </w:r>
+      <w:r>
+        <w:t>ry shelter. Coordinates are edited in the Area and Shelter tables.</w:t>
       </w:r>
     </w:p>
     <w:p>
@@ -10998,7 +11098,7 @@
         <w:pStyle w:val="Heading1"/>
         <w:pageBreakBefore/>
       </w:pPr>
-      <w:bookmarkStart w:id="22" w:name="_Toc243793748"/>
+      <w:bookmarkStart w:id="22" w:name="_Toc243797257"/>
       <w:r>
         <w:lastRenderedPageBreak/>
         <w:t>10. Search</w:t>
@@ -11010,17 +11110,14 @@
         <w:spacing w:after="120" w:line="276" w:lineRule="auto"/>
       </w:pPr>
       <w:r>
-        <w:t>There are tw</w:t>
-      </w:r>
-      <w:r>
-        <w:t>o ways to search: one box for everything, and a search inside each table.</w:t>
+        <w:t>There are two ways to search: one box for everything, and a search inside each table.</w:t>
       </w:r>
     </w:p>
     <w:p>
       <w:pPr>
         <w:pStyle w:val="Heading2"/>
       </w:pPr>
-      <w:bookmarkStart w:id="23" w:name="_Toc243793749"/>
+      <w:bookmarkStart w:id="23" w:name="_Toc243797258"/>
       <w:r>
         <w:t>10.1 Search everything</w:t>
       </w:r>
@@ -11036,7 +11133,10 @@
         <w:spacing w:after="70" w:line="270" w:lineRule="auto"/>
       </w:pPr>
       <w:r>
-        <w:t xml:space="preserve">Type a name, phone number, area, shelter, organisation or item in </w:t>
+        <w:t>Type a name, phone number, are</w:t>
+      </w:r>
+      <w:r>
+        <w:t xml:space="preserve">a, shelter, organisation or item in </w:t>
       </w:r>
       <w:r>
         <w:rPr>
@@ -11059,10 +11159,7 @@
         <w:spacing w:after="70" w:line="270" w:lineRule="auto"/>
       </w:pPr>
       <w:r>
-        <w:t>The result page lists every table that has a</w:t>
-      </w:r>
-      <w:r>
-        <w:t xml:space="preserve"> match with the number of matches and the first records.</w:t>
+        <w:t>The result page lists every table that has a match with the number of matches and the first records.</w:t>
       </w:r>
     </w:p>
     <w:p>
@@ -11161,14 +11258,24 @@
           <w:sz w:val="18"/>
           <w:szCs w:val="18"/>
         </w:rPr>
-        <w:t>Search results for "Dacope" across all tables.</w:t>
+        <w:t>S</w:t>
+      </w:r>
+      <w:r>
+        <w:rPr>
+          <w:i/>
+          <w:iCs/>
+          <w:color w:val="5B6B77"/>
+          <w:sz w:val="18"/>
+          <w:szCs w:val="18"/>
+        </w:rPr>
+        <w:t>earch results for "Dacope" across all tables.</w:t>
       </w:r>
     </w:p>
     <w:p>
       <w:pPr>
         <w:pStyle w:val="Heading2"/>
       </w:pPr>
-      <w:bookmarkStart w:id="24" w:name="_Toc243793750"/>
+      <w:bookmarkStart w:id="24" w:name="_Toc243797259"/>
       <w:r>
         <w:t>10.2 Search inside a table</w:t>
       </w:r>
@@ -11179,10 +11286,7 @@
         <w:spacing w:after="120" w:line="276" w:lineRule="auto"/>
       </w:pPr>
       <w:r>
-        <w:t>Every table page has its own search: choose a column (or</w:t>
-      </w:r>
-      <w:r>
-        <w:t xml:space="preserve"> "All columns"), start typing and suggestions appear as you type, like a dictionary. Press </w:t>
+        <w:t xml:space="preserve">Every table page has its own search: choose a column (or "All columns"), start typing and suggestions appear as you type, like a dictionary. Press </w:t>
       </w:r>
       <w:r>
         <w:rPr>
@@ -11286,7 +11390,7 @@
         <w:pStyle w:val="Heading1"/>
         <w:pageBreakBefore/>
       </w:pPr>
-      <w:bookmarkStart w:id="25" w:name="_Toc243793751"/>
+      <w:bookmarkStart w:id="25" w:name="_Toc243797260"/>
       <w:r>
         <w:lastRenderedPageBreak/>
         <w:t>11. Working with the tables</w:t>
@@ -11298,10 +11402,7 @@
         <w:spacing w:after="120" w:line="276" w:lineRule="auto"/>
       </w:pPr>
       <w:r>
-        <w:t>Every table of the datab</w:t>
-      </w:r>
-      <w:r>
-        <w:t xml:space="preserve">ase has a page, opened from the </w:t>
+        <w:t xml:space="preserve">Every table of the database has a page, opened from the </w:t>
       </w:r>
       <w:r>
         <w:rPr>
@@ -11321,14 +11422,17 @@
         <w:t>Relationship tables</w:t>
       </w:r>
       <w:r>
-        <w:t xml:space="preserve"> lists in the menu. They all work the same way, so learning one means knowing all 21.</w:t>
+        <w:t xml:space="preserve"> lists in the menu. They all work the same way, so learning </w:t>
+      </w:r>
+      <w:r>
+        <w:t>one means knowing all 21.</w:t>
       </w:r>
     </w:p>
     <w:p>
       <w:pPr>
         <w:pStyle w:val="Heading2"/>
       </w:pPr>
-      <w:bookmarkStart w:id="26" w:name="_Toc243793752"/>
+      <w:bookmarkStart w:id="26" w:name="_Toc243797261"/>
       <w:r>
         <w:t>11.1 View, sort and export</w:t>
       </w:r>
@@ -11606,12 +11710,9 @@
       <w:pPr>
         <w:pStyle w:val="Heading2"/>
       </w:pPr>
-      <w:bookmarkStart w:id="27" w:name="_Toc243793753"/>
-      <w:r>
-        <w:t>11.2</w:t>
-      </w:r>
-      <w:r>
-        <w:t xml:space="preserve"> Add a record</w:t>
+      <w:bookmarkStart w:id="27" w:name="_Toc243797262"/>
+      <w:r>
+        <w:t>11.2 Add a record</w:t>
       </w:r>
       <w:bookmarkEnd w:id="27"/>
     </w:p>
@@ -11650,7 +11751,14 @@
           <w:b/>
           <w:bCs/>
         </w:rPr>
-        <w:t>+ Add record</w:t>
+        <w:t>+ Add</w:t>
+      </w:r>
+      <w:r>
+        <w:rPr>
+          <w:b/>
+          <w:bCs/>
+        </w:rPr>
+        <w:t xml:space="preserve"> record</w:t>
       </w:r>
       <w:r>
         <w:t>.</w:t>
@@ -11699,10 +11807,7 @@
         <w:t>Alert Type</w:t>
       </w:r>
       <w:r>
-        <w:t xml:space="preserve"> (for example "Cy</w:t>
-      </w:r>
-      <w:r>
-        <w:t xml:space="preserve">clone Warning") and the </w:t>
+        <w:t xml:space="preserve"> (for example "Cyclone Warning") and the </w:t>
       </w:r>
       <w:r>
         <w:rPr>
@@ -11732,7 +11837,14 @@
           <w:b/>
           <w:bCs/>
         </w:rPr>
-        <w:t>Alert DateTime</w:t>
+        <w:t>Alert Dat</w:t>
+      </w:r>
+      <w:r>
+        <w:rPr>
+          <w:b/>
+          <w:bCs/>
+        </w:rPr>
+        <w:t>eTime</w:t>
       </w:r>
       <w:r>
         <w:t xml:space="preserve"> with the calendar and write the </w:t>
@@ -11768,10 +11880,7 @@
         <w:t>Save record</w:t>
       </w:r>
       <w:r>
-        <w:t>. You return to the list with a green message and the new record on top (sort by Alert ID</w:t>
-      </w:r>
-      <w:r>
-        <w:t>, descending).</w:t>
+        <w:t>. You return to the list with a green message and the new record on top (sort by Alert ID, descending).</w:t>
       </w:r>
     </w:p>
     <w:p>
@@ -11924,14 +12033,24 @@
           <w:sz w:val="18"/>
           <w:szCs w:val="18"/>
         </w:rPr>
-        <w:t>The new warning appears in the list.</w:t>
+        <w:t xml:space="preserve">The new warning appears </w:t>
+      </w:r>
+      <w:r>
+        <w:rPr>
+          <w:i/>
+          <w:iCs/>
+          <w:color w:val="5B6B77"/>
+          <w:sz w:val="18"/>
+          <w:szCs w:val="18"/>
+        </w:rPr>
+        <w:t>in the list.</w:t>
       </w:r>
     </w:p>
     <w:p>
       <w:pPr>
         <w:pStyle w:val="Heading2"/>
       </w:pPr>
-      <w:bookmarkStart w:id="28" w:name="_Toc243793754"/>
+      <w:bookmarkStart w:id="28" w:name="_Toc243797263"/>
       <w:r>
         <w:t>11.3 The system protects your data</w:t>
       </w:r>
@@ -11942,10 +12061,7 @@
         <w:spacing w:after="120" w:line="276" w:lineRule="auto"/>
       </w:pPr>
       <w:r>
-        <w:t>Some records are refused with a plain-language message and the form stays open with everything you typed,</w:t>
-      </w:r>
-      <w:r>
-        <w:t xml:space="preserve"> so you can correct it. Examples:</w:t>
+        <w:t>Some records are refused with a plain-language message and the form stays open with everything you typed, so you can correct it. Examples:</w:t>
       </w:r>
     </w:p>
     <w:p>
@@ -11978,7 +12094,10 @@
         <w:t>+ Add record</w:t>
       </w:r>
       <w:r>
-        <w:t xml:space="preserve">. Choose disaster 13, family 42 (3 people) and the full school shelter, then click </w:t>
+        <w:t>. Choose disaster 13, family 42</w:t>
+      </w:r>
+      <w:r>
+        <w:t xml:space="preserve"> (3 people) and the full school shelter, then click </w:t>
       </w:r>
       <w:r>
         <w:rPr>
@@ -12001,10 +12120,7 @@
         <w:spacing w:after="70" w:line="270" w:lineRule="auto"/>
       </w:pPr>
       <w:r>
-        <w:t>The shelter is full, so the system answers: "</w:t>
-      </w:r>
-      <w:r>
-        <w:t>The shelter would be over capacity: 16 staying now + 3 new &gt; 16 places."</w:t>
+        <w:t>The shelter is full, so the system answers: "The shelter would be over capacity: 16 staying now + 3 new &gt; 16 places."</w:t>
       </w:r>
     </w:p>
     <w:p>
@@ -12018,7 +12134,10 @@
       </w:pPr>
       <w:r>
         <w:lastRenderedPageBreak/>
-        <w:t>Choosing a shelter that is not used for the disaster gives: "That shelter is not used for this disaster. Add it in Disaster Shelter first."</w:t>
+        <w:t>Choosing a shelter that is not used for the disaster gives: "</w:t>
+      </w:r>
+      <w:r>
+        <w:t>That shelter is not used for this disaster. Add it in Disaster Shelter first."</w:t>
       </w:r>
     </w:p>
     <w:p>
@@ -12094,17 +12213,7 @@
           <w:sz w:val="18"/>
           <w:szCs w:val="18"/>
         </w:rPr>
-        <w:t>Checking a family into the ful</w:t>
-      </w:r>
-      <w:r>
-        <w:rPr>
-          <w:i/>
-          <w:iCs/>
-          <w:color w:val="5B6B77"/>
-          <w:sz w:val="18"/>
-          <w:szCs w:val="18"/>
-        </w:rPr>
-        <w:t>l school shelter.</w:t>
+        <w:t>Checking a family into the full school shelter.</w:t>
       </w:r>
     </w:p>
     <w:p>
@@ -12319,7 +12428,14 @@
                 <w:sz w:val="20"/>
                 <w:szCs w:val="20"/>
               </w:rPr>
-              <w:t>The messages above come from the application rules. The links between a disaster, its shelters, families, organisations and areas are also enforced inside MySQL by triggers, so the data stays correct even if someone changes it in phpMyAdmin.</w:t>
+              <w:t>The messages above come from the application rules. The links between a disaster, its shelters, families, organisations and areas are also enforced inside MySQL by triggers</w:t>
+            </w:r>
+            <w:r>
+              <w:rPr>
+                <w:sz w:val="20"/>
+                <w:szCs w:val="20"/>
+              </w:rPr>
+              <w:t>, so the data stays correct even if someone changes it in phpMyAdmin.</w:t>
             </w:r>
           </w:p>
         </w:tc>
@@ -12334,12 +12450,9 @@
       <w:pPr>
         <w:pStyle w:val="Heading2"/>
       </w:pPr>
-      <w:bookmarkStart w:id="29" w:name="_Toc243793755"/>
-      <w:r>
-        <w:t xml:space="preserve">11.4 Edit a </w:t>
-      </w:r>
-      <w:r>
-        <w:t>record</w:t>
+      <w:bookmarkStart w:id="29" w:name="_Toc243797264"/>
+      <w:r>
+        <w:t>11.4 Edit a record</w:t>
       </w:r>
       <w:bookmarkEnd w:id="29"/>
     </w:p>
@@ -12483,7 +12596,7 @@
       <w:pPr>
         <w:pStyle w:val="Heading2"/>
       </w:pPr>
-      <w:bookmarkStart w:id="30" w:name="_Toc243793756"/>
+      <w:bookmarkStart w:id="30" w:name="_Toc243797265"/>
       <w:r>
         <w:t>11.5 Delete a record safely</w:t>
       </w:r>
@@ -12532,10 +12645,10 @@
         <w:t>Other records depend on it</w:t>
       </w:r>
       <w:r>
-        <w:t>. It lists what the deletion would do: records that "will be deleted too", records that "will lose the link (field set empty)" and records that</w:t>
-      </w:r>
-      <w:r>
-        <w:t xml:space="preserve"> </w:t>
+        <w:t>. It lists</w:t>
+      </w:r>
+      <w:r>
+        <w:t xml:space="preserve"> what the deletion would do: records that "will be deleted too", records that "will lose the link (field set empty)" and records that </w:t>
       </w:r>
       <w:r>
         <w:rPr>
@@ -12568,7 +12681,10 @@
         <w:t>Yes, delete</w:t>
       </w:r>
       <w:r>
-        <w:t>. If something blocks it the button is disabled: remove or move the dependent records first.</w:t>
+        <w:t>. If something blocks it the button is disabled: remove or move</w:t>
+      </w:r>
+      <w:r>
+        <w:t xml:space="preserve"> the dependent records first.</w:t>
       </w:r>
     </w:p>
     <w:p>
@@ -12721,17 +12837,7 @@
           <w:sz w:val="18"/>
           <w:szCs w:val="18"/>
         </w:rPr>
-        <w:t>Deleting an area is bloc</w:t>
-      </w:r>
-      <w:r>
-        <w:rPr>
-          <w:i/>
-          <w:iCs/>
-          <w:color w:val="5B6B77"/>
-          <w:sz w:val="18"/>
-          <w:szCs w:val="18"/>
-        </w:rPr>
-        <w:t>ked because two shelters belong to it.</w:t>
+        <w:t>Deleting an area is blocked because two shelters belong to it.</w:t>
       </w:r>
     </w:p>
     <w:tbl>
@@ -12809,7 +12915,14 @@
                 <w:sz w:val="20"/>
                 <w:szCs w:val="20"/>
               </w:rPr>
-              <w:t>, because that removes its warnings, damage, path, links and stays at once. Editors do not see the Delete button on the Disaster table.</w:t>
+              <w:t>, because that removes its warnings,</w:t>
+            </w:r>
+            <w:r>
+              <w:rPr>
+                <w:sz w:val="20"/>
+                <w:szCs w:val="20"/>
+              </w:rPr>
+              <w:t xml:space="preserve"> damage, path, links and stays at once. Editors do not see the Delete button on the Disaster table.</w:t>
             </w:r>
           </w:p>
         </w:tc>
@@ -12824,7 +12937,7 @@
       <w:pPr>
         <w:pStyle w:val="Heading2"/>
       </w:pPr>
-      <w:bookmarkStart w:id="31" w:name="_Toc243793757"/>
+      <w:bookmarkStart w:id="31" w:name="_Toc243797266"/>
       <w:r>
         <w:t>11.6 The tables behind the live panels</w:t>
       </w:r>
@@ -13499,17 +13612,7 @@
           <w:sz w:val="18"/>
           <w:szCs w:val="18"/>
         </w:rPr>
-        <w:t>Disaster Area with the Relief Shortage flag (Paikgachha is flag</w:t>
-      </w:r>
-      <w:r>
-        <w:rPr>
-          <w:i/>
-          <w:iCs/>
-          <w:color w:val="5B6B77"/>
-          <w:sz w:val="18"/>
-          <w:szCs w:val="18"/>
-        </w:rPr>
-        <w:t>ged Yes).</w:t>
+        <w:t>Disaster Area with the Relief Shortage flag (Paikgachha is flagged Yes).</w:t>
       </w:r>
     </w:p>
     <w:p>
@@ -13517,7 +13620,7 @@
         <w:pStyle w:val="Heading1"/>
         <w:pageBreakBefore/>
       </w:pPr>
-      <w:bookmarkStart w:id="32" w:name="_Toc243793758"/>
+      <w:bookmarkStart w:id="32" w:name="_Toc243797267"/>
       <w:r>
         <w:lastRenderedPageBreak/>
         <w:t>12. Administration</w:t>
@@ -13528,7 +13631,7 @@
       <w:pPr>
         <w:pStyle w:val="Heading2"/>
       </w:pPr>
-      <w:bookmarkStart w:id="33" w:name="_Toc243793759"/>
+      <w:bookmarkStart w:id="33" w:name="_Toc243797268"/>
       <w:r>
         <w:t>12.1 Users (administrators only)</w:t>
       </w:r>
@@ -13554,7 +13657,10 @@
         <w:t>Users</w:t>
       </w:r>
       <w:r>
-        <w:t xml:space="preserve"> in the menu. The table lists every account with its role and status.</w:t>
+        <w:t xml:space="preserve"> in the menu. The table lists every accou</w:t>
+      </w:r>
+      <w:r>
+        <w:t>nt with its role and status.</w:t>
       </w:r>
     </w:p>
     <w:p>
@@ -13600,10 +13706,10 @@
         <w:spacing w:after="70" w:line="270" w:lineRule="auto"/>
       </w:pPr>
       <w:r>
-        <w:t>To change a rol</w:t>
-      </w:r>
-      <w:r>
-        <w:t>e pick a new role in the list of that row; it is saved at once. You cannot change your own role, which protects you from locking everybody out.</w:t>
+        <w:t>To change a role pick a new role in the list of that row; it is saved at once. You cannot change your own role, which protects yo</w:t>
+      </w:r>
+      <w:r>
+        <w:t>u from locking everybody out.</w:t>
       </w:r>
     </w:p>
     <w:p>
@@ -13639,10 +13745,7 @@
         <w:spacing w:after="70" w:line="270" w:lineRule="auto"/>
       </w:pPr>
       <w:r>
-        <w:t>To remove an accoun</w:t>
-      </w:r>
-      <w:r>
-        <w:t xml:space="preserve">t click </w:t>
+        <w:t xml:space="preserve">To remove an account click </w:t>
       </w:r>
       <w:r>
         <w:rPr>
@@ -13735,7 +13838,7 @@
       <w:pPr>
         <w:pStyle w:val="Heading2"/>
       </w:pPr>
-      <w:bookmarkStart w:id="34" w:name="_Toc243793760"/>
+      <w:bookmarkStart w:id="34" w:name="_Toc243797269"/>
       <w:r>
         <w:t>12.2 My account</w:t>
       </w:r>
@@ -13746,7 +13849,10 @@
         <w:spacing w:after="120" w:line="276" w:lineRule="auto"/>
       </w:pPr>
       <w:r>
-        <w:t>Every user can change their own password here (click your name at the top right).</w:t>
+        <w:t>Every user ca</w:t>
+      </w:r>
+      <w:r>
+        <w:t>n change their own password here (click your name at the top right).</w:t>
       </w:r>
     </w:p>
     <w:p>
@@ -13830,7 +13936,7 @@
       <w:pPr>
         <w:pStyle w:val="Heading2"/>
       </w:pPr>
-      <w:bookmarkStart w:id="35" w:name="_Toc243793761"/>
+      <w:bookmarkStart w:id="35" w:name="_Toc243797270"/>
       <w:r>
         <w:t>12.3 Audit Log</w:t>
       </w:r>
@@ -13841,10 +13947,7 @@
         <w:spacing w:after="120" w:line="276" w:lineRule="auto"/>
       </w:pPr>
       <w:r>
-        <w:t>The Audit Log re</w:t>
-      </w:r>
-      <w:r>
-        <w:t xml:space="preserve">cords </w:t>
+        <w:t xml:space="preserve">The Audit Log records </w:t>
       </w:r>
       <w:r>
         <w:rPr>
@@ -14014,7 +14117,7 @@
         <w:pStyle w:val="Heading1"/>
         <w:pageBreakBefore/>
       </w:pPr>
-      <w:bookmarkStart w:id="36" w:name="_Toc243793762"/>
+      <w:bookmarkStart w:id="36" w:name="_Toc243797271"/>
       <w:r>
         <w:lastRenderedPageBreak/>
         <w:t>13. Read-only users</w:t>
@@ -14036,10 +14139,10 @@
         <w:t>viewer</w:t>
       </w:r>
       <w:r>
-        <w:t xml:space="preserve"> role can look at everythi</w:t>
-      </w:r>
-      <w:r>
-        <w:t>ng and export, but cannot change data. The Add, Edit and Delete buttons are not shown, and trying to open an add form by address is refused with the message "Your account is read-only for this table." The Users page is not shown either.</w:t>
+        <w:t xml:space="preserve"> role can look at everything and export, but cannot change data. The Add, Edit and Delete buttons </w:t>
+      </w:r>
+      <w:r>
+        <w:t>are not shown, and trying to open an add form by address is refused with the message "Your account is read-only for this table." The Users page is not shown either.</w:t>
       </w:r>
     </w:p>
     <w:p>
@@ -14115,7 +14218,7 @@
           <w:sz w:val="18"/>
           <w:szCs w:val="18"/>
         </w:rPr>
-        <w:t>The Sh</w:t>
+        <w:t>The Shelter table as a viewer sees it: no Add record button and no Actions col</w:t>
       </w:r>
       <w:r>
         <w:rPr>
@@ -14125,7 +14228,7 @@
           <w:sz w:val="18"/>
           <w:szCs w:val="18"/>
         </w:rPr>
-        <w:t>elter table as a viewer sees it: no Add record button and no Actions column.</w:t>
+        <w:t>umn.</w:t>
       </w:r>
     </w:p>
     <w:p>
@@ -14210,7 +14313,7 @@
         <w:pStyle w:val="Heading1"/>
         <w:pageBreakBefore/>
       </w:pPr>
-      <w:bookmarkStart w:id="37" w:name="_Toc243793763"/>
+      <w:bookmarkStart w:id="37" w:name="_Toc243797272"/>
       <w:r>
         <w:lastRenderedPageBreak/>
         <w:t>14. Phone and tablet</w:t>
@@ -14222,10 +14325,10 @@
         <w:spacing w:after="120" w:line="276" w:lineRule="auto"/>
       </w:pPr>
       <w:r>
-        <w:t>All pages adapt to a narrow screen. The menu hides behind the three-line button at the top left, the c</w:t>
-      </w:r>
-      <w:r>
-        <w:t>ards stack in one column and wide tables scroll sideways inside their box instead of widening the page.</w:t>
+        <w:t>All pages adapt to a narrow screen. The menu hides behind the three-line button at the top left, the cards stack in one column and wide tables scroll sideways inside their bo</w:t>
+      </w:r>
+      <w:r>
+        <w:t>x instead of widening the page.</w:t>
       </w:r>
     </w:p>
     <w:p>
@@ -14238,10 +14341,7 @@
         <w:spacing w:after="70" w:line="270" w:lineRule="auto"/>
       </w:pPr>
       <w:r>
-        <w:t>Open the system address on the phone (use the computer's network address, for example http://192.168.0.10/disaster_and_relief_management/ when the phone</w:t>
-      </w:r>
-      <w:r>
-        <w:t xml:space="preserve"> is on the same network).</w:t>
+        <w:t>Open the system address on the phone (use the computer's network address, for example http://192.168.0.10/disaster_and_relief_management/ when the phone is on the same network).</w:t>
       </w:r>
     </w:p>
     <w:p>
@@ -14264,7 +14364,10 @@
         <w:t>three-line button</w:t>
       </w:r>
       <w:r>
-        <w:t xml:space="preserve"> to open the menu; tap a page.</w:t>
+        <w:t xml:space="preserve"> to open the menu; ta</w:t>
+      </w:r>
+      <w:r>
+        <w:t>p a page.</w:t>
       </w:r>
     </w:p>
     <w:tbl>
@@ -14472,7 +14575,7 @@
         <w:pStyle w:val="Heading1"/>
         <w:pageBreakBefore/>
       </w:pPr>
-      <w:bookmarkStart w:id="38" w:name="_Toc243793764"/>
+      <w:bookmarkStart w:id="38" w:name="_Toc243797273"/>
       <w:r>
         <w:lastRenderedPageBreak/>
         <w:t>15. Database design</w:t>
@@ -14483,7 +14586,7 @@
       <w:pPr>
         <w:pStyle w:val="Heading2"/>
       </w:pPr>
-      <w:bookmarkStart w:id="39" w:name="_Toc243793765"/>
+      <w:bookmarkStart w:id="39" w:name="_Toc243797274"/>
       <w:r>
         <w:t>15.1 Data model</w:t>
       </w:r>
@@ -14569,7 +14672,7 @@
       <w:pPr>
         <w:pStyle w:val="Heading2"/>
       </w:pPr>
-      <w:bookmarkStart w:id="40" w:name="_Toc243793766"/>
+      <w:bookmarkStart w:id="40" w:name="_Toc243797275"/>
       <w:r>
         <w:t>15.2 The 22 tables</w:t>
       </w:r>
@@ -16765,7 +16868,7 @@
       <w:pPr>
         <w:pStyle w:val="Heading2"/>
       </w:pPr>
-      <w:bookmarkStart w:id="41" w:name="_Toc243793767"/>
+      <w:bookmarkStart w:id="41" w:name="_Toc243797276"/>
       <w:r>
         <w:t>15.3 How the data stays correct</w:t>
       </w:r>
@@ -17267,7 +17370,7 @@
       <w:pPr>
         <w:pStyle w:val="Heading2"/>
       </w:pPr>
-      <w:bookmarkStart w:id="42" w:name="_Toc243793768"/>
+      <w:bookmarkStart w:id="42" w:name="_Toc243797277"/>
       <w:r>
         <w:lastRenderedPageBreak/>
         <w:t>15.4 How the Live Report gets its data</w:t>
@@ -17354,7 +17457,7 @@
       <w:pPr>
         <w:pStyle w:val="Heading2"/>
       </w:pPr>
-      <w:bookmarkStart w:id="43" w:name="_Toc243793769"/>
+      <w:bookmarkStart w:id="43" w:name="_Toc243797278"/>
       <w:r>
         <w:t>15.5 Design decisions (methodology)</w:t>
       </w:r>
@@ -17500,7 +17603,7 @@
         <w:pStyle w:val="Heading1"/>
         <w:pageBreakBefore/>
       </w:pPr>
-      <w:bookmarkStart w:id="44" w:name="_Toc243793770"/>
+      <w:bookmarkStart w:id="44" w:name="_Toc243797279"/>
       <w:r>
         <w:lastRenderedPageBreak/>
         <w:t>16. Security and quality checks</w:t>
@@ -17661,14 +17764,14 @@
                 <w:sz w:val="19"/>
                 <w:szCs w:val="19"/>
               </w:rPr>
-              <w:t xml:space="preserve">81 checks pass on both an upgraded and a fresh database, and with the </w:t>
-            </w:r>
-            <w:r>
-              <w:rPr>
-                <w:sz w:val="19"/>
-                <w:szCs w:val="19"/>
-              </w:rPr>
-              <w:t>limited MySQL user. They cover installation, constraints, the 7 trigger refusals, signal boundaries (3|4 and 7|8), the 80% relief rule, shelter space, path geometry, data health and role permissions</w:t>
+              <w:t>81 checks pass on an upgraded and on a fresh database, and with the li</w:t>
+            </w:r>
+            <w:r>
+              <w:rPr>
+                <w:sz w:val="19"/>
+                <w:szCs w:val="19"/>
+              </w:rPr>
+              <w:t>mited MySQL user: installation, constraints, the 7 trigger refusals, signal boundaries, the 80% relief rule, shelter space, path geometry, data health, permissions</w:t>
             </w:r>
           </w:p>
         </w:tc>
@@ -18187,7 +18290,7 @@
                 <w:sz w:val="19"/>
                 <w:szCs w:val="19"/>
               </w:rPr>
-              <w:t>Every page loaded in a real browser with the Content-Security-Policy active: no console errors; phone layout has no sideways scrolling</w:t>
+              <w:t>16 representative pages loaded in a real browser with the Content-Security-Policy active: no console errors (the other table pages were checked by script, not in a browser). Phone layout: no sideways scrolling on the pages tested</w:t>
             </w:r>
           </w:p>
         </w:tc>
@@ -18222,6 +18325,77 @@
                 <w:sz w:val="19"/>
                 <w:szCs w:val="19"/>
               </w:rPr>
+              <w:t>Two people at onc</w:t>
+            </w:r>
+            <w:r>
+              <w:rPr>
+                <w:sz w:val="19"/>
+                <w:szCs w:val="19"/>
+              </w:rPr>
+              <w:t>e</w:t>
+            </w:r>
+          </w:p>
+        </w:tc>
+        <w:tc>
+          <w:tcPr>
+            <w:tcW w:w="6906" w:type="dxa"/>
+            <w:tcBorders>
+              <w:top w:val="single" w:sz="4" w:space="0" w:color="D5DEE5"/>
+              <w:left w:val="single" w:sz="4" w:space="0" w:color="D5DEE5"/>
+              <w:bottom w:val="single" w:sz="4" w:space="0" w:color="D5DEE5"/>
+              <w:right w:val="single" w:sz="4" w:space="0" w:color="D5DEE5"/>
+            </w:tcBorders>
+            <w:shd w:val="clear" w:color="auto" w:fill="F4F8FA"/>
+            <w:tcMar>
+              <w:top w:w="70" w:type="dxa"/>
+              <w:left w:w="110" w:type="dxa"/>
+              <w:bottom w:w="70" w:type="dxa"/>
+              <w:right w:w="110" w:type="dxa"/>
+            </w:tcMar>
+          </w:tcPr>
+          <w:p>
+            <w:pPr>
+              <w:spacing w:after="30"/>
+            </w:pPr>
+            <w:r>
+              <w:rPr>
+                <w:sz w:val="19"/>
+                <w:szCs w:val="19"/>
+              </w:rPr>
+              <w:t>tests/concurrency.php: two processes save into the last places of a shelter at the same moment. Without the lock both are accepted; with the lock exactly one is</w:t>
+            </w:r>
+          </w:p>
+        </w:tc>
+      </w:tr>
+      <w:tr>
+        <w:trPr>
+          <w:cantSplit/>
+        </w:trPr>
+        <w:tc>
+          <w:tcPr>
+            <w:tcW w:w="3000" w:type="dxa"/>
+            <w:tcBorders>
+              <w:top w:val="single" w:sz="4" w:space="0" w:color="D5DEE5"/>
+              <w:left w:val="single" w:sz="4" w:space="0" w:color="D5DEE5"/>
+              <w:bottom w:val="single" w:sz="4" w:space="0" w:color="D5DEE5"/>
+              <w:right w:val="single" w:sz="4" w:space="0" w:color="D5DEE5"/>
+            </w:tcBorders>
+            <w:tcMar>
+              <w:top w:w="70" w:type="dxa"/>
+              <w:left w:w="110" w:type="dxa"/>
+              <w:bottom w:w="70" w:type="dxa"/>
+              <w:right w:w="110" w:type="dxa"/>
+            </w:tcMar>
+          </w:tcPr>
+          <w:p>
+            <w:pPr>
+              <w:spacing w:after="30"/>
+            </w:pPr>
+            <w:r>
+              <w:rPr>
+                <w:sz w:val="19"/>
+                <w:szCs w:val="19"/>
+              </w:rPr>
               <w:t>Upgrade</w:t>
             </w:r>
           </w:p>
@@ -18235,31 +18409,23 @@
               <w:bottom w:val="single" w:sz="4" w:space="0" w:color="D5DEE5"/>
               <w:right w:val="single" w:sz="4" w:space="0" w:color="D5DEE5"/>
             </w:tcBorders>
-            <w:shd w:val="clear" w:color="auto" w:fill="F4F8FA"/>
-            <w:tcMar>
-              <w:top w:w="70" w:type="dxa"/>
-              <w:left w:w="110" w:type="dxa"/>
-              <w:bottom w:w="70" w:type="dxa"/>
-              <w:right w:w="110" w:type="dxa"/>
-            </w:tcMar>
-          </w:tcPr>
-          <w:p>
-            <w:pPr>
-              <w:spacing w:after="30"/>
-            </w:pPr>
-            <w:r>
-              <w:rPr>
-                <w:sz w:val="19"/>
-                <w:szCs w:val="19"/>
-              </w:rPr>
-              <w:t>An old 20-table database upgraded in place and a fresh install give identical tables, data and triggers,</w:t>
-            </w:r>
-            <w:r>
-              <w:rPr>
-                <w:sz w:val="19"/>
-                <w:szCs w:val="19"/>
-              </w:rPr>
-              <w:t xml:space="preserve"> byte for byte; existing users and data are kept</w:t>
+            <w:tcMar>
+              <w:top w:w="70" w:type="dxa"/>
+              <w:left w:w="110" w:type="dxa"/>
+              <w:bottom w:w="70" w:type="dxa"/>
+              <w:right w:w="110" w:type="dxa"/>
+            </w:tcMar>
+          </w:tcPr>
+          <w:p>
+            <w:pPr>
+              <w:spacing w:after="30"/>
+            </w:pPr>
+            <w:r>
+              <w:rPr>
+                <w:sz w:val="19"/>
+                <w:szCs w:val="19"/>
+              </w:rPr>
+              <w:t>An old 20-table database upgraded in place and a fresh install give identical tables, data and triggers, byte for byte; existing users and data are kept</w:t>
             </w:r>
           </w:p>
         </w:tc>
@@ -18272,25 +18438,167 @@
     </w:p>
     <w:p>
       <w:pPr>
+        <w:pStyle w:val="Heading2"/>
+      </w:pPr>
+      <w:bookmarkStart w:id="45" w:name="_Toc243797280"/>
+      <w:r>
+        <w:t>16.1 Limits you should know</w:t>
+      </w:r>
+      <w:bookmarkEnd w:id="45"/>
+    </w:p>
+    <w:p>
+      <w:pPr>
+        <w:pStyle w:val="ListParagraph"/>
+        <w:numPr>
+          <w:ilvl w:val="0"/>
+          <w:numId w:val="2"/>
+        </w:numPr>
+        <w:spacing w:after="60" w:line="270" w:lineRule="auto"/>
+      </w:pPr>
+      <w:r>
+        <w:rPr>
+          <w:b/>
+          <w:bCs/>
+        </w:rPr>
+        <w:t>Path geometry is simplified.</w:t>
+      </w:r>
+      <w:r>
+        <w:t xml:space="preserve"> An area counts as "being crossed" when its c</w:t>
+      </w:r>
+      <w:r>
+        <w:t>entre point is inside the impact circle; real areas are shapes. The radii and the sample path are invented.</w:t>
+      </w:r>
+    </w:p>
+    <w:p>
+      <w:pPr>
+        <w:pStyle w:val="ListParagraph"/>
+        <w:numPr>
+          <w:ilvl w:val="0"/>
+          <w:numId w:val="2"/>
+        </w:numPr>
+        <w:spacing w:after="60" w:line="270" w:lineRule="auto"/>
+      </w:pPr>
+      <w:r>
+        <w:rPr>
+          <w:b/>
+          <w:bCs/>
+        </w:rPr>
+        <w:t>Relief status measures reach, not sufficiency.</w:t>
+      </w:r>
+      <w:r>
+        <w:t xml:space="preserve"> A family counts as having received relief if it got any distribution. "Relief units left" adds differ</w:t>
+      </w:r>
+      <w:r>
+        <w:t>ent units together.</w:t>
+      </w:r>
+    </w:p>
+    <w:p>
+      <w:pPr>
+        <w:pStyle w:val="ListParagraph"/>
+        <w:numPr>
+          <w:ilvl w:val="0"/>
+          <w:numId w:val="2"/>
+        </w:numPr>
+        <w:spacing w:after="60" w:line="270" w:lineRule="auto"/>
+      </w:pPr>
+      <w:r>
+        <w:rPr>
+          <w:b/>
+          <w:bCs/>
+        </w:rPr>
+        <w:t>Capacity and stock limits apply to saves made in the web pages</w:t>
+      </w:r>
+      <w:r>
+        <w:t xml:space="preserve"> (with locks, so two people cannot both pass). Changes made directly in SQL bypass them; the link rules are triggers and always apply, and Data Health reports any over-capaci</w:t>
+      </w:r>
+      <w:r>
+        <w:t>ty shelter.</w:t>
+      </w:r>
+    </w:p>
+    <w:p>
+      <w:pPr>
+        <w:pStyle w:val="ListParagraph"/>
+        <w:numPr>
+          <w:ilvl w:val="0"/>
+          <w:numId w:val="2"/>
+        </w:numPr>
+        <w:spacing w:after="60" w:line="270" w:lineRule="auto"/>
+      </w:pPr>
+      <w:r>
+        <w:rPr>
+          <w:b/>
+          <w:bCs/>
+        </w:rPr>
+        <w:t>Signals</w:t>
+      </w:r>
+      <w:r>
+        <w:t xml:space="preserve"> follow the 1-3 / 4-7 / 8-10 bands of the requirements, not an official warning scheme.</w:t>
+      </w:r>
+    </w:p>
+    <w:p>
+      <w:pPr>
+        <w:pStyle w:val="ListParagraph"/>
+        <w:numPr>
+          <w:ilvl w:val="0"/>
+          <w:numId w:val="2"/>
+        </w:numPr>
+        <w:spacing w:after="60" w:line="270" w:lineRule="auto"/>
+      </w:pPr>
+      <w:r>
+        <w:rPr>
+          <w:b/>
+          <w:bCs/>
+        </w:rPr>
+        <w:t>Map tiles</w:t>
+      </w:r>
+      <w:r>
+        <w:t xml:space="preserve"> need internet and a browser that sends a Referer. A privacy setting that blocks it (for example Brave Shields) can show "Access blocked" ti</w:t>
+      </w:r>
+      <w:r>
+        <w:t>les.</w:t>
+      </w:r>
+    </w:p>
+    <w:p>
+      <w:pPr>
+        <w:pStyle w:val="ListParagraph"/>
+        <w:numPr>
+          <w:ilvl w:val="0"/>
+          <w:numId w:val="2"/>
+        </w:numPr>
+        <w:spacing w:after="60" w:line="270" w:lineRule="auto"/>
+      </w:pPr>
+      <w:r>
+        <w:rPr>
+          <w:b/>
+          <w:bCs/>
+        </w:rPr>
+        <w:t>Plain HTTP on localhost.</w:t>
+      </w:r>
+      <w:r>
+        <w:t xml:space="preserve"> Use HTTPS beyond a lab PC. Apache and MySQL must be started again after the PC restarts (start_localhost.bat). All sample data is fictional.</w:t>
+      </w:r>
+    </w:p>
+    <w:p>
+      <w:pPr>
         <w:pStyle w:val="Heading1"/>
         <w:pageBreakBefore/>
       </w:pPr>
-      <w:bookmarkStart w:id="45" w:name="_Toc243793771"/>
+      <w:bookmarkStart w:id="46" w:name="_Toc243797281"/>
       <w:r>
         <w:lastRenderedPageBreak/>
         <w:t>17. Backup, upgrade and troubleshooting</w:t>
       </w:r>
-      <w:bookmarkEnd w:id="45"/>
+      <w:bookmarkEnd w:id="46"/>
     </w:p>
     <w:p>
       <w:pPr>
         <w:pStyle w:val="Heading2"/>
       </w:pPr>
-      <w:bookmarkStart w:id="46" w:name="_Toc243793772"/>
+      <w:bookmarkStart w:id="47" w:name="_Toc243797282"/>
       <w:r>
         <w:t>17.1 Back up the database</w:t>
       </w:r>
-      <w:bookmarkEnd w:id="46"/>
+      <w:bookmarkEnd w:id="47"/>
     </w:p>
     <w:p>
       <w:pPr>
@@ -18375,21 +18683,18 @@
       <w:pPr>
         <w:pStyle w:val="Heading2"/>
       </w:pPr>
-      <w:bookmarkStart w:id="47" w:name="_Toc243793773"/>
+      <w:bookmarkStart w:id="48" w:name="_Toc243797283"/>
       <w:r>
         <w:t>17.2 Upgrade from the earlier 20-table version</w:t>
       </w:r>
-      <w:bookmarkEnd w:id="47"/>
+      <w:bookmarkEnd w:id="48"/>
     </w:p>
     <w:p>
       <w:pPr>
         <w:spacing w:after="120" w:line="276" w:lineRule="auto"/>
       </w:pPr>
       <w:r>
-        <w:t>Just copy the new files over the old ones and open any page. The system detects t</w:t>
-      </w:r>
-      <w:r>
-        <w:t xml:space="preserve">he older database and upgrades it </w:t>
+        <w:t xml:space="preserve">Just copy the new files over the old ones and open any page. The system detects the older database and upgrades it </w:t>
       </w:r>
       <w:r>
         <w:rPr>
@@ -18399,39 +18704,42 @@
         <w:t>in place</w:t>
       </w:r>
       <w:r>
-        <w:t>: new columns, new tables, triggers and (only if the data is still the original sample) new sample rows. Your records and users are kept. For this one time the MySQL user in config.php must be allowed to change tab</w:t>
-      </w:r>
-      <w:r>
-        <w:t>les (root is fine).</w:t>
+        <w:t>: new columns, new tables, triggers and (only if the data is still the original sample</w:t>
+      </w:r>
+      <w:r>
+        <w:t>) new sample rows. Your records and users are kept. For this one time the MySQL user in config.php must be allowed to change tables (root is fine).</w:t>
       </w:r>
     </w:p>
     <w:p>
       <w:pPr>
         <w:pStyle w:val="Heading2"/>
       </w:pPr>
-      <w:bookmarkStart w:id="48" w:name="_Toc243793774"/>
+      <w:bookmarkStart w:id="49" w:name="_Toc243797284"/>
       <w:r>
         <w:t>17.3 Start again from scratch</w:t>
       </w:r>
-      <w:bookmarkEnd w:id="48"/>
+      <w:bookmarkEnd w:id="49"/>
     </w:p>
     <w:p>
       <w:pPr>
         <w:spacing w:after="120" w:line="276" w:lineRule="auto"/>
       </w:pPr>
       <w:r>
-        <w:t>Drop the database in phpMyAdmin and reload the page. A new database with the sample data is created and the first-run screen asks for a new administrator.</w:t>
+        <w:t>Drop the database in phpMyAdmin and reload the page. A new database with the s</w:t>
+      </w:r>
+      <w:r>
+        <w:t>ample data is created and the first-run screen asks for a new administrator.</w:t>
       </w:r>
     </w:p>
     <w:p>
       <w:pPr>
         <w:pStyle w:val="Heading2"/>
       </w:pPr>
-      <w:bookmarkStart w:id="49" w:name="_Toc243793775"/>
+      <w:bookmarkStart w:id="50" w:name="_Toc243797285"/>
       <w:r>
         <w:t>17.4 Common messages</w:t>
       </w:r>
-      <w:bookmarkEnd w:id="49"/>
+      <w:bookmarkEnd w:id="50"/>
     </w:p>
     <w:tbl>
       <w:tblPr>
@@ -18806,14 +19114,7 @@
                 <w:sz w:val="19"/>
                 <w:szCs w:val="19"/>
               </w:rPr>
-              <w:t>The map library could not b</w:t>
-            </w:r>
-            <w:r>
-              <w:rPr>
-                <w:sz w:val="19"/>
-                <w:szCs w:val="19"/>
-              </w:rPr>
-              <w:t>e loaded</w:t>
+              <w:t>The map library could not be loaded</w:t>
             </w:r>
           </w:p>
         </w:tc>
@@ -18842,7 +19143,14 @@
                 <w:sz w:val="19"/>
                 <w:szCs w:val="19"/>
               </w:rPr>
-              <w:t>No internet connection. Everything except the map tiles still works</w:t>
+              <w:t>No internet connection. Everything except the map tiles st</w:t>
+            </w:r>
+            <w:r>
+              <w:rPr>
+                <w:sz w:val="19"/>
+                <w:szCs w:val="19"/>
+              </w:rPr>
+              <w:t>ill works</w:t>
             </w:r>
           </w:p>
         </w:tc>
@@ -18923,12 +19231,12 @@
         <w:pStyle w:val="Heading1"/>
         <w:pageBreakBefore/>
       </w:pPr>
-      <w:bookmarkStart w:id="50" w:name="_Toc243793776"/>
+      <w:bookmarkStart w:id="51" w:name="_Toc243797286"/>
       <w:r>
         <w:lastRenderedPageBreak/>
         <w:t>Appendix A. Sample data</w:t>
       </w:r>
-      <w:bookmarkEnd w:id="50"/>
+      <w:bookmarkEnd w:id="51"/>
     </w:p>
     <w:p>
       <w:pPr>
@@ -19093,16 +19401,7 @@
                 <w:sz w:val="19"/>
                 <w:szCs w:val="19"/>
               </w:rPr>
-              <w:t>Act</w:t>
-            </w:r>
-            <w:r>
-              <w:rPr>
-                <w:b/>
-                <w:bCs/>
-                <w:sz w:val="19"/>
-                <w:szCs w:val="19"/>
-              </w:rPr>
-              <w:t>ive</w:t>
+              <w:t>Active</w:t>
             </w:r>
             <w:r>
               <w:rPr>
@@ -19174,7 +19473,14 @@
                 <w:sz w:val="19"/>
                 <w:szCs w:val="19"/>
               </w:rPr>
-              <w:t>Latest warning signal 10 (red). 11 path points (7 observed, 4 forecast) from the Bay of Bengal to north of Khulna; 17 families; one school shelter that is exactly full; relief shortages in Dacope, Mongla and (flagged by hand) Paikgachha</w:t>
+              <w:t>Latest warning signal 10 (red). 11 path points (7 observed, 4 forecast</w:t>
+            </w:r>
+            <w:r>
+              <w:rPr>
+                <w:sz w:val="19"/>
+                <w:szCs w:val="19"/>
+              </w:rPr>
+              <w:t>) from the Bay of Bengal to north of Khulna; 17 families; one school shelter that is exactly full; relief shortages in Dacope, Mongla and (flagged by hand) Paikgachha</w:t>
             </w:r>
           </w:p>
         </w:tc>
@@ -19317,11 +19623,11 @@
       <w:pPr>
         <w:pStyle w:val="Heading1"/>
       </w:pPr>
-      <w:bookmarkStart w:id="51" w:name="_Toc243793777"/>
+      <w:bookmarkStart w:id="52" w:name="_Toc243797287"/>
       <w:r>
         <w:t>Appendix B. Files of the project</w:t>
       </w:r>
-      <w:bookmarkEnd w:id="51"/>
+      <w:bookmarkEnd w:id="52"/>
     </w:p>
     <w:tbl>
       <w:tblPr>
@@ -20257,7 +20563,7 @@
         <w:sz w:val="18"/>
         <w:szCs w:val="18"/>
       </w:rPr>
-      <w:t>5</w:t>
+      <w:t>44</w:t>
     </w:r>
     <w:r>
       <w:rPr>
@@ -20363,10 +20669,10 @@
 <file path=word/numbering.xml><?xml version="1.0" encoding="utf-8"?>
 <w:numbering xmlns:wpc="http://schemas.microsoft.com/office/word/2010/wordprocessingCanvas" xmlns:mc="http://schemas.openxmlformats.org/markup-compatibility/2006" xmlns:o="urn:schemas-microsoft-com:office:office" xmlns:r="http://schemas.openxmlformats.org/officeDocument/2006/relationships" xmlns:m="http://schemas.openxmlformats.org/officeDocument/2006/math" xmlns:v="urn:schemas-microsoft-com:vml" xmlns:wp14="http://schemas.microsoft.com/office/word/2010/wordprocessingDrawing" xmlns:wp="http://schemas.openxmlformats.org/drawingml/2006/wordprocessingDrawing" xmlns:w10="urn:schemas-microsoft-com:office:word" xmlns:w="http://schemas.openxmlformats.org/wordprocessingml/2006/main" xmlns:w14="http://schemas.microsoft.com/office/word/2010/wordml" xmlns:wpg="http://schemas.microsoft.com/office/word/2010/wordprocessingGroup" xmlns:wpi="http://schemas.microsoft.com/office/word/2010/wordprocessingInk" xmlns:wne="http://schemas.microsoft.com/office/word/2006/wordml" xmlns:wps="http://schemas.microsoft.com/office/word/2010/wordprocessingShape" mc:Ignorable="w14 wp14">
   <w:abstractNum w:abstractNumId="0">
-    <w:nsid w:val="0D2E3DF0"/>
+    <w:nsid w:val="01A37734"/>
     <w:multiLevelType w:val="hybridMultilevel"/>
-    <w:tmpl w:val="A808E83C"/>
-    <w:lvl w:ilvl="0" w:tplc="F4249E90">
+    <w:tmpl w:val="BE929CAC"/>
+    <w:lvl w:ilvl="0" w:tplc="DAC2E11C">
       <w:start w:val="1"/>
       <w:numFmt w:val="decimal"/>
       <w:lvlText w:val="%1."/>
@@ -20380,52 +20686,52 @@
         <w:color w:val="0F6B8F"/>
       </w:rPr>
     </w:lvl>
-    <w:lvl w:ilvl="1" w:tplc="80D4AB3E">
+    <w:lvl w:ilvl="1" w:tplc="9F34F672">
       <w:numFmt w:val="decimal"/>
       <w:lvlText w:val=""/>
       <w:lvlJc w:val="left"/>
     </w:lvl>
-    <w:lvl w:ilvl="2" w:tplc="E1A069A6">
+    <w:lvl w:ilvl="2" w:tplc="FF5E8522">
       <w:numFmt w:val="decimal"/>
       <w:lvlText w:val=""/>
       <w:lvlJc w:val="left"/>
     </w:lvl>
-    <w:lvl w:ilvl="3" w:tplc="A3628BBC">
+    <w:lvl w:ilvl="3" w:tplc="D1962502">
       <w:numFmt w:val="decimal"/>
       <w:lvlText w:val=""/>
       <w:lvlJc w:val="left"/>
     </w:lvl>
-    <w:lvl w:ilvl="4" w:tplc="48763900">
+    <w:lvl w:ilvl="4" w:tplc="3564C6C0">
       <w:numFmt w:val="decimal"/>
       <w:lvlText w:val=""/>
       <w:lvlJc w:val="left"/>
     </w:lvl>
-    <w:lvl w:ilvl="5" w:tplc="14B01AB0">
+    <w:lvl w:ilvl="5" w:tplc="31A4C73A">
       <w:numFmt w:val="decimal"/>
       <w:lvlText w:val=""/>
       <w:lvlJc w:val="left"/>
     </w:lvl>
-    <w:lvl w:ilvl="6" w:tplc="3CA01E42">
+    <w:lvl w:ilvl="6" w:tplc="735C0E5E">
       <w:numFmt w:val="decimal"/>
       <w:lvlText w:val=""/>
       <w:lvlJc w:val="left"/>
     </w:lvl>
-    <w:lvl w:ilvl="7" w:tplc="46DE3262">
+    <w:lvl w:ilvl="7" w:tplc="8BCEF7AA">
       <w:numFmt w:val="decimal"/>
       <w:lvlText w:val=""/>
       <w:lvlJc w:val="left"/>
     </w:lvl>
-    <w:lvl w:ilvl="8" w:tplc="20084B56">
+    <w:lvl w:ilvl="8" w:tplc="F4F641A0">
       <w:numFmt w:val="decimal"/>
       <w:lvlText w:val=""/>
       <w:lvlJc w:val="left"/>
     </w:lvl>
   </w:abstractNum>
   <w:abstractNum w:abstractNumId="1">
-    <w:nsid w:val="0ED76E0D"/>
+    <w:nsid w:val="06AE7F85"/>
     <w:multiLevelType w:val="hybridMultilevel"/>
-    <w:tmpl w:val="8208D794"/>
-    <w:lvl w:ilvl="0" w:tplc="EA5C4C1C">
+    <w:tmpl w:val="ABA8E4FE"/>
+    <w:lvl w:ilvl="0" w:tplc="748215CE">
       <w:start w:val="1"/>
       <w:numFmt w:val="decimal"/>
       <w:lvlText w:val="%1."/>
@@ -20439,52 +20745,52 @@
         <w:color w:val="0F6B8F"/>
       </w:rPr>
     </w:lvl>
-    <w:lvl w:ilvl="1" w:tplc="319CB1B6">
+    <w:lvl w:ilvl="1" w:tplc="011E4E02">
       <w:numFmt w:val="decimal"/>
       <w:lvlText w:val=""/>
       <w:lvlJc w:val="left"/>
     </w:lvl>
-    <w:lvl w:ilvl="2" w:tplc="0EF04E0C">
+    <w:lvl w:ilvl="2" w:tplc="2FE6E9A0">
       <w:numFmt w:val="decimal"/>
       <w:lvlText w:val=""/>
       <w:lvlJc w:val="left"/>
     </w:lvl>
-    <w:lvl w:ilvl="3" w:tplc="72709F18">
+    <w:lvl w:ilvl="3" w:tplc="401E13CA">
       <w:numFmt w:val="decimal"/>
       <w:lvlText w:val=""/>
       <w:lvlJc w:val="left"/>
     </w:lvl>
-    <w:lvl w:ilvl="4" w:tplc="DB365EA0">
+    <w:lvl w:ilvl="4" w:tplc="8BE6A24E">
       <w:numFmt w:val="decimal"/>
       <w:lvlText w:val=""/>
       <w:lvlJc w:val="left"/>
     </w:lvl>
-    <w:lvl w:ilvl="5" w:tplc="9E604CD0">
+    <w:lvl w:ilvl="5" w:tplc="14101702">
       <w:numFmt w:val="decimal"/>
       <w:lvlText w:val=""/>
       <w:lvlJc w:val="left"/>
     </w:lvl>
-    <w:lvl w:ilvl="6" w:tplc="6104527A">
+    <w:lvl w:ilvl="6" w:tplc="131EAAF6">
       <w:numFmt w:val="decimal"/>
       <w:lvlText w:val=""/>
       <w:lvlJc w:val="left"/>
     </w:lvl>
-    <w:lvl w:ilvl="7" w:tplc="ACB8974C">
+    <w:lvl w:ilvl="7" w:tplc="3FE25256">
       <w:numFmt w:val="decimal"/>
       <w:lvlText w:val=""/>
       <w:lvlJc w:val="left"/>
     </w:lvl>
-    <w:lvl w:ilvl="8" w:tplc="BC3CEC3C">
+    <w:lvl w:ilvl="8" w:tplc="15A25732">
       <w:numFmt w:val="decimal"/>
       <w:lvlText w:val=""/>
       <w:lvlJc w:val="left"/>
     </w:lvl>
   </w:abstractNum>
   <w:abstractNum w:abstractNumId="2">
-    <w:nsid w:val="12B55DB5"/>
+    <w:nsid w:val="081E0A3A"/>
     <w:multiLevelType w:val="hybridMultilevel"/>
-    <w:tmpl w:val="75500E4A"/>
-    <w:lvl w:ilvl="0" w:tplc="B2526322">
+    <w:tmpl w:val="E362D4FE"/>
+    <w:lvl w:ilvl="0" w:tplc="BB4E2F68">
       <w:start w:val="1"/>
       <w:numFmt w:val="decimal"/>
       <w:lvlText w:val="%1."/>
@@ -20498,52 +20804,52 @@
         <w:color w:val="0F6B8F"/>
       </w:rPr>
     </w:lvl>
-    <w:lvl w:ilvl="1" w:tplc="69544CC2">
+    <w:lvl w:ilvl="1" w:tplc="317A76FA">
       <w:numFmt w:val="decimal"/>
       <w:lvlText w:val=""/>
       <w:lvlJc w:val="left"/>
     </w:lvl>
-    <w:lvl w:ilvl="2" w:tplc="3E1C1F2C">
+    <w:lvl w:ilvl="2" w:tplc="D0C4AAFE">
       <w:numFmt w:val="decimal"/>
       <w:lvlText w:val=""/>
       <w:lvlJc w:val="left"/>
     </w:lvl>
-    <w:lvl w:ilvl="3" w:tplc="4934B3B0">
+    <w:lvl w:ilvl="3" w:tplc="782C9EEE">
       <w:numFmt w:val="decimal"/>
       <w:lvlText w:val=""/>
       <w:lvlJc w:val="left"/>
     </w:lvl>
-    <w:lvl w:ilvl="4" w:tplc="1A82455E">
+    <w:lvl w:ilvl="4" w:tplc="AD705120">
       <w:numFmt w:val="decimal"/>
       <w:lvlText w:val=""/>
       <w:lvlJc w:val="left"/>
     </w:lvl>
-    <w:lvl w:ilvl="5" w:tplc="A8FC7488">
+    <w:lvl w:ilvl="5" w:tplc="A67EC99A">
       <w:numFmt w:val="decimal"/>
       <w:lvlText w:val=""/>
       <w:lvlJc w:val="left"/>
     </w:lvl>
-    <w:lvl w:ilvl="6" w:tplc="E9E803B8">
+    <w:lvl w:ilvl="6" w:tplc="D298B66E">
       <w:numFmt w:val="decimal"/>
       <w:lvlText w:val=""/>
       <w:lvlJc w:val="left"/>
     </w:lvl>
-    <w:lvl w:ilvl="7" w:tplc="1CE602A2">
+    <w:lvl w:ilvl="7" w:tplc="20F0F87C">
       <w:numFmt w:val="decimal"/>
       <w:lvlText w:val=""/>
       <w:lvlJc w:val="left"/>
     </w:lvl>
-    <w:lvl w:ilvl="8" w:tplc="484282BE">
+    <w:lvl w:ilvl="8" w:tplc="3A6C8A3E">
       <w:numFmt w:val="decimal"/>
       <w:lvlText w:val=""/>
       <w:lvlJc w:val="left"/>
     </w:lvl>
   </w:abstractNum>
   <w:abstractNum w:abstractNumId="3">
-    <w:nsid w:val="1BF40D86"/>
+    <w:nsid w:val="0C4D1CFB"/>
     <w:multiLevelType w:val="hybridMultilevel"/>
-    <w:tmpl w:val="E5F0DB3C"/>
-    <w:lvl w:ilvl="0" w:tplc="16C836F6">
+    <w:tmpl w:val="07C675E0"/>
+    <w:lvl w:ilvl="0" w:tplc="7C2AED20">
       <w:start w:val="1"/>
       <w:numFmt w:val="decimal"/>
       <w:lvlText w:val="%1."/>
@@ -20557,52 +20863,52 @@
         <w:color w:val="0F6B8F"/>
       </w:rPr>
     </w:lvl>
-    <w:lvl w:ilvl="1" w:tplc="07885E1C">
+    <w:lvl w:ilvl="1" w:tplc="693EF01C">
       <w:numFmt w:val="decimal"/>
       <w:lvlText w:val=""/>
       <w:lvlJc w:val="left"/>
     </w:lvl>
-    <w:lvl w:ilvl="2" w:tplc="BAF83E12">
+    <w:lvl w:ilvl="2" w:tplc="F3247630">
       <w:numFmt w:val="decimal"/>
       <w:lvlText w:val=""/>
       <w:lvlJc w:val="left"/>
     </w:lvl>
-    <w:lvl w:ilvl="3" w:tplc="C3ECE3E0">
+    <w:lvl w:ilvl="3" w:tplc="87507032">
       <w:numFmt w:val="decimal"/>
       <w:lvlText w:val=""/>
       <w:lvlJc w:val="left"/>
     </w:lvl>
-    <w:lvl w:ilvl="4" w:tplc="A2367642">
+    <w:lvl w:ilvl="4" w:tplc="CA804640">
       <w:numFmt w:val="decimal"/>
       <w:lvlText w:val=""/>
       <w:lvlJc w:val="left"/>
     </w:lvl>
-    <w:lvl w:ilvl="5" w:tplc="3E4E9AA0">
+    <w:lvl w:ilvl="5" w:tplc="91027E58">
       <w:numFmt w:val="decimal"/>
       <w:lvlText w:val=""/>
       <w:lvlJc w:val="left"/>
     </w:lvl>
-    <w:lvl w:ilvl="6" w:tplc="80583F28">
+    <w:lvl w:ilvl="6" w:tplc="5508753C">
       <w:numFmt w:val="decimal"/>
       <w:lvlText w:val=""/>
       <w:lvlJc w:val="left"/>
     </w:lvl>
-    <w:lvl w:ilvl="7" w:tplc="5E125BA4">
+    <w:lvl w:ilvl="7" w:tplc="DB04E0D4">
       <w:numFmt w:val="decimal"/>
       <w:lvlText w:val=""/>
       <w:lvlJc w:val="left"/>
     </w:lvl>
-    <w:lvl w:ilvl="8" w:tplc="F9CE0CF4">
+    <w:lvl w:ilvl="8" w:tplc="D21ADF82">
       <w:numFmt w:val="decimal"/>
       <w:lvlText w:val=""/>
       <w:lvlJc w:val="left"/>
     </w:lvl>
   </w:abstractNum>
   <w:abstractNum w:abstractNumId="4">
-    <w:nsid w:val="1DA9225B"/>
+    <w:nsid w:val="12335FC8"/>
     <w:multiLevelType w:val="hybridMultilevel"/>
-    <w:tmpl w:val="8C5ABD56"/>
-    <w:lvl w:ilvl="0" w:tplc="1ACEBFFE">
+    <w:tmpl w:val="6D98EB98"/>
+    <w:lvl w:ilvl="0" w:tplc="E3F269B0">
       <w:start w:val="1"/>
       <w:numFmt w:val="decimal"/>
       <w:lvlText w:val="%1."/>
@@ -20616,52 +20922,52 @@
         <w:color w:val="0F6B8F"/>
       </w:rPr>
     </w:lvl>
-    <w:lvl w:ilvl="1" w:tplc="ED36EE58">
+    <w:lvl w:ilvl="1" w:tplc="E0FA5C66">
       <w:numFmt w:val="decimal"/>
       <w:lvlText w:val=""/>
       <w:lvlJc w:val="left"/>
     </w:lvl>
-    <w:lvl w:ilvl="2" w:tplc="4EB875A2">
+    <w:lvl w:ilvl="2" w:tplc="2F900F38">
       <w:numFmt w:val="decimal"/>
       <w:lvlText w:val=""/>
       <w:lvlJc w:val="left"/>
     </w:lvl>
-    <w:lvl w:ilvl="3" w:tplc="589CD612">
+    <w:lvl w:ilvl="3" w:tplc="416AF6B4">
       <w:numFmt w:val="decimal"/>
       <w:lvlText w:val=""/>
       <w:lvlJc w:val="left"/>
     </w:lvl>
-    <w:lvl w:ilvl="4" w:tplc="017EB8D4">
+    <w:lvl w:ilvl="4" w:tplc="06868DA8">
       <w:numFmt w:val="decimal"/>
       <w:lvlText w:val=""/>
       <w:lvlJc w:val="left"/>
     </w:lvl>
-    <w:lvl w:ilvl="5" w:tplc="151083A6">
+    <w:lvl w:ilvl="5" w:tplc="110E85A2">
       <w:numFmt w:val="decimal"/>
       <w:lvlText w:val=""/>
       <w:lvlJc w:val="left"/>
     </w:lvl>
-    <w:lvl w:ilvl="6" w:tplc="FF18F730">
+    <w:lvl w:ilvl="6" w:tplc="10A4D3EC">
       <w:numFmt w:val="decimal"/>
       <w:lvlText w:val=""/>
       <w:lvlJc w:val="left"/>
     </w:lvl>
-    <w:lvl w:ilvl="7" w:tplc="B0E48FCC">
+    <w:lvl w:ilvl="7" w:tplc="BDC017C0">
       <w:numFmt w:val="decimal"/>
       <w:lvlText w:val=""/>
       <w:lvlJc w:val="left"/>
     </w:lvl>
-    <w:lvl w:ilvl="8" w:tplc="FB8259B2">
+    <w:lvl w:ilvl="8" w:tplc="9246057E">
       <w:numFmt w:val="decimal"/>
       <w:lvlText w:val=""/>
       <w:lvlJc w:val="left"/>
     </w:lvl>
   </w:abstractNum>
   <w:abstractNum w:abstractNumId="5">
-    <w:nsid w:val="22BA720F"/>
+    <w:nsid w:val="1AA27132"/>
     <w:multiLevelType w:val="hybridMultilevel"/>
-    <w:tmpl w:val="0896AD12"/>
-    <w:lvl w:ilvl="0" w:tplc="41FAA188">
+    <w:tmpl w:val="D3F629B6"/>
+    <w:lvl w:ilvl="0" w:tplc="9E1E9190">
       <w:start w:val="1"/>
       <w:numFmt w:val="decimal"/>
       <w:lvlText w:val="%1."/>
@@ -20675,52 +20981,52 @@
         <w:color w:val="0F6B8F"/>
       </w:rPr>
     </w:lvl>
-    <w:lvl w:ilvl="1" w:tplc="8EA03D76">
+    <w:lvl w:ilvl="1" w:tplc="D27C7D6A">
       <w:numFmt w:val="decimal"/>
       <w:lvlText w:val=""/>
       <w:lvlJc w:val="left"/>
     </w:lvl>
-    <w:lvl w:ilvl="2" w:tplc="3614EBEA">
+    <w:lvl w:ilvl="2" w:tplc="F1FCE2CE">
       <w:numFmt w:val="decimal"/>
       <w:lvlText w:val=""/>
       <w:lvlJc w:val="left"/>
     </w:lvl>
-    <w:lvl w:ilvl="3" w:tplc="004EE6F0">
+    <w:lvl w:ilvl="3" w:tplc="B1348E94">
       <w:numFmt w:val="decimal"/>
       <w:lvlText w:val=""/>
       <w:lvlJc w:val="left"/>
     </w:lvl>
-    <w:lvl w:ilvl="4" w:tplc="108AC5FC">
+    <w:lvl w:ilvl="4" w:tplc="665C768A">
       <w:numFmt w:val="decimal"/>
       <w:lvlText w:val=""/>
       <w:lvlJc w:val="left"/>
     </w:lvl>
-    <w:lvl w:ilvl="5" w:tplc="CA9C68FA">
+    <w:lvl w:ilvl="5" w:tplc="0D4C938C">
       <w:numFmt w:val="decimal"/>
       <w:lvlText w:val=""/>
       <w:lvlJc w:val="left"/>
     </w:lvl>
-    <w:lvl w:ilvl="6" w:tplc="ADB20F74">
+    <w:lvl w:ilvl="6" w:tplc="F16E90C4">
       <w:numFmt w:val="decimal"/>
       <w:lvlText w:val=""/>
       <w:lvlJc w:val="left"/>
     </w:lvl>
-    <w:lvl w:ilvl="7" w:tplc="5B94CE72">
+    <w:lvl w:ilvl="7" w:tplc="22CA23CE">
       <w:numFmt w:val="decimal"/>
       <w:lvlText w:val=""/>
       <w:lvlJc w:val="left"/>
     </w:lvl>
-    <w:lvl w:ilvl="8" w:tplc="6F9AD5BE">
+    <w:lvl w:ilvl="8" w:tplc="1A06981C">
       <w:numFmt w:val="decimal"/>
       <w:lvlText w:val=""/>
       <w:lvlJc w:val="left"/>
     </w:lvl>
   </w:abstractNum>
   <w:abstractNum w:abstractNumId="6">
-    <w:nsid w:val="24952C9A"/>
+    <w:nsid w:val="2CB8545B"/>
     <w:multiLevelType w:val="hybridMultilevel"/>
-    <w:tmpl w:val="9ED86F26"/>
-    <w:lvl w:ilvl="0" w:tplc="714CE6EE">
+    <w:tmpl w:val="CCB274C6"/>
+    <w:lvl w:ilvl="0" w:tplc="5E38279C">
       <w:start w:val="1"/>
       <w:numFmt w:val="decimal"/>
       <w:lvlText w:val="%1."/>
@@ -20734,52 +21040,52 @@
         <w:color w:val="0F6B8F"/>
       </w:rPr>
     </w:lvl>
-    <w:lvl w:ilvl="1" w:tplc="C7D60004">
+    <w:lvl w:ilvl="1" w:tplc="D57C7AE0">
       <w:numFmt w:val="decimal"/>
       <w:lvlText w:val=""/>
       <w:lvlJc w:val="left"/>
     </w:lvl>
-    <w:lvl w:ilvl="2" w:tplc="E92E0AD4">
+    <w:lvl w:ilvl="2" w:tplc="5EF4187A">
       <w:numFmt w:val="decimal"/>
       <w:lvlText w:val=""/>
       <w:lvlJc w:val="left"/>
     </w:lvl>
-    <w:lvl w:ilvl="3" w:tplc="B308B65A">
+    <w:lvl w:ilvl="3" w:tplc="77D48DEE">
       <w:numFmt w:val="decimal"/>
       <w:lvlText w:val=""/>
       <w:lvlJc w:val="left"/>
     </w:lvl>
-    <w:lvl w:ilvl="4" w:tplc="130CF3DC">
+    <w:lvl w:ilvl="4" w:tplc="5B205010">
       <w:numFmt w:val="decimal"/>
       <w:lvlText w:val=""/>
       <w:lvlJc w:val="left"/>
     </w:lvl>
-    <w:lvl w:ilvl="5" w:tplc="09BE2196">
+    <w:lvl w:ilvl="5" w:tplc="DCA67548">
       <w:numFmt w:val="decimal"/>
       <w:lvlText w:val=""/>
       <w:lvlJc w:val="left"/>
     </w:lvl>
-    <w:lvl w:ilvl="6" w:tplc="C41E258E">
+    <w:lvl w:ilvl="6" w:tplc="CF7EA660">
       <w:numFmt w:val="decimal"/>
       <w:lvlText w:val=""/>
       <w:lvlJc w:val="left"/>
     </w:lvl>
-    <w:lvl w:ilvl="7" w:tplc="41A0F7FC">
+    <w:lvl w:ilvl="7" w:tplc="2EE42B1A">
       <w:numFmt w:val="decimal"/>
       <w:lvlText w:val=""/>
       <w:lvlJc w:val="left"/>
     </w:lvl>
-    <w:lvl w:ilvl="8" w:tplc="09C8798A">
+    <w:lvl w:ilvl="8" w:tplc="EA44FA20">
       <w:numFmt w:val="decimal"/>
       <w:lvlText w:val=""/>
       <w:lvlJc w:val="left"/>
     </w:lvl>
   </w:abstractNum>
   <w:abstractNum w:abstractNumId="7">
-    <w:nsid w:val="2884172D"/>
+    <w:nsid w:val="35360B0D"/>
     <w:multiLevelType w:val="hybridMultilevel"/>
-    <w:tmpl w:val="BB400576"/>
-    <w:lvl w:ilvl="0" w:tplc="C470799C">
+    <w:tmpl w:val="337096DA"/>
+    <w:lvl w:ilvl="0" w:tplc="A4C23AAA">
       <w:start w:val="1"/>
       <w:numFmt w:val="decimal"/>
       <w:lvlText w:val="%1."/>
@@ -20793,52 +21099,52 @@
         <w:color w:val="0F6B8F"/>
       </w:rPr>
     </w:lvl>
-    <w:lvl w:ilvl="1" w:tplc="B9E86A40">
+    <w:lvl w:ilvl="1" w:tplc="122EAFE2">
       <w:numFmt w:val="decimal"/>
       <w:lvlText w:val=""/>
       <w:lvlJc w:val="left"/>
     </w:lvl>
-    <w:lvl w:ilvl="2" w:tplc="8BAA7C0E">
+    <w:lvl w:ilvl="2" w:tplc="1CA667A6">
       <w:numFmt w:val="decimal"/>
       <w:lvlText w:val=""/>
       <w:lvlJc w:val="left"/>
     </w:lvl>
-    <w:lvl w:ilvl="3" w:tplc="C9D6BB3C">
+    <w:lvl w:ilvl="3" w:tplc="BBE4C146">
       <w:numFmt w:val="decimal"/>
       <w:lvlText w:val=""/>
       <w:lvlJc w:val="left"/>
     </w:lvl>
-    <w:lvl w:ilvl="4" w:tplc="64B6F23C">
+    <w:lvl w:ilvl="4" w:tplc="1498485A">
       <w:numFmt w:val="decimal"/>
       <w:lvlText w:val=""/>
       <w:lvlJc w:val="left"/>
     </w:lvl>
-    <w:lvl w:ilvl="5" w:tplc="A8FC44CE">
+    <w:lvl w:ilvl="5" w:tplc="2452E570">
       <w:numFmt w:val="decimal"/>
       <w:lvlText w:val=""/>
       <w:lvlJc w:val="left"/>
     </w:lvl>
-    <w:lvl w:ilvl="6" w:tplc="FF3A0F56">
+    <w:lvl w:ilvl="6" w:tplc="A7922070">
       <w:numFmt w:val="decimal"/>
       <w:lvlText w:val=""/>
       <w:lvlJc w:val="left"/>
     </w:lvl>
-    <w:lvl w:ilvl="7" w:tplc="A36AAFCE">
+    <w:lvl w:ilvl="7" w:tplc="BDF6148C">
       <w:numFmt w:val="decimal"/>
       <w:lvlText w:val=""/>
       <w:lvlJc w:val="left"/>
     </w:lvl>
-    <w:lvl w:ilvl="8" w:tplc="E7F68DB6">
+    <w:lvl w:ilvl="8" w:tplc="9E026122">
       <w:numFmt w:val="decimal"/>
       <w:lvlText w:val=""/>
       <w:lvlJc w:val="left"/>
     </w:lvl>
   </w:abstractNum>
   <w:abstractNum w:abstractNumId="8">
-    <w:nsid w:val="2D93297A"/>
+    <w:nsid w:val="37EC27F4"/>
     <w:multiLevelType w:val="hybridMultilevel"/>
-    <w:tmpl w:val="C22C874C"/>
-    <w:lvl w:ilvl="0" w:tplc="1372733C">
+    <w:tmpl w:val="F0B29D52"/>
+    <w:lvl w:ilvl="0" w:tplc="C7D23672">
       <w:start w:val="1"/>
       <w:numFmt w:val="decimal"/>
       <w:lvlText w:val="%1."/>
@@ -20852,52 +21158,52 @@
         <w:color w:val="0F6B8F"/>
       </w:rPr>
     </w:lvl>
-    <w:lvl w:ilvl="1" w:tplc="5CA80A16">
+    <w:lvl w:ilvl="1" w:tplc="04245AC8">
       <w:numFmt w:val="decimal"/>
       <w:lvlText w:val=""/>
       <w:lvlJc w:val="left"/>
     </w:lvl>
-    <w:lvl w:ilvl="2" w:tplc="7348FE8C">
+    <w:lvl w:ilvl="2" w:tplc="04D2599E">
       <w:numFmt w:val="decimal"/>
       <w:lvlText w:val=""/>
       <w:lvlJc w:val="left"/>
     </w:lvl>
-    <w:lvl w:ilvl="3" w:tplc="EE4A1446">
+    <w:lvl w:ilvl="3" w:tplc="73422C46">
       <w:numFmt w:val="decimal"/>
       <w:lvlText w:val=""/>
       <w:lvlJc w:val="left"/>
     </w:lvl>
-    <w:lvl w:ilvl="4" w:tplc="224AB406">
+    <w:lvl w:ilvl="4" w:tplc="BCFA7DAA">
       <w:numFmt w:val="decimal"/>
       <w:lvlText w:val=""/>
       <w:lvlJc w:val="left"/>
     </w:lvl>
-    <w:lvl w:ilvl="5" w:tplc="C8F01BA6">
+    <w:lvl w:ilvl="5" w:tplc="873C6E58">
       <w:numFmt w:val="decimal"/>
       <w:lvlText w:val=""/>
       <w:lvlJc w:val="left"/>
     </w:lvl>
-    <w:lvl w:ilvl="6" w:tplc="33EEAD2E">
+    <w:lvl w:ilvl="6" w:tplc="9084A18E">
       <w:numFmt w:val="decimal"/>
       <w:lvlText w:val=""/>
       <w:lvlJc w:val="left"/>
     </w:lvl>
-    <w:lvl w:ilvl="7" w:tplc="6C16F2DE">
+    <w:lvl w:ilvl="7" w:tplc="3E083E68">
       <w:numFmt w:val="decimal"/>
       <w:lvlText w:val=""/>
       <w:lvlJc w:val="left"/>
     </w:lvl>
-    <w:lvl w:ilvl="8" w:tplc="AFC21172">
+    <w:lvl w:ilvl="8" w:tplc="64D6EA2A">
       <w:numFmt w:val="decimal"/>
       <w:lvlText w:val=""/>
       <w:lvlJc w:val="left"/>
     </w:lvl>
   </w:abstractNum>
   <w:abstractNum w:abstractNumId="9">
-    <w:nsid w:val="385F4DC5"/>
+    <w:nsid w:val="3BB41B56"/>
     <w:multiLevelType w:val="hybridMultilevel"/>
-    <w:tmpl w:val="771E438A"/>
-    <w:lvl w:ilvl="0" w:tplc="796475CE">
+    <w:tmpl w:val="B776D6DC"/>
+    <w:lvl w:ilvl="0" w:tplc="74EE318A">
       <w:start w:val="1"/>
       <w:numFmt w:val="decimal"/>
       <w:lvlText w:val="%1."/>
@@ -20911,52 +21217,138 @@
         <w:color w:val="0F6B8F"/>
       </w:rPr>
     </w:lvl>
-    <w:lvl w:ilvl="1" w:tplc="D5AE2682">
+    <w:lvl w:ilvl="1" w:tplc="083E7056">
       <w:numFmt w:val="decimal"/>
       <w:lvlText w:val=""/>
       <w:lvlJc w:val="left"/>
     </w:lvl>
-    <w:lvl w:ilvl="2" w:tplc="8C9CE906">
+    <w:lvl w:ilvl="2" w:tplc="FB8CE088">
       <w:numFmt w:val="decimal"/>
       <w:lvlText w:val=""/>
       <w:lvlJc w:val="left"/>
     </w:lvl>
-    <w:lvl w:ilvl="3" w:tplc="21FE8832">
+    <w:lvl w:ilvl="3" w:tplc="85662D76">
       <w:numFmt w:val="decimal"/>
       <w:lvlText w:val=""/>
       <w:lvlJc w:val="left"/>
     </w:lvl>
-    <w:lvl w:ilvl="4" w:tplc="79C6212E">
+    <w:lvl w:ilvl="4" w:tplc="89B4357A">
       <w:numFmt w:val="decimal"/>
       <w:lvlText w:val=""/>
       <w:lvlJc w:val="left"/>
     </w:lvl>
-    <w:lvl w:ilvl="5" w:tplc="5B764DB0">
+    <w:lvl w:ilvl="5" w:tplc="E40AE68E">
       <w:numFmt w:val="decimal"/>
       <w:lvlText w:val=""/>
       <w:lvlJc w:val="left"/>
     </w:lvl>
-    <w:lvl w:ilvl="6" w:tplc="A80EA196">
+    <w:lvl w:ilvl="6" w:tplc="8B025DC8">
       <w:numFmt w:val="decimal"/>
       <w:lvlText w:val=""/>
       <w:lvlJc w:val="left"/>
     </w:lvl>
-    <w:lvl w:ilvl="7" w:tplc="87E6FFD6">
+    <w:lvl w:ilvl="7" w:tplc="1E088B60">
       <w:numFmt w:val="decimal"/>
       <w:lvlText w:val=""/>
       <w:lvlJc w:val="left"/>
     </w:lvl>
-    <w:lvl w:ilvl="8" w:tplc="79482476">
+    <w:lvl w:ilvl="8" w:tplc="763E832C">
       <w:numFmt w:val="decimal"/>
       <w:lvlText w:val=""/>
       <w:lvlJc w:val="left"/>
     </w:lvl>
   </w:abstractNum>
   <w:abstractNum w:abstractNumId="10">
-    <w:nsid w:val="3D103CB2"/>
+    <w:nsid w:val="3BF27C52"/>
     <w:multiLevelType w:val="hybridMultilevel"/>
-    <w:tmpl w:val="6206E7DC"/>
-    <w:lvl w:ilvl="0" w:tplc="683E8530">
+    <w:tmpl w:val="6AE43A5E"/>
+    <w:lvl w:ilvl="0" w:tplc="8D7C3AAA" w:tentative="1">
+      <w:start w:val="1"/>
+      <w:numFmt w:val="bullet"/>
+      <w:lvlText w:val="●"/>
+      <w:lvlJc w:val="left"/>
+      <w:pPr>
+        <w:ind w:left="720" w:hanging="360"/>
+      </w:pPr>
+    </w:lvl>
+    <w:lvl w:ilvl="1" w:tplc="199AA39A" w:tentative="1">
+      <w:start w:val="1"/>
+      <w:numFmt w:val="bullet"/>
+      <w:lvlText w:val="○"/>
+      <w:lvlJc w:val="left"/>
+      <w:pPr>
+        <w:ind w:left="1440" w:hanging="360"/>
+      </w:pPr>
+    </w:lvl>
+    <w:lvl w:ilvl="2" w:tplc="E42C2A2E" w:tentative="1">
+      <w:start w:val="1"/>
+      <w:numFmt w:val="bullet"/>
+      <w:lvlText w:val="■"/>
+      <w:lvlJc w:val="left"/>
+      <w:pPr>
+        <w:ind w:left="2160" w:hanging="360"/>
+      </w:pPr>
+    </w:lvl>
+    <w:lvl w:ilvl="3" w:tplc="962CAAC6" w:tentative="1">
+      <w:start w:val="1"/>
+      <w:numFmt w:val="bullet"/>
+      <w:lvlText w:val="●"/>
+      <w:lvlJc w:val="left"/>
+      <w:pPr>
+        <w:ind w:left="2880" w:hanging="360"/>
+      </w:pPr>
+    </w:lvl>
+    <w:lvl w:ilvl="4" w:tplc="153298B0" w:tentative="1">
+      <w:start w:val="1"/>
+      <w:numFmt w:val="bullet"/>
+      <w:lvlText w:val="○"/>
+      <w:lvlJc w:val="left"/>
+      <w:pPr>
+        <w:ind w:left="3600" w:hanging="360"/>
+      </w:pPr>
+    </w:lvl>
+    <w:lvl w:ilvl="5" w:tplc="1EE499BC" w:tentative="1">
+      <w:start w:val="1"/>
+      <w:numFmt w:val="bullet"/>
+      <w:lvlText w:val="■"/>
+      <w:lvlJc w:val="left"/>
+      <w:pPr>
+        <w:ind w:left="4320" w:hanging="360"/>
+      </w:pPr>
+    </w:lvl>
+    <w:lvl w:ilvl="6" w:tplc="518028CC" w:tentative="1">
+      <w:start w:val="1"/>
+      <w:numFmt w:val="bullet"/>
+      <w:lvlText w:val="●"/>
+      <w:lvlJc w:val="left"/>
+      <w:pPr>
+        <w:ind w:left="5040" w:hanging="360"/>
+      </w:pPr>
+    </w:lvl>
+    <w:lvl w:ilvl="7" w:tplc="63308326" w:tentative="1">
+      <w:start w:val="1"/>
+      <w:numFmt w:val="bullet"/>
+      <w:lvlText w:val="●"/>
+      <w:lvlJc w:val="left"/>
+      <w:pPr>
+        <w:ind w:left="5760" w:hanging="360"/>
+      </w:pPr>
+    </w:lvl>
+    <w:lvl w:ilvl="8" w:tplc="ACACE760" w:tentative="1">
+      <w:start w:val="1"/>
+      <w:numFmt w:val="bullet"/>
+      <w:lvlText w:val="●"/>
+      <w:lvlJc w:val="left"/>
+      <w:pPr>
+        <w:ind w:left="6480" w:hanging="360"/>
+      </w:pPr>
+    </w:lvl>
+  </w:abstractNum>
+  <w:abstractNum w:abstractNumId="11">
+    <w:nsid w:val="42E16DDC"/>
+    <w:multiLevelType w:val="hybridMultilevel"/>
+    <w:tmpl w:val="AFAE2818"/>
+    <w:lvl w:ilvl="0" w:tplc="8EE465EE">
       <w:start w:val="1"/>
       <w:numFmt w:val="decimal"/>
       <w:lvlText w:val="%1."/>
@@ -20970,52 +21362,52 @@
         <w:color w:val="0F6B8F"/>
       </w:rPr>
     </w:lvl>
-    <w:lvl w:ilvl="1" w:tplc="FE34D736">
+    <w:lvl w:ilvl="1" w:tplc="B9A439BC">
       <w:numFmt w:val="decimal"/>
       <w:lvlText w:val=""/>
       <w:lvlJc w:val="left"/>
     </w:lvl>
-    <w:lvl w:ilvl="2" w:tplc="B8C04242">
+    <w:lvl w:ilvl="2" w:tplc="41DAAD08">
       <w:numFmt w:val="decimal"/>
       <w:lvlText w:val=""/>
       <w:lvlJc w:val="left"/>
     </w:lvl>
-    <w:lvl w:ilvl="3" w:tplc="635C21C2">
+    <w:lvl w:ilvl="3" w:tplc="855C85BE">
       <w:numFmt w:val="decimal"/>
       <w:lvlText w:val=""/>
       <w:lvlJc w:val="left"/>
     </w:lvl>
-    <w:lvl w:ilvl="4" w:tplc="6190338A">
+    <w:lvl w:ilvl="4" w:tplc="38825ED0">
       <w:numFmt w:val="decimal"/>
       <w:lvlText w:val=""/>
       <w:lvlJc w:val="left"/>
     </w:lvl>
-    <w:lvl w:ilvl="5" w:tplc="B6685CF8">
+    <w:lvl w:ilvl="5" w:tplc="D8B889B8">
       <w:numFmt w:val="decimal"/>
       <w:lvlText w:val=""/>
       <w:lvlJc w:val="left"/>
     </w:lvl>
-    <w:lvl w:ilvl="6" w:tplc="2244FD60">
+    <w:lvl w:ilvl="6" w:tplc="F94A25DE">
       <w:numFmt w:val="decimal"/>
       <w:lvlText w:val=""/>
       <w:lvlJc w:val="left"/>
     </w:lvl>
-    <w:lvl w:ilvl="7" w:tplc="E8603A8C">
+    <w:lvl w:ilvl="7" w:tplc="0D864722">
       <w:numFmt w:val="decimal"/>
       <w:lvlText w:val=""/>
       <w:lvlJc w:val="left"/>
     </w:lvl>
-    <w:lvl w:ilvl="8" w:tplc="9790FF72">
+    <w:lvl w:ilvl="8" w:tplc="49047058">
       <w:numFmt w:val="decimal"/>
       <w:lvlText w:val=""/>
       <w:lvlJc w:val="left"/>
     </w:lvl>
   </w:abstractNum>
-  <w:abstractNum w:abstractNumId="11">
-    <w:nsid w:val="3F1A0726"/>
+  <w:abstractNum w:abstractNumId="12">
+    <w:nsid w:val="476539E3"/>
     <w:multiLevelType w:val="hybridMultilevel"/>
-    <w:tmpl w:val="FA3EB494"/>
-    <w:lvl w:ilvl="0" w:tplc="3DEE3D92">
+    <w:tmpl w:val="DC205E38"/>
+    <w:lvl w:ilvl="0" w:tplc="E2CC6738">
       <w:start w:val="1"/>
       <w:numFmt w:val="decimal"/>
       <w:lvlText w:val="%1."/>
@@ -21029,52 +21421,52 @@
         <w:color w:val="0F6B8F"/>
       </w:rPr>
     </w:lvl>
-    <w:lvl w:ilvl="1" w:tplc="8924CB2E">
+    <w:lvl w:ilvl="1" w:tplc="259E7698">
       <w:numFmt w:val="decimal"/>
       <w:lvlText w:val=""/>
       <w:lvlJc w:val="left"/>
     </w:lvl>
-    <w:lvl w:ilvl="2" w:tplc="26F4CFDC">
+    <w:lvl w:ilvl="2" w:tplc="10CEFB44">
       <w:numFmt w:val="decimal"/>
       <w:lvlText w:val=""/>
       <w:lvlJc w:val="left"/>
     </w:lvl>
-    <w:lvl w:ilvl="3" w:tplc="B1F8FE88">
+    <w:lvl w:ilvl="3" w:tplc="F198FF90">
       <w:numFmt w:val="decimal"/>
       <w:lvlText w:val=""/>
       <w:lvlJc w:val="left"/>
     </w:lvl>
-    <w:lvl w:ilvl="4" w:tplc="636CA076">
+    <w:lvl w:ilvl="4" w:tplc="CDD26EF0">
       <w:numFmt w:val="decimal"/>
       <w:lvlText w:val=""/>
       <w:lvlJc w:val="left"/>
     </w:lvl>
-    <w:lvl w:ilvl="5" w:tplc="7B7CA1DA">
+    <w:lvl w:ilvl="5" w:tplc="80FCE070">
       <w:numFmt w:val="decimal"/>
       <w:lvlText w:val=""/>
       <w:lvlJc w:val="left"/>
     </w:lvl>
-    <w:lvl w:ilvl="6" w:tplc="BDDC2048">
+    <w:lvl w:ilvl="6" w:tplc="D6BECC8E">
       <w:numFmt w:val="decimal"/>
       <w:lvlText w:val=""/>
       <w:lvlJc w:val="left"/>
     </w:lvl>
-    <w:lvl w:ilvl="7" w:tplc="B0C29EE0">
+    <w:lvl w:ilvl="7" w:tplc="05C80B2A">
       <w:numFmt w:val="decimal"/>
       <w:lvlText w:val=""/>
       <w:lvlJc w:val="left"/>
     </w:lvl>
-    <w:lvl w:ilvl="8" w:tplc="97AE9A88">
+    <w:lvl w:ilvl="8" w:tplc="CBECA60E">
       <w:numFmt w:val="decimal"/>
       <w:lvlText w:val=""/>
       <w:lvlJc w:val="left"/>
     </w:lvl>
   </w:abstractNum>
-  <w:abstractNum w:abstractNumId="12">
-    <w:nsid w:val="40DF72D8"/>
+  <w:abstractNum w:abstractNumId="13">
+    <w:nsid w:val="48757C90"/>
     <w:multiLevelType w:val="hybridMultilevel"/>
-    <w:tmpl w:val="2C809BAE"/>
-    <w:lvl w:ilvl="0" w:tplc="CAC21DC2">
+    <w:tmpl w:val="CC06A05C"/>
+    <w:lvl w:ilvl="0" w:tplc="9114237A">
       <w:start w:val="1"/>
       <w:numFmt w:val="decimal"/>
       <w:lvlText w:val="%1."/>
@@ -21088,52 +21480,52 @@
         <w:color w:val="0F6B8F"/>
       </w:rPr>
     </w:lvl>
-    <w:lvl w:ilvl="1" w:tplc="163EA29E">
+    <w:lvl w:ilvl="1" w:tplc="7CDC783A">
       <w:numFmt w:val="decimal"/>
       <w:lvlText w:val=""/>
       <w:lvlJc w:val="left"/>
     </w:lvl>
-    <w:lvl w:ilvl="2" w:tplc="294E1A3E">
+    <w:lvl w:ilvl="2" w:tplc="AC3AC11C">
       <w:numFmt w:val="decimal"/>
       <w:lvlText w:val=""/>
       <w:lvlJc w:val="left"/>
     </w:lvl>
-    <w:lvl w:ilvl="3" w:tplc="3BF0F094">
+    <w:lvl w:ilvl="3" w:tplc="E9BC8C82">
       <w:numFmt w:val="decimal"/>
       <w:lvlText w:val=""/>
       <w:lvlJc w:val="left"/>
     </w:lvl>
-    <w:lvl w:ilvl="4" w:tplc="21EA7646">
+    <w:lvl w:ilvl="4" w:tplc="FA3C5E80">
       <w:numFmt w:val="decimal"/>
       <w:lvlText w:val=""/>
       <w:lvlJc w:val="left"/>
     </w:lvl>
-    <w:lvl w:ilvl="5" w:tplc="E3142BE6">
+    <w:lvl w:ilvl="5" w:tplc="EA1A968A">
       <w:numFmt w:val="decimal"/>
       <w:lvlText w:val=""/>
       <w:lvlJc w:val="left"/>
     </w:lvl>
-    <w:lvl w:ilvl="6" w:tplc="93FCB5E0">
+    <w:lvl w:ilvl="6" w:tplc="A178EE18">
       <w:numFmt w:val="decimal"/>
       <w:lvlText w:val=""/>
       <w:lvlJc w:val="left"/>
     </w:lvl>
-    <w:lvl w:ilvl="7" w:tplc="DD800912">
+    <w:lvl w:ilvl="7" w:tplc="900A59A4">
       <w:numFmt w:val="decimal"/>
       <w:lvlText w:val=""/>
       <w:lvlJc w:val="left"/>
     </w:lvl>
-    <w:lvl w:ilvl="8" w:tplc="31561C34">
+    <w:lvl w:ilvl="8" w:tplc="4C26B5CA">
       <w:numFmt w:val="decimal"/>
       <w:lvlText w:val=""/>
       <w:lvlJc w:val="left"/>
     </w:lvl>
   </w:abstractNum>
-  <w:abstractNum w:abstractNumId="13">
-    <w:nsid w:val="44C73BA8"/>
+  <w:abstractNum w:abstractNumId="14">
+    <w:nsid w:val="5D931497"/>
     <w:multiLevelType w:val="hybridMultilevel"/>
-    <w:tmpl w:val="A678EC60"/>
-    <w:lvl w:ilvl="0" w:tplc="C1E4C81A">
+    <w:tmpl w:val="0D2EF8AA"/>
+    <w:lvl w:ilvl="0" w:tplc="2FDEE44C">
       <w:start w:val="1"/>
       <w:numFmt w:val="decimal"/>
       <w:lvlText w:val="%1."/>
@@ -21147,52 +21539,52 @@
         <w:color w:val="0F6B8F"/>
       </w:rPr>
     </w:lvl>
-    <w:lvl w:ilvl="1" w:tplc="17768324">
+    <w:lvl w:ilvl="1" w:tplc="B9B27D98">
       <w:numFmt w:val="decimal"/>
       <w:lvlText w:val=""/>
       <w:lvlJc w:val="left"/>
     </w:lvl>
-    <w:lvl w:ilvl="2" w:tplc="5D38B2FC">
+    <w:lvl w:ilvl="2" w:tplc="ACB0579C">
       <w:numFmt w:val="decimal"/>
       <w:lvlText w:val=""/>
       <w:lvlJc w:val="left"/>
     </w:lvl>
-    <w:lvl w:ilvl="3" w:tplc="12247358">
+    <w:lvl w:ilvl="3" w:tplc="88B04490">
       <w:numFmt w:val="decimal"/>
       <w:lvlText w:val=""/>
       <w:lvlJc w:val="left"/>
     </w:lvl>
-    <w:lvl w:ilvl="4" w:tplc="7812E7A0">
+    <w:lvl w:ilvl="4" w:tplc="DABCDF4A">
       <w:numFmt w:val="decimal"/>
       <w:lvlText w:val=""/>
       <w:lvlJc w:val="left"/>
     </w:lvl>
-    <w:lvl w:ilvl="5" w:tplc="84065804">
+    <w:lvl w:ilvl="5" w:tplc="C07AAD00">
       <w:numFmt w:val="decimal"/>
       <w:lvlText w:val=""/>
       <w:lvlJc w:val="left"/>
     </w:lvl>
-    <w:lvl w:ilvl="6" w:tplc="0A861478">
+    <w:lvl w:ilvl="6" w:tplc="4A1A1466">
       <w:numFmt w:val="decimal"/>
       <w:lvlText w:val=""/>
       <w:lvlJc w:val="left"/>
     </w:lvl>
-    <w:lvl w:ilvl="7" w:tplc="A4BC2FD0">
+    <w:lvl w:ilvl="7" w:tplc="FD3C7E54">
       <w:numFmt w:val="decimal"/>
       <w:lvlText w:val=""/>
       <w:lvlJc w:val="left"/>
     </w:lvl>
-    <w:lvl w:ilvl="8" w:tplc="BFB8A586">
+    <w:lvl w:ilvl="8" w:tplc="B8BC902A">
       <w:numFmt w:val="decimal"/>
       <w:lvlText w:val=""/>
       <w:lvlJc w:val="left"/>
     </w:lvl>
   </w:abstractNum>
-  <w:abstractNum w:abstractNumId="14">
-    <w:nsid w:val="46F0260F"/>
+  <w:abstractNum w:abstractNumId="15">
+    <w:nsid w:val="64A44206"/>
     <w:multiLevelType w:val="hybridMultilevel"/>
-    <w:tmpl w:val="8410D33A"/>
-    <w:lvl w:ilvl="0" w:tplc="E3F277DA">
+    <w:tmpl w:val="42D8D8B6"/>
+    <w:lvl w:ilvl="0" w:tplc="7B863CCA">
       <w:start w:val="1"/>
       <w:numFmt w:val="decimal"/>
       <w:lvlText w:val="%1."/>
@@ -21206,52 +21598,52 @@
         <w:color w:val="0F6B8F"/>
       </w:rPr>
     </w:lvl>
-    <w:lvl w:ilvl="1" w:tplc="55FE4326">
+    <w:lvl w:ilvl="1" w:tplc="A4EECCB2">
       <w:numFmt w:val="decimal"/>
       <w:lvlText w:val=""/>
       <w:lvlJc w:val="left"/>
     </w:lvl>
-    <w:lvl w:ilvl="2" w:tplc="8C96DF36">
+    <w:lvl w:ilvl="2" w:tplc="5516AD56">
       <w:numFmt w:val="decimal"/>
       <w:lvlText w:val=""/>
       <w:lvlJc w:val="left"/>
     </w:lvl>
-    <w:lvl w:ilvl="3" w:tplc="BEA2FED2">
+    <w:lvl w:ilvl="3" w:tplc="55B8095E">
       <w:numFmt w:val="decimal"/>
       <w:lvlText w:val=""/>
       <w:lvlJc w:val="left"/>
     </w:lvl>
-    <w:lvl w:ilvl="4" w:tplc="7E5C2D5A">
+    <w:lvl w:ilvl="4" w:tplc="B24CA868">
       <w:numFmt w:val="decimal"/>
       <w:lvlText w:val=""/>
       <w:lvlJc w:val="left"/>
     </w:lvl>
-    <w:lvl w:ilvl="5" w:tplc="24C4D54A">
+    <w:lvl w:ilvl="5" w:tplc="0E60D0FC">
       <w:numFmt w:val="decimal"/>
       <w:lvlText w:val=""/>
       <w:lvlJc w:val="left"/>
     </w:lvl>
-    <w:lvl w:ilvl="6" w:tplc="F830E654">
+    <w:lvl w:ilvl="6" w:tplc="F8903794">
       <w:numFmt w:val="decimal"/>
       <w:lvlText w:val=""/>
       <w:lvlJc w:val="left"/>
     </w:lvl>
-    <w:lvl w:ilvl="7" w:tplc="B486088E">
+    <w:lvl w:ilvl="7" w:tplc="8E283BBC">
       <w:numFmt w:val="decimal"/>
       <w:lvlText w:val=""/>
       <w:lvlJc w:val="left"/>
     </w:lvl>
-    <w:lvl w:ilvl="8" w:tplc="A6163024">
+    <w:lvl w:ilvl="8" w:tplc="273C8AD4">
       <w:numFmt w:val="decimal"/>
       <w:lvlText w:val=""/>
       <w:lvlJc w:val="left"/>
     </w:lvl>
   </w:abstractNum>
-  <w:abstractNum w:abstractNumId="15">
-    <w:nsid w:val="4ABA185D"/>
+  <w:abstractNum w:abstractNumId="16">
+    <w:nsid w:val="68541E2A"/>
     <w:multiLevelType w:val="hybridMultilevel"/>
-    <w:tmpl w:val="B9DA71B6"/>
-    <w:lvl w:ilvl="0" w:tplc="CD024F92">
+    <w:tmpl w:val="F690BA1E"/>
+    <w:lvl w:ilvl="0" w:tplc="9CA60570">
       <w:start w:val="1"/>
       <w:numFmt w:val="decimal"/>
       <w:lvlText w:val="%1."/>
@@ -21265,52 +21657,106 @@
         <w:color w:val="0F6B8F"/>
       </w:rPr>
     </w:lvl>
-    <w:lvl w:ilvl="1" w:tplc="2B62D996">
+    <w:lvl w:ilvl="1" w:tplc="F78A299C">
       <w:numFmt w:val="decimal"/>
       <w:lvlText w:val=""/>
       <w:lvlJc w:val="left"/>
     </w:lvl>
-    <w:lvl w:ilvl="2" w:tplc="D1820534">
+    <w:lvl w:ilvl="2" w:tplc="BFBAD648">
       <w:numFmt w:val="decimal"/>
       <w:lvlText w:val=""/>
       <w:lvlJc w:val="left"/>
     </w:lvl>
-    <w:lvl w:ilvl="3" w:tplc="E930676C">
+    <w:lvl w:ilvl="3" w:tplc="21F88CAC">
       <w:numFmt w:val="decimal"/>
       <w:lvlText w:val=""/>
       <w:lvlJc w:val="left"/>
     </w:lvl>
-    <w:lvl w:ilvl="4" w:tplc="070E114A">
+    <w:lvl w:ilvl="4" w:tplc="1EECBF6A">
       <w:numFmt w:val="decimal"/>
       <w:lvlText w:val=""/>
       <w:lvlJc w:val="left"/>
     </w:lvl>
-    <w:lvl w:ilvl="5" w:tplc="A080CBAA">
+    <w:lvl w:ilvl="5" w:tplc="DE528042">
       <w:numFmt w:val="decimal"/>
       <w:lvlText w:val=""/>
       <w:lvlJc w:val="left"/>
     </w:lvl>
-    <w:lvl w:ilvl="6" w:tplc="EA28AE5E">
+    <w:lvl w:ilvl="6" w:tplc="D3EED244">
       <w:numFmt w:val="decimal"/>
       <w:lvlText w:val=""/>
       <w:lvlJc w:val="left"/>
     </w:lvl>
-    <w:lvl w:ilvl="7" w:tplc="BCA6A158">
+    <w:lvl w:ilvl="7" w:tplc="3238198C">
       <w:numFmt w:val="decimal"/>
       <w:lvlText w:val=""/>
       <w:lvlJc w:val="left"/>
     </w:lvl>
-    <w:lvl w:ilvl="8" w:tplc="4D16D9CE">
+    <w:lvl w:ilvl="8" w:tplc="9944764E">
       <w:numFmt w:val="decimal"/>
       <w:lvlText w:val=""/>
       <w:lvlJc w:val="left"/>
     </w:lvl>
   </w:abstractNum>
-  <w:abstractNum w:abstractNumId="16">
-    <w:nsid w:val="538967D8"/>
+  <w:abstractNum w:abstractNumId="17">
+    <w:nsid w:val="718C665C"/>
     <w:multiLevelType w:val="hybridMultilevel"/>
-    <w:tmpl w:val="5030B6A4"/>
-    <w:lvl w:ilvl="0" w:tplc="3A2C2496">
+    <w:tmpl w:val="4B66FB50"/>
+    <w:lvl w:ilvl="0" w:tplc="C4B297A4">
+      <w:start w:val="1"/>
+      <w:numFmt w:val="bullet"/>
+      <w:lvlText w:val="•"/>
+      <w:lvlJc w:val="left"/>
+      <w:pPr>
+        <w:ind w:left="540" w:hanging="270"/>
+      </w:pPr>
+    </w:lvl>
+    <w:lvl w:ilvl="1" w:tplc="EE6889A6">
+      <w:numFmt w:val="decimal"/>
+      <w:lvlText w:val=""/>
+      <w:lvlJc w:val="left"/>
+    </w:lvl>
+    <w:lvl w:ilvl="2" w:tplc="473C475A">
+      <w:numFmt w:val="decimal"/>
+      <w:lvlText w:val=""/>
+      <w:lvlJc w:val="left"/>
+    </w:lvl>
+    <w:lvl w:ilvl="3" w:tplc="CE00966A">
+      <w:numFmt w:val="decimal"/>
+      <w:lvlText w:val=""/>
+      <w:lvlJc w:val="left"/>
+    </w:lvl>
+    <w:lvl w:ilvl="4" w:tplc="049410DC">
+      <w:numFmt w:val="decimal"/>
+      <w:lvlText w:val=""/>
+      <w:lvlJc w:val="left"/>
+    </w:lvl>
+    <w:lvl w:ilvl="5" w:tplc="487C4D70">
+      <w:numFmt w:val="decimal"/>
+      <w:lvlText w:val=""/>
+      <w:lvlJc w:val="left"/>
+    </w:lvl>
+    <w:lvl w:ilvl="6" w:tplc="2E468C0C">
+      <w:numFmt w:val="decimal"/>
+      <w:lvlText w:val=""/>
+      <w:lvlJc w:val="left"/>
+    </w:lvl>
+    <w:lvl w:ilvl="7" w:tplc="2F961276">
+      <w:numFmt w:val="decimal"/>
+      <w:lvlText w:val=""/>
+      <w:lvlJc w:val="left"/>
+    </w:lvl>
+    <w:lvl w:ilvl="8" w:tplc="A20E6F72">
+      <w:numFmt w:val="decimal"/>
+      <w:lvlText w:val=""/>
+      <w:lvlJc w:val="left"/>
+    </w:lvl>
+  </w:abstractNum>
+  <w:abstractNum w:abstractNumId="18">
+    <w:nsid w:val="71B0416E"/>
+    <w:multiLevelType w:val="hybridMultilevel"/>
+    <w:tmpl w:val="A98E4C62"/>
+    <w:lvl w:ilvl="0" w:tplc="D50CA660">
       <w:start w:val="1"/>
       <w:numFmt w:val="decimal"/>
       <w:lvlText w:val="%1."/>
@@ -21324,52 +21770,52 @@
         <w:color w:val="0F6B8F"/>
       </w:rPr>
     </w:lvl>
-    <w:lvl w:ilvl="1" w:tplc="0A9666A4">
+    <w:lvl w:ilvl="1" w:tplc="5568EE60">
       <w:numFmt w:val="decimal"/>
       <w:lvlText w:val=""/>
       <w:lvlJc w:val="left"/>
     </w:lvl>
-    <w:lvl w:ilvl="2" w:tplc="3ED85EB4">
+    <w:lvl w:ilvl="2" w:tplc="6AB40A26">
       <w:numFmt w:val="decimal"/>
       <w:lvlText w:val=""/>
       <w:lvlJc w:val="left"/>
     </w:lvl>
-    <w:lvl w:ilvl="3" w:tplc="77044086">
+    <w:lvl w:ilvl="3" w:tplc="AD0419F4">
       <w:numFmt w:val="decimal"/>
       <w:lvlText w:val=""/>
       <w:lvlJc w:val="left"/>
     </w:lvl>
-    <w:lvl w:ilvl="4" w:tplc="D9A084D8">
+    <w:lvl w:ilvl="4" w:tplc="F3D25538">
       <w:numFmt w:val="decimal"/>
       <w:lvlText w:val=""/>
       <w:lvlJc w:val="left"/>
     </w:lvl>
-    <w:lvl w:ilvl="5" w:tplc="B84E171A">
+    <w:lvl w:ilvl="5" w:tplc="A6C0AFE8">
       <w:numFmt w:val="decimal"/>
       <w:lvlText w:val=""/>
       <w:lvlJc w:val="left"/>
     </w:lvl>
-    <w:lvl w:ilvl="6" w:tplc="C616D9C8">
+    <w:lvl w:ilvl="6" w:tplc="F6DCFA5A">
       <w:numFmt w:val="decimal"/>
       <w:lvlText w:val=""/>
       <w:lvlJc w:val="left"/>
     </w:lvl>
-    <w:lvl w:ilvl="7" w:tplc="470AA3FE">
+    <w:lvl w:ilvl="7" w:tplc="F56CC250">
       <w:numFmt w:val="decimal"/>
       <w:lvlText w:val=""/>
       <w:lvlJc w:val="left"/>
     </w:lvl>
-    <w:lvl w:ilvl="8" w:tplc="E0F81CAE">
+    <w:lvl w:ilvl="8" w:tplc="0136D72E">
       <w:numFmt w:val="decimal"/>
       <w:lvlText w:val=""/>
       <w:lvlJc w:val="left"/>
     </w:lvl>
   </w:abstractNum>
-  <w:abstractNum w:abstractNumId="17">
-    <w:nsid w:val="54156ABA"/>
+  <w:abstractNum w:abstractNumId="19">
+    <w:nsid w:val="72707CEE"/>
     <w:multiLevelType w:val="hybridMultilevel"/>
-    <w:tmpl w:val="652CAE4C"/>
-    <w:lvl w:ilvl="0" w:tplc="503ED62E">
+    <w:tmpl w:val="138C4E36"/>
+    <w:lvl w:ilvl="0" w:tplc="C10803F8">
       <w:start w:val="1"/>
       <w:numFmt w:val="decimal"/>
       <w:lvlText w:val="%1."/>
@@ -21383,52 +21829,52 @@
         <w:color w:val="0F6B8F"/>
       </w:rPr>
     </w:lvl>
-    <w:lvl w:ilvl="1" w:tplc="49D4B2AE">
+    <w:lvl w:ilvl="1" w:tplc="9B3CE8E4">
       <w:numFmt w:val="decimal"/>
       <w:lvlText w:val=""/>
       <w:lvlJc w:val="left"/>
     </w:lvl>
-    <w:lvl w:ilvl="2" w:tplc="64A6C448">
+    <w:lvl w:ilvl="2" w:tplc="2996B752">
       <w:numFmt w:val="decimal"/>
       <w:lvlText w:val=""/>
       <w:lvlJc w:val="left"/>
     </w:lvl>
-    <w:lvl w:ilvl="3" w:tplc="7D4AE588">
+    <w:lvl w:ilvl="3" w:tplc="40F8F988">
       <w:numFmt w:val="decimal"/>
       <w:lvlText w:val=""/>
       <w:lvlJc w:val="left"/>
     </w:lvl>
-    <w:lvl w:ilvl="4" w:tplc="1A22EFF2">
+    <w:lvl w:ilvl="4" w:tplc="7040AC58">
       <w:numFmt w:val="decimal"/>
       <w:lvlText w:val=""/>
       <w:lvlJc w:val="left"/>
     </w:lvl>
-    <w:lvl w:ilvl="5" w:tplc="AAA29992">
+    <w:lvl w:ilvl="5" w:tplc="4D66B854">
       <w:numFmt w:val="decimal"/>
       <w:lvlText w:val=""/>
       <w:lvlJc w:val="left"/>
     </w:lvl>
-    <w:lvl w:ilvl="6" w:tplc="26BC5978">
+    <w:lvl w:ilvl="6" w:tplc="1D1AE3FA">
       <w:numFmt w:val="decimal"/>
       <w:lvlText w:val=""/>
       <w:lvlJc w:val="left"/>
     </w:lvl>
-    <w:lvl w:ilvl="7" w:tplc="ACB2CE0A">
+    <w:lvl w:ilvl="7" w:tplc="AB0698B0">
       <w:numFmt w:val="decimal"/>
       <w:lvlText w:val=""/>
       <w:lvlJc w:val="left"/>
     </w:lvl>
-    <w:lvl w:ilvl="8" w:tplc="117C0B8A">
+    <w:lvl w:ilvl="8" w:tplc="4120C6EA">
       <w:numFmt w:val="decimal"/>
       <w:lvlText w:val=""/>
       <w:lvlJc w:val="left"/>
     </w:lvl>
   </w:abstractNum>
-  <w:abstractNum w:abstractNumId="18">
-    <w:nsid w:val="567D2FA7"/>
+  <w:abstractNum w:abstractNumId="20">
+    <w:nsid w:val="77430584"/>
     <w:multiLevelType w:val="hybridMultilevel"/>
-    <w:tmpl w:val="A378DDFC"/>
-    <w:lvl w:ilvl="0" w:tplc="A4EEA722">
+    <w:tmpl w:val="A538CC00"/>
+    <w:lvl w:ilvl="0" w:tplc="9DD8CE40">
       <w:start w:val="1"/>
       <w:numFmt w:val="decimal"/>
       <w:lvlText w:val="%1."/>
@@ -21442,192 +21888,52 @@
         <w:color w:val="0F6B8F"/>
       </w:rPr>
     </w:lvl>
-    <w:lvl w:ilvl="1" w:tplc="55DAE240">
+    <w:lvl w:ilvl="1" w:tplc="29143198">
       <w:numFmt w:val="decimal"/>
       <w:lvlText w:val=""/>
       <w:lvlJc w:val="left"/>
     </w:lvl>
-    <w:lvl w:ilvl="2" w:tplc="5478F5EC">
+    <w:lvl w:ilvl="2" w:tplc="02360F1E">
       <w:numFmt w:val="decimal"/>
       <w:lvlText w:val=""/>
       <w:lvlJc w:val="left"/>
     </w:lvl>
-    <w:lvl w:ilvl="3" w:tplc="203AB2DE">
+    <w:lvl w:ilvl="3" w:tplc="6F06D892">
       <w:numFmt w:val="decimal"/>
       <w:lvlText w:val=""/>
       <w:lvlJc w:val="left"/>
     </w:lvl>
-    <w:lvl w:ilvl="4" w:tplc="9B6C23AE">
+    <w:lvl w:ilvl="4" w:tplc="F03E0714">
       <w:numFmt w:val="decimal"/>
       <w:lvlText w:val=""/>
       <w:lvlJc w:val="left"/>
     </w:lvl>
-    <w:lvl w:ilvl="5" w:tplc="429CDC6C">
+    <w:lvl w:ilvl="5" w:tplc="F2041066">
       <w:numFmt w:val="decimal"/>
       <w:lvlText w:val=""/>
       <w:lvlJc w:val="left"/>
     </w:lvl>
-    <w:lvl w:ilvl="6" w:tplc="C39E3F2A">
+    <w:lvl w:ilvl="6" w:tplc="98B86DDA">
       <w:numFmt w:val="decimal"/>
       <w:lvlText w:val=""/>
       <w:lvlJc w:val="left"/>
     </w:lvl>
-    <w:lvl w:ilvl="7" w:tplc="A8FC49F6">
+    <w:lvl w:ilvl="7" w:tplc="AF4ED33E">
       <w:numFmt w:val="decimal"/>
       <w:lvlText w:val=""/>
       <w:lvlJc w:val="left"/>
     </w:lvl>
-    <w:lvl w:ilvl="8" w:tplc="BC64B75A">
+    <w:lvl w:ilvl="8" w:tplc="719CCAB0">
       <w:numFmt w:val="decimal"/>
       <w:lvlText w:val=""/>
       <w:lvlJc w:val="left"/>
     </w:lvl>
   </w:abstractNum>
-  <w:abstractNum w:abstractNumId="19">
-    <w:nsid w:val="5C9B6D99"/>
+  <w:abstractNum w:abstractNumId="21">
+    <w:nsid w:val="7EB0725E"/>
     <w:multiLevelType w:val="hybridMultilevel"/>
-    <w:tmpl w:val="87625EAC"/>
-    <w:lvl w:ilvl="0" w:tplc="73F85AC0">
-      <w:start w:val="1"/>
-      <w:numFmt w:val="bullet"/>
-      <w:lvlText w:val="•"/>
-      <w:lvlJc w:val="left"/>
-      <w:pPr>
-        <w:ind w:left="540" w:hanging="270"/>
-      </w:pPr>
-    </w:lvl>
-    <w:lvl w:ilvl="1" w:tplc="CB60999C">
-      <w:numFmt w:val="decimal"/>
-      <w:lvlText w:val=""/>
-      <w:lvlJc w:val="left"/>
-    </w:lvl>
-    <w:lvl w:ilvl="2" w:tplc="76925C36">
-      <w:numFmt w:val="decimal"/>
-      <w:lvlText w:val=""/>
-      <w:lvlJc w:val="left"/>
-    </w:lvl>
-    <w:lvl w:ilvl="3" w:tplc="F27C2A7E">
-      <w:numFmt w:val="decimal"/>
-      <w:lvlText w:val=""/>
-      <w:lvlJc w:val="left"/>
-    </w:lvl>
-    <w:lvl w:ilvl="4" w:tplc="94A61AF2">
-      <w:numFmt w:val="decimal"/>
-      <w:lvlText w:val=""/>
-      <w:lvlJc w:val="left"/>
-    </w:lvl>
-    <w:lvl w:ilvl="5" w:tplc="389880E2">
-      <w:numFmt w:val="decimal"/>
-      <w:lvlText w:val=""/>
-      <w:lvlJc w:val="left"/>
-    </w:lvl>
-    <w:lvl w:ilvl="6" w:tplc="C81EB6C2">
-      <w:numFmt w:val="decimal"/>
-      <w:lvlText w:val=""/>
-      <w:lvlJc w:val="left"/>
-    </w:lvl>
-    <w:lvl w:ilvl="7" w:tplc="CE82CF6A">
-      <w:numFmt w:val="decimal"/>
-      <w:lvlText w:val=""/>
-      <w:lvlJc w:val="left"/>
-    </w:lvl>
-    <w:lvl w:ilvl="8" w:tplc="8AF08D00">
-      <w:numFmt w:val="decimal"/>
-      <w:lvlText w:val=""/>
-      <w:lvlJc w:val="left"/>
-    </w:lvl>
-  </w:abstractNum>
-  <w:abstractNum w:abstractNumId="20">
-    <w:nsid w:val="5FBF70B0"/>
-    <w:multiLevelType w:val="hybridMultilevel"/>
-    <w:tmpl w:val="D05616CC"/>
-    <w:lvl w:ilvl="0" w:tplc="E200A022" w:tentative="1">
-      <w:start w:val="1"/>
-      <w:numFmt w:val="bullet"/>
-      <w:lvlText w:val="●"/>
-      <w:lvlJc w:val="left"/>
-      <w:pPr>
-        <w:ind w:left="720" w:hanging="360"/>
-      </w:pPr>
-    </w:lvl>
-    <w:lvl w:ilvl="1" w:tplc="D3E0CD42" w:tentative="1">
-      <w:start w:val="1"/>
-      <w:numFmt w:val="bullet"/>
-      <w:lvlText w:val="○"/>
-      <w:lvlJc w:val="left"/>
-      <w:pPr>
-        <w:ind w:left="1440" w:hanging="360"/>
-      </w:pPr>
-    </w:lvl>
-    <w:lvl w:ilvl="2" w:tplc="E830FFF0" w:tentative="1">
-      <w:start w:val="1"/>
-      <w:numFmt w:val="bullet"/>
-      <w:lvlText w:val="■"/>
-      <w:lvlJc w:val="left"/>
-      <w:pPr>
-        <w:ind w:left="2160" w:hanging="360"/>
-      </w:pPr>
-    </w:lvl>
-    <w:lvl w:ilvl="3" w:tplc="21B44E22" w:tentative="1">
-      <w:start w:val="1"/>
-      <w:numFmt w:val="bullet"/>
-      <w:lvlText w:val="●"/>
-      <w:lvlJc w:val="left"/>
-      <w:pPr>
-        <w:ind w:left="2880" w:hanging="360"/>
-      </w:pPr>
-    </w:lvl>
-    <w:lvl w:ilvl="4" w:tplc="050C1126" w:tentative="1">
-      <w:start w:val="1"/>
-      <w:numFmt w:val="bullet"/>
-      <w:lvlText w:val="○"/>
-      <w:lvlJc w:val="left"/>
-      <w:pPr>
-        <w:ind w:left="3600" w:hanging="360"/>
-      </w:pPr>
-    </w:lvl>
-    <w:lvl w:ilvl="5" w:tplc="1FF6625E" w:tentative="1">
-      <w:start w:val="1"/>
-      <w:numFmt w:val="bullet"/>
-      <w:lvlText w:val="■"/>
-      <w:lvlJc w:val="left"/>
-      <w:pPr>
-        <w:ind w:left="4320" w:hanging="360"/>
-      </w:pPr>
-    </w:lvl>
-    <w:lvl w:ilvl="6" w:tplc="3502E3BA" w:tentative="1">
-      <w:start w:val="1"/>
-      <w:numFmt w:val="bullet"/>
-      <w:lvlText w:val="●"/>
-      <w:lvlJc w:val="left"/>
-      <w:pPr>
-        <w:ind w:left="5040" w:hanging="360"/>
-      </w:pPr>
-    </w:lvl>
-    <w:lvl w:ilvl="7" w:tplc="1898F1D4" w:tentative="1">
-      <w:start w:val="1"/>
-      <w:numFmt w:val="bullet"/>
-      <w:lvlText w:val="●"/>
-      <w:lvlJc w:val="left"/>
-      <w:pPr>
-        <w:ind w:left="5760" w:hanging="360"/>
-      </w:pPr>
-    </w:lvl>
-    <w:lvl w:ilvl="8" w:tplc="03E0F146" w:tentative="1">
-      <w:start w:val="1"/>
-      <w:numFmt w:val="bullet"/>
-      <w:lvlText w:val="●"/>
-      <w:lvlJc w:val="left"/>
-      <w:pPr>
-        <w:ind w:left="6480" w:hanging="360"/>
-      </w:pPr>
-    </w:lvl>
-  </w:abstractNum>
-  <w:abstractNum w:abstractNumId="21">
-    <w:nsid w:val="6733661B"/>
-    <w:multiLevelType w:val="hybridMultilevel"/>
-    <w:tmpl w:val="B51EE714"/>
-    <w:lvl w:ilvl="0" w:tplc="75C48098">
+    <w:tmpl w:val="AE36EC20"/>
+    <w:lvl w:ilvl="0" w:tplc="3C54B0AA">
       <w:start w:val="1"/>
       <w:numFmt w:val="decimal"/>
       <w:lvlText w:val="%1."/>
@@ -21641,52 +21947,52 @@
         <w:color w:val="0F6B8F"/>
       </w:rPr>
     </w:lvl>
-    <w:lvl w:ilvl="1" w:tplc="B63CD1B8">
+    <w:lvl w:ilvl="1" w:tplc="D500FB1E">
       <w:numFmt w:val="decimal"/>
       <w:lvlText w:val=""/>
       <w:lvlJc w:val="left"/>
     </w:lvl>
-    <w:lvl w:ilvl="2" w:tplc="01A2E584">
+    <w:lvl w:ilvl="2" w:tplc="45425020">
       <w:numFmt w:val="decimal"/>
       <w:lvlText w:val=""/>
       <w:lvlJc w:val="left"/>
     </w:lvl>
-    <w:lvl w:ilvl="3" w:tplc="B7FE12A4">
+    <w:lvl w:ilvl="3" w:tplc="4A66946A">
       <w:numFmt w:val="decimal"/>
       <w:lvlText w:val=""/>
       <w:lvlJc w:val="left"/>
     </w:lvl>
-    <w:lvl w:ilvl="4" w:tplc="63B46F4C">
+    <w:lvl w:ilvl="4" w:tplc="137028DA">
       <w:numFmt w:val="decimal"/>
       <w:lvlText w:val=""/>
       <w:lvlJc w:val="left"/>
     </w:lvl>
-    <w:lvl w:ilvl="5" w:tplc="3FD89980">
+    <w:lvl w:ilvl="5" w:tplc="8B5CEA22">
       <w:numFmt w:val="decimal"/>
       <w:lvlText w:val=""/>
       <w:lvlJc w:val="left"/>
     </w:lvl>
-    <w:lvl w:ilvl="6" w:tplc="65A4D590">
+    <w:lvl w:ilvl="6" w:tplc="9B70B2C8">
       <w:numFmt w:val="decimal"/>
       <w:lvlText w:val=""/>
       <w:lvlJc w:val="left"/>
     </w:lvl>
-    <w:lvl w:ilvl="7" w:tplc="97204AE8">
+    <w:lvl w:ilvl="7" w:tplc="2E223E0E">
       <w:numFmt w:val="decimal"/>
       <w:lvlText w:val=""/>
       <w:lvlJc w:val="left"/>
     </w:lvl>
-    <w:lvl w:ilvl="8" w:tplc="395A7F8A">
+    <w:lvl w:ilvl="8" w:tplc="E9889416">
       <w:numFmt w:val="decimal"/>
       <w:lvlText w:val=""/>
       <w:lvlJc w:val="left"/>
     </w:lvl>
   </w:abstractNum>
   <w:abstractNum w:abstractNumId="22">
-    <w:nsid w:val="7B8D29E1"/>
+    <w:nsid w:val="7F292469"/>
     <w:multiLevelType w:val="hybridMultilevel"/>
-    <w:tmpl w:val="BA921E18"/>
-    <w:lvl w:ilvl="0" w:tplc="C08C3030">
+    <w:tmpl w:val="25F0D746"/>
+    <w:lvl w:ilvl="0" w:tplc="2E2A6B44">
       <w:start w:val="1"/>
       <w:numFmt w:val="decimal"/>
       <w:lvlText w:val="%1."/>
@@ -21700,181 +22006,181 @@
         <w:color w:val="0F6B8F"/>
       </w:rPr>
     </w:lvl>
-    <w:lvl w:ilvl="1" w:tplc="E88835D8">
+    <w:lvl w:ilvl="1" w:tplc="A8845CB2">
       <w:numFmt w:val="decimal"/>
       <w:lvlText w:val=""/>
       <w:lvlJc w:val="left"/>
     </w:lvl>
-    <w:lvl w:ilvl="2" w:tplc="2C52BA3C">
+    <w:lvl w:ilvl="2" w:tplc="7BDE8E42">
       <w:numFmt w:val="decimal"/>
       <w:lvlText w:val=""/>
       <w:lvlJc w:val="left"/>
     </w:lvl>
-    <w:lvl w:ilvl="3" w:tplc="00145AAE">
+    <w:lvl w:ilvl="3" w:tplc="EDE616A0">
       <w:numFmt w:val="decimal"/>
       <w:lvlText w:val=""/>
       <w:lvlJc w:val="left"/>
     </w:lvl>
-    <w:lvl w:ilvl="4" w:tplc="4AD0848C">
+    <w:lvl w:ilvl="4" w:tplc="4BFC914C">
       <w:numFmt w:val="decimal"/>
       <w:lvlText w:val=""/>
       <w:lvlJc w:val="left"/>
     </w:lvl>
-    <w:lvl w:ilvl="5" w:tplc="70002BD0">
+    <w:lvl w:ilvl="5" w:tplc="AAA04840">
       <w:numFmt w:val="decimal"/>
       <w:lvlText w:val=""/>
       <w:lvlJc w:val="left"/>
     </w:lvl>
-    <w:lvl w:ilvl="6" w:tplc="1C404AC0">
+    <w:lvl w:ilvl="6" w:tplc="290645A2">
       <w:numFmt w:val="decimal"/>
       <w:lvlText w:val=""/>
       <w:lvlJc w:val="left"/>
     </w:lvl>
-    <w:lvl w:ilvl="7" w:tplc="07744272">
+    <w:lvl w:ilvl="7" w:tplc="CE8ECAB6">
       <w:numFmt w:val="decimal"/>
       <w:lvlText w:val=""/>
       <w:lvlJc w:val="left"/>
     </w:lvl>
-    <w:lvl w:ilvl="8" w:tplc="91248E16">
+    <w:lvl w:ilvl="8" w:tplc="2592A288">
       <w:numFmt w:val="decimal"/>
       <w:lvlText w:val=""/>
       <w:lvlJc w:val="left"/>
     </w:lvl>
   </w:abstractNum>
   <w:num w:numId="1">
+    <w:abstractNumId w:val="10"/>
+    <w:lvlOverride w:ilvl="0">
+      <w:startOverride w:val="1"/>
+    </w:lvlOverride>
+  </w:num>
+  <w:num w:numId="2">
+    <w:abstractNumId w:val="17"/>
+    <w:lvlOverride w:ilvl="0">
+      <w:startOverride w:val="1"/>
+    </w:lvlOverride>
+  </w:num>
+  <w:num w:numId="3">
+    <w:abstractNumId w:val="22"/>
+    <w:lvlOverride w:ilvl="0">
+      <w:startOverride w:val="1"/>
+    </w:lvlOverride>
+  </w:num>
+  <w:num w:numId="4">
+    <w:abstractNumId w:val="19"/>
+    <w:lvlOverride w:ilvl="0">
+      <w:startOverride w:val="1"/>
+    </w:lvlOverride>
+  </w:num>
+  <w:num w:numId="5">
+    <w:abstractNumId w:val="13"/>
+    <w:lvlOverride w:ilvl="0">
+      <w:startOverride w:val="1"/>
+    </w:lvlOverride>
+  </w:num>
+  <w:num w:numId="6">
+    <w:abstractNumId w:val="12"/>
+    <w:lvlOverride w:ilvl="0">
+      <w:startOverride w:val="1"/>
+    </w:lvlOverride>
+  </w:num>
+  <w:num w:numId="7">
+    <w:abstractNumId w:val="21"/>
+    <w:lvlOverride w:ilvl="0">
+      <w:startOverride w:val="1"/>
+    </w:lvlOverride>
+  </w:num>
+  <w:num w:numId="8">
+    <w:abstractNumId w:val="14"/>
+    <w:lvlOverride w:ilvl="0">
+      <w:startOverride w:val="1"/>
+    </w:lvlOverride>
+  </w:num>
+  <w:num w:numId="9">
+    <w:abstractNumId w:val="5"/>
+    <w:lvlOverride w:ilvl="0">
+      <w:startOverride w:val="1"/>
+    </w:lvlOverride>
+  </w:num>
+  <w:num w:numId="10">
+    <w:abstractNumId w:val="3"/>
+    <w:lvlOverride w:ilvl="0">
+      <w:startOverride w:val="1"/>
+    </w:lvlOverride>
+  </w:num>
+  <w:num w:numId="11">
+    <w:abstractNumId w:val="4"/>
+    <w:lvlOverride w:ilvl="0">
+      <w:startOverride w:val="1"/>
+    </w:lvlOverride>
+  </w:num>
+  <w:num w:numId="12">
     <w:abstractNumId w:val="20"/>
     <w:lvlOverride w:ilvl="0">
       <w:startOverride w:val="1"/>
     </w:lvlOverride>
   </w:num>
-  <w:num w:numId="2">
-    <w:abstractNumId w:val="19"/>
+  <w:num w:numId="13">
+    <w:abstractNumId w:val="8"/>
     <w:lvlOverride w:ilvl="0">
       <w:startOverride w:val="1"/>
     </w:lvlOverride>
   </w:num>
-  <w:num w:numId="3">
+  <w:num w:numId="14">
+    <w:abstractNumId w:val="2"/>
+    <w:lvlOverride w:ilvl="0">
+      <w:startOverride w:val="1"/>
+    </w:lvlOverride>
+  </w:num>
+  <w:num w:numId="15">
     <w:abstractNumId w:val="18"/>
     <w:lvlOverride w:ilvl="0">
       <w:startOverride w:val="1"/>
     </w:lvlOverride>
   </w:num>
-  <w:num w:numId="4">
+  <w:num w:numId="16">
+    <w:abstractNumId w:val="9"/>
+    <w:lvlOverride w:ilvl="0">
+      <w:startOverride w:val="1"/>
+    </w:lvlOverride>
+  </w:num>
+  <w:num w:numId="17">
+    <w:abstractNumId w:val="15"/>
+    <w:lvlOverride w:ilvl="0">
+      <w:startOverride w:val="1"/>
+    </w:lvlOverride>
+  </w:num>
+  <w:num w:numId="18">
+    <w:abstractNumId w:val="11"/>
+    <w:lvlOverride w:ilvl="0">
+      <w:startOverride w:val="1"/>
+    </w:lvlOverride>
+  </w:num>
+  <w:num w:numId="19">
+    <w:abstractNumId w:val="6"/>
+    <w:lvlOverride w:ilvl="0">
+      <w:startOverride w:val="1"/>
+    </w:lvlOverride>
+  </w:num>
+  <w:num w:numId="20">
+    <w:abstractNumId w:val="7"/>
+    <w:lvlOverride w:ilvl="0">
+      <w:startOverride w:val="1"/>
+    </w:lvlOverride>
+  </w:num>
+  <w:num w:numId="21">
     <w:abstractNumId w:val="16"/>
     <w:lvlOverride w:ilvl="0">
       <w:startOverride w:val="1"/>
     </w:lvlOverride>
   </w:num>
-  <w:num w:numId="5">
-    <w:abstractNumId w:val="15"/>
-    <w:lvlOverride w:ilvl="0">
-      <w:startOverride w:val="1"/>
-    </w:lvlOverride>
-  </w:num>
-  <w:num w:numId="6">
-    <w:abstractNumId w:val="8"/>
-    <w:lvlOverride w:ilvl="0">
-      <w:startOverride w:val="1"/>
-    </w:lvlOverride>
-  </w:num>
-  <w:num w:numId="7">
-    <w:abstractNumId w:val="12"/>
-    <w:lvlOverride w:ilvl="0">
-      <w:startOverride w:val="1"/>
-    </w:lvlOverride>
-  </w:num>
-  <w:num w:numId="8">
-    <w:abstractNumId w:val="10"/>
-    <w:lvlOverride w:ilvl="0">
-      <w:startOverride w:val="1"/>
-    </w:lvlOverride>
-  </w:num>
-  <w:num w:numId="9">
-    <w:abstractNumId w:val="7"/>
-    <w:lvlOverride w:ilvl="0">
-      <w:startOverride w:val="1"/>
-    </w:lvlOverride>
-  </w:num>
-  <w:num w:numId="10">
-    <w:abstractNumId w:val="22"/>
-    <w:lvlOverride w:ilvl="0">
-      <w:startOverride w:val="1"/>
-    </w:lvlOverride>
-  </w:num>
-  <w:num w:numId="11">
-    <w:abstractNumId w:val="9"/>
-    <w:lvlOverride w:ilvl="0">
-      <w:startOverride w:val="1"/>
-    </w:lvlOverride>
-  </w:num>
-  <w:num w:numId="12">
-    <w:abstractNumId w:val="2"/>
-    <w:lvlOverride w:ilvl="0">
-      <w:startOverride w:val="1"/>
-    </w:lvlOverride>
-  </w:num>
-  <w:num w:numId="13">
-    <w:abstractNumId w:val="5"/>
-    <w:lvlOverride w:ilvl="0">
-      <w:startOverride w:val="1"/>
-    </w:lvlOverride>
-  </w:num>
-  <w:num w:numId="14">
-    <w:abstractNumId w:val="14"/>
-    <w:lvlOverride w:ilvl="0">
-      <w:startOverride w:val="1"/>
-    </w:lvlOverride>
-  </w:num>
-  <w:num w:numId="15">
+  <w:num w:numId="22">
     <w:abstractNumId w:val="0"/>
     <w:lvlOverride w:ilvl="0">
       <w:startOverride w:val="1"/>
     </w:lvlOverride>
   </w:num>
-  <w:num w:numId="16">
-    <w:abstractNumId w:val="17"/>
-    <w:lvlOverride w:ilvl="0">
-      <w:startOverride w:val="1"/>
-    </w:lvlOverride>
-  </w:num>
-  <w:num w:numId="17">
+  <w:num w:numId="23">
     <w:abstractNumId w:val="1"/>
-    <w:lvlOverride w:ilvl="0">
-      <w:startOverride w:val="1"/>
-    </w:lvlOverride>
-  </w:num>
-  <w:num w:numId="18">
-    <w:abstractNumId w:val="3"/>
-    <w:lvlOverride w:ilvl="0">
-      <w:startOverride w:val="1"/>
-    </w:lvlOverride>
-  </w:num>
-  <w:num w:numId="19">
-    <w:abstractNumId w:val="4"/>
-    <w:lvlOverride w:ilvl="0">
-      <w:startOverride w:val="1"/>
-    </w:lvlOverride>
-  </w:num>
-  <w:num w:numId="20">
-    <w:abstractNumId w:val="13"/>
-    <w:lvlOverride w:ilvl="0">
-      <w:startOverride w:val="1"/>
-    </w:lvlOverride>
-  </w:num>
-  <w:num w:numId="21">
-    <w:abstractNumId w:val="11"/>
-    <w:lvlOverride w:ilvl="0">
-      <w:startOverride w:val="1"/>
-    </w:lvlOverride>
-  </w:num>
-  <w:num w:numId="22">
-    <w:abstractNumId w:val="21"/>
-    <w:lvlOverride w:ilvl="0">
-      <w:startOverride w:val="1"/>
-    </w:lvlOverride>
-  </w:num>
-  <w:num w:numId="23">
-    <w:abstractNumId w:val="6"/>
     <w:lvlOverride w:ilvl="0">
       <w:startOverride w:val="1"/>
     </w:lvlOverride>
@@ -22395,33 +22701,6 @@
     <w:semiHidden/>
     <w:unhideWhenUsed/>
   </w:style>
-  <w:style w:type="paragraph" w:styleId="BalloonText">
-    <w:name w:val="Balloon Text"/>
-    <w:basedOn w:val="Normal"/>
-    <w:link w:val="BalloonTextChar"/>
-    <w:uiPriority w:val="99"/>
-    <w:semiHidden/>
-    <w:unhideWhenUsed/>
-    <w:rsid w:val="008D3AFF"/>
-    <w:rPr>
-      <w:rFonts w:ascii="Tahoma" w:hAnsi="Tahoma" w:cs="Tahoma"/>
-      <w:sz w:val="16"/>
-      <w:szCs w:val="16"/>
-    </w:rPr>
-  </w:style>
-  <w:style w:type="character" w:customStyle="1" w:styleId="BalloonTextChar">
-    <w:name w:val="Balloon Text Char"/>
-    <w:basedOn w:val="DefaultParagraphFont"/>
-    <w:link w:val="BalloonText"/>
-    <w:uiPriority w:val="99"/>
-    <w:semiHidden/>
-    <w:rsid w:val="008D3AFF"/>
-    <w:rPr>
-      <w:rFonts w:ascii="Tahoma" w:hAnsi="Tahoma" w:cs="Tahoma"/>
-      <w:sz w:val="16"/>
-      <w:szCs w:val="16"/>
-    </w:rPr>
-  </w:style>
 </w:styles>
 </file>
 
@@ -22938,33 +23217,6 @@
     <w:semiHidden/>
     <w:unhideWhenUsed/>
   </w:style>
-  <w:style w:type="paragraph" w:styleId="BalloonText">
-    <w:name w:val="Balloon Text"/>
-    <w:basedOn w:val="Normal"/>
-    <w:link w:val="BalloonTextChar"/>
-    <w:uiPriority w:val="99"/>
-    <w:semiHidden/>
-    <w:unhideWhenUsed/>
-    <w:rsid w:val="008D3AFF"/>
-    <w:rPr>
-      <w:rFonts w:ascii="Tahoma" w:hAnsi="Tahoma" w:cs="Tahoma"/>
-      <w:sz w:val="16"/>
-      <w:szCs w:val="16"/>
-    </w:rPr>
-  </w:style>
-  <w:style w:type="character" w:customStyle="1" w:styleId="BalloonTextChar">
-    <w:name w:val="Balloon Text Char"/>
-    <w:basedOn w:val="DefaultParagraphFont"/>
-    <w:link w:val="BalloonText"/>
-    <w:uiPriority w:val="99"/>
-    <w:semiHidden/>
-    <w:rsid w:val="008D3AFF"/>
-    <w:rPr>
-      <w:rFonts w:ascii="Tahoma" w:hAnsi="Tahoma" w:cs="Tahoma"/>
-      <w:sz w:val="16"/>
-      <w:szCs w:val="16"/>
-    </w:rPr>
-  </w:style>
 </w:styles>
 </file>
 

</xml_diff>